<commit_message>
Update CV docx, site-data, research analytics, and abstracts (autopush 2026-09-11 11:11)
</commit_message>
<xml_diff>
--- a/CV_202605_MOON.docx
+++ b/CV_202605_MOON.docx
@@ -4585,7 +4585,21 @@
           <w:b/>
           <w:lang w:eastAsia="ko-KR"/>
         </w:rPr>
-        <w:t>1,130,768</w:t>
+        <w:t>1,</w:t>
+      </w:r>
+      <w:r>
+        <w:rPr>
+          <w:b/>
+          <w:lang w:eastAsia="ko-KR"/>
+        </w:rPr>
+        <w:t>2</w:t>
+      </w:r>
+      <w:r>
+        <w:rPr>
+          <w:b/>
+          <w:lang w:eastAsia="ko-KR"/>
+        </w:rPr>
+        <w:t>30,768</w:t>
       </w:r>
       <w:r>
         <w:rPr>
@@ -4616,27 +4630,27 @@
           <w:bCs/>
           <w:lang w:eastAsia="ko-KR"/>
         </w:rPr>
-        <w:t xml:space="preserve">Moon, J. (PI) </w:t>
-      </w:r>
-      <w:r>
-        <w:rPr>
-          <w:lang w:eastAsia="ko-KR"/>
-        </w:rPr>
-        <w:t xml:space="preserve">(May 2027 – April 2029). </w:t>
-      </w:r>
-      <w:r>
-        <w:rPr>
-          <w:i/>
-          <w:iCs/>
-          <w:lang w:eastAsia="ko-KR"/>
-        </w:rPr>
-        <w:t>From Theme to Transfer: How Tabletop Mechanics Shape Cybersecurity Reasoning</w:t>
-      </w:r>
-      <w:r>
-        <w:rPr>
-          <w:lang w:eastAsia="ko-KR"/>
-        </w:rPr>
-        <w:t xml:space="preserve">, Total requested €20,000 (approximately $23,362), Game in Lab 2026 International Call for Projects, Asmodee, </w:t>
+        <w:t xml:space="preserve">Moon, J. (Lead PI) </w:t>
+      </w:r>
+      <w:r>
+        <w:rPr>
+          <w:lang w:eastAsia="ko-KR"/>
+        </w:rPr>
+        <w:t xml:space="preserve">(September 2026). </w:t>
+      </w:r>
+      <w:r>
+        <w:rPr>
+          <w:i/>
+          <w:iCs/>
+          <w:lang w:eastAsia="ko-KR"/>
+        </w:rPr>
+        <w:t>TRACE-Reg: A Privacy-by-Design, Agency-Preserving Emotion-Regulation Agent for Adult Learners.</w:t>
+      </w:r>
+      <w:r>
+        <w:rPr>
+          <w:lang w:eastAsia="ko-KR"/>
+        </w:rPr>
+        <w:t xml:space="preserve"> Sony Research Award Program 2026, Faculty Innovation Award—Affective Computing, Sony Corporation, Total budget $100,000, </w:t>
       </w:r>
       <w:r>
         <w:rPr>
@@ -4669,35 +4683,35 @@
           <w:bCs/>
           <w:lang w:eastAsia="ko-KR"/>
         </w:rPr>
-        <w:t xml:space="preserve">Moon, J. (Lead PI) </w:t>
-      </w:r>
-      <w:r>
-        <w:rPr>
-          <w:lang w:eastAsia="ko-KR"/>
-        </w:rPr>
-        <w:t xml:space="preserve">(February 2027 – July 2028). </w:t>
-      </w:r>
-      <w:r>
-        <w:rPr>
-          <w:i/>
-          <w:iCs/>
-          <w:lang w:eastAsia="ko-KR"/>
-        </w:rPr>
-        <w:t>Beyond the Security Divide: Building a Community-Guided Cybersecurity Education System for Broad and Meaningful Access</w:t>
-      </w:r>
-      <w:r>
-        <w:rPr>
-          <w:lang w:eastAsia="ko-KR"/>
-        </w:rPr>
-        <w:t>, Total requested $75,000, Spencer Foundation Vision Grant,</w:t>
-      </w:r>
-      <w:r>
-        <w:rPr>
-          <w:b/>
-          <w:bCs/>
-          <w:lang w:eastAsia="ko-KR"/>
-        </w:rPr>
-        <w:t xml:space="preserve"> PENDING.</w:t>
+        <w:t xml:space="preserve">Moon, J. (PI) </w:t>
+      </w:r>
+      <w:r>
+        <w:rPr>
+          <w:lang w:eastAsia="ko-KR"/>
+        </w:rPr>
+        <w:t xml:space="preserve">(May 2027 – April 2029). </w:t>
+      </w:r>
+      <w:r>
+        <w:rPr>
+          <w:i/>
+          <w:iCs/>
+          <w:lang w:eastAsia="ko-KR"/>
+        </w:rPr>
+        <w:t>From Theme to Transfer: How Tabletop Mechanics Shape Cybersecurity Reasoning</w:t>
+      </w:r>
+      <w:r>
+        <w:rPr>
+          <w:lang w:eastAsia="ko-KR"/>
+        </w:rPr>
+        <w:t xml:space="preserve">, Total requested €20,000 (approximately $23,362), Game in Lab 2026 International Call for Projects, Asmodee, </w:t>
+      </w:r>
+      <w:r>
+        <w:rPr>
+          <w:b/>
+          <w:bCs/>
+          <w:lang w:eastAsia="ko-KR"/>
+        </w:rPr>
+        <w:t>PENDING.</w:t>
       </w:r>
     </w:p>
     <w:p>
@@ -4722,35 +4736,35 @@
           <w:bCs/>
           <w:lang w:eastAsia="ko-KR"/>
         </w:rPr>
-        <w:t xml:space="preserve">Moon, J. (PI) </w:t>
-      </w:r>
-      <w:r>
-        <w:rPr>
-          <w:lang w:eastAsia="ko-KR"/>
-        </w:rPr>
-        <w:t xml:space="preserve">(August 2027 – July 2028). </w:t>
-      </w:r>
-      <w:r>
-        <w:rPr>
-          <w:i/>
-          <w:iCs/>
-          <w:lang w:eastAsia="ko-KR"/>
-        </w:rPr>
-        <w:t>Who Bears the Work of School AI Governance? Policy-Assigned Responsibility, Employer Support, and Unequal District Capacity</w:t>
-      </w:r>
-      <w:r>
-        <w:rPr>
-          <w:lang w:eastAsia="ko-KR"/>
-        </w:rPr>
-        <w:t>, Total requested $50,000, Russell Sage Foundation, Sheldon Danziger Pipeline Grants Competition</w:t>
-      </w:r>
-      <w:r>
-        <w:rPr>
-          <w:b/>
-          <w:bCs/>
-          <w:lang w:eastAsia="ko-KR"/>
-        </w:rPr>
-        <w:t>, PENDING.</w:t>
+        <w:t xml:space="preserve">Moon, J. (Lead PI) </w:t>
+      </w:r>
+      <w:r>
+        <w:rPr>
+          <w:lang w:eastAsia="ko-KR"/>
+        </w:rPr>
+        <w:t xml:space="preserve">(February 2027 – July 2028). </w:t>
+      </w:r>
+      <w:r>
+        <w:rPr>
+          <w:i/>
+          <w:iCs/>
+          <w:lang w:eastAsia="ko-KR"/>
+        </w:rPr>
+        <w:t>Beyond the Security Divide: Building a Community-Guided Cybersecurity Education System for Broad and Meaningful Access</w:t>
+      </w:r>
+      <w:r>
+        <w:rPr>
+          <w:lang w:eastAsia="ko-KR"/>
+        </w:rPr>
+        <w:t>, Total requested $75,000, Spencer Foundation Vision Grant,</w:t>
+      </w:r>
+      <w:r>
+        <w:rPr>
+          <w:b/>
+          <w:bCs/>
+          <w:lang w:eastAsia="ko-KR"/>
+        </w:rPr>
+        <w:t xml:space="preserve"> PENDING.</w:t>
       </w:r>
     </w:p>
     <w:p>
@@ -4775,27 +4789,27 @@
           <w:bCs/>
           <w:lang w:eastAsia="ko-KR"/>
         </w:rPr>
-        <w:t xml:space="preserve">Moon, J. </w:t>
-      </w:r>
-      <w:r>
-        <w:rPr>
-          <w:lang w:eastAsia="ko-KR"/>
-        </w:rPr>
-        <w:t xml:space="preserve">(Project Lead/Applicant) (Submitted August 2026; proposed three-month project). </w:t>
-      </w:r>
-      <w:r>
-        <w:rPr>
-          <w:i/>
-          <w:iCs/>
-          <w:lang w:eastAsia="ko-KR"/>
-        </w:rPr>
-        <w:t>OpenPolicy v0.1: A Reproducible Public-Evidence Release for School AI Policy</w:t>
-      </w:r>
-      <w:r>
-        <w:rPr>
-          <w:lang w:eastAsia="ko-KR"/>
-        </w:rPr>
-        <w:t>, RAAIS Foundation Grant</w:t>
+        <w:t xml:space="preserve">Moon, J. (PI) </w:t>
+      </w:r>
+      <w:r>
+        <w:rPr>
+          <w:lang w:eastAsia="ko-KR"/>
+        </w:rPr>
+        <w:t xml:space="preserve">(August 2027 – July 2028). </w:t>
+      </w:r>
+      <w:r>
+        <w:rPr>
+          <w:i/>
+          <w:iCs/>
+          <w:lang w:eastAsia="ko-KR"/>
+        </w:rPr>
+        <w:t>Who Bears the Work of School AI Governance? Policy-Assigned Responsibility, Employer Support, and Unequal District Capacity</w:t>
+      </w:r>
+      <w:r>
+        <w:rPr>
+          <w:lang w:eastAsia="ko-KR"/>
+        </w:rPr>
+        <w:t>, Total requested $50,000, Russell Sage Foundation, Sheldon Danziger Pipeline Grants Competition</w:t>
       </w:r>
       <w:r>
         <w:rPr>
@@ -4834,29 +4848,29 @@
         <w:rPr>
           <w:lang w:eastAsia="ko-KR"/>
         </w:rPr>
-        <w:t xml:space="preserve">(Project Lead/Applicant) (Submitted August 2026; proposed four-month project). </w:t>
-      </w:r>
-      <w:r>
-        <w:rPr>
-          <w:i/>
-          <w:iCs/>
-          <w:lang w:eastAsia="ko-KR"/>
-        </w:rPr>
-        <w:t>OpenPolicy Receipts: Open Receipts and Safety Tests for Accountable Public-Interest AI Agents</w:t>
-      </w:r>
-      <w:r>
-        <w:rPr>
-          <w:lang w:eastAsia="ko-KR"/>
-        </w:rPr>
-        <w:t xml:space="preserve">, Total requested $50,000, Sentient Foundation Open Source AGI Grant Program, Grant Track, </w:t>
-      </w:r>
-      <w:r>
-        <w:rPr>
-          <w:b/>
-          <w:bCs/>
-          <w:lang w:eastAsia="ko-KR"/>
-        </w:rPr>
-        <w:t>PENDING.</w:t>
+        <w:t xml:space="preserve">(Project Lead/Applicant) (Submitted August 2026; proposed three-month project). </w:t>
+      </w:r>
+      <w:r>
+        <w:rPr>
+          <w:i/>
+          <w:iCs/>
+          <w:lang w:eastAsia="ko-KR"/>
+        </w:rPr>
+        <w:t>OpenPolicy v0.1: A Reproducible Public-Evidence Release for School AI Policy</w:t>
+      </w:r>
+      <w:r>
+        <w:rPr>
+          <w:lang w:eastAsia="ko-KR"/>
+        </w:rPr>
+        <w:t>, RAAIS Foundation Grant</w:t>
+      </w:r>
+      <w:r>
+        <w:rPr>
+          <w:b/>
+          <w:bCs/>
+          <w:lang w:eastAsia="ko-KR"/>
+        </w:rPr>
+        <w:t>, PENDING.</w:t>
       </w:r>
     </w:p>
     <w:p>
@@ -4877,171 +4891,39 @@
       </w:pPr>
       <w:r>
         <w:rPr>
-          <w:rFonts w:hint="eastAsia"/>
-          <w:b/>
-          <w:bCs/>
-          <w:lang w:eastAsia="ko-KR"/>
-        </w:rPr>
-        <w:t xml:space="preserve">Moon, J. (Lead PI) </w:t>
-      </w:r>
-      <w:r>
-        <w:rPr>
-          <w:rFonts w:hint="eastAsia"/>
-          <w:lang w:eastAsia="ko-KR"/>
-        </w:rPr>
-        <w:t>(</w:t>
-      </w:r>
-      <w:r>
-        <w:rPr>
-          <w:rFonts w:hint="eastAsia"/>
-          <w:lang w:eastAsia="ko-KR"/>
-        </w:rPr>
-        <w:t>September</w:t>
-      </w:r>
-      <w:r>
-        <w:rPr>
-          <w:rFonts w:hint="eastAsia"/>
-          <w:lang w:eastAsia="ko-KR"/>
-        </w:rPr>
-        <w:t xml:space="preserve"> 202</w:t>
-      </w:r>
-      <w:r>
-        <w:rPr>
-          <w:rFonts w:hint="eastAsia"/>
-          <w:lang w:eastAsia="ko-KR"/>
-        </w:rPr>
-        <w:t>6</w:t>
-      </w:r>
-      <w:r>
-        <w:rPr>
-          <w:rFonts w:hint="eastAsia"/>
-          <w:lang w:eastAsia="ko-KR"/>
-        </w:rPr>
-        <w:t xml:space="preserve"> </w:t>
-      </w:r>
-      <w:r>
-        <w:rPr>
-          <w:lang w:eastAsia="ko-KR"/>
-        </w:rPr>
-        <w:t>–</w:t>
-      </w:r>
-      <w:r>
-        <w:rPr>
-          <w:rFonts w:hint="eastAsia"/>
-          <w:lang w:eastAsia="ko-KR"/>
-        </w:rPr>
-        <w:t xml:space="preserve"> </w:t>
-      </w:r>
-      <w:r>
-        <w:rPr>
-          <w:rFonts w:hint="eastAsia"/>
-          <w:lang w:eastAsia="ko-KR"/>
-        </w:rPr>
-        <w:t>August</w:t>
-      </w:r>
-      <w:r>
-        <w:rPr>
-          <w:rFonts w:hint="eastAsia"/>
-          <w:lang w:eastAsia="ko-KR"/>
-        </w:rPr>
-        <w:t xml:space="preserve"> 202</w:t>
-      </w:r>
-      <w:r>
-        <w:rPr>
-          <w:rFonts w:hint="eastAsia"/>
-          <w:lang w:eastAsia="ko-KR"/>
-        </w:rPr>
-        <w:t>8</w:t>
-      </w:r>
-      <w:r>
-        <w:rPr>
-          <w:rFonts w:hint="eastAsia"/>
-          <w:lang w:eastAsia="ko-KR"/>
-        </w:rPr>
-        <w:t xml:space="preserve">). </w:t>
-      </w:r>
-      <w:r>
-        <w:rPr>
-          <w:lang w:eastAsia="ko-KR"/>
-        </w:rPr>
-        <w:t>Who Benefits from High School Computer Science? Heterogeneous Causal Effects of CS Coursework on STEM Major Declaration: A Bayesian Causal Forest Analysis of HSLS:09</w:t>
-      </w:r>
-      <w:r>
-        <w:rPr>
-          <w:rFonts w:hint="eastAsia"/>
-          <w:lang w:eastAsia="ko-KR"/>
-        </w:rPr>
-        <w:t xml:space="preserve">, </w:t>
-      </w:r>
-      <w:r>
-        <w:rPr>
-          <w:lang w:eastAsia="ko-KR"/>
-        </w:rPr>
-        <w:t>Total</w:t>
-      </w:r>
-      <w:r>
-        <w:rPr>
-          <w:rFonts w:hint="eastAsia"/>
-          <w:lang w:eastAsia="ko-KR"/>
-        </w:rPr>
-        <w:t xml:space="preserve"> award $</w:t>
-      </w:r>
-      <w:r>
-        <w:rPr>
-          <w:rFonts w:hint="eastAsia"/>
-          <w:lang w:eastAsia="ko-KR"/>
-        </w:rPr>
-        <w:t>35</w:t>
-      </w:r>
-      <w:r>
-        <w:rPr>
-          <w:lang w:eastAsia="ko-KR"/>
-        </w:rPr>
-        <w:t>,</w:t>
-      </w:r>
-      <w:r>
-        <w:rPr>
-          <w:rFonts w:hint="eastAsia"/>
-          <w:lang w:eastAsia="ko-KR"/>
-        </w:rPr>
-        <w:t>000</w:t>
-      </w:r>
-      <w:r>
-        <w:rPr>
-          <w:rFonts w:hint="eastAsia"/>
-          <w:lang w:eastAsia="ko-KR"/>
-        </w:rPr>
-        <w:t xml:space="preserve">, </w:t>
-      </w:r>
-      <w:r>
-        <w:rPr>
-          <w:rFonts w:hint="eastAsia"/>
-          <w:lang w:eastAsia="ko-KR"/>
-        </w:rPr>
-        <w:t xml:space="preserve">AERA-NSF Research </w:t>
-      </w:r>
-      <w:r>
-        <w:rPr>
-          <w:rFonts w:hint="eastAsia"/>
-          <w:lang w:eastAsia="ko-KR"/>
-        </w:rPr>
-        <w:t>Grant Program</w:t>
-      </w:r>
-      <w:r>
-        <w:rPr>
-          <w:rFonts w:hint="eastAsia"/>
-          <w:lang w:eastAsia="ko-KR"/>
-        </w:rPr>
-        <w:t xml:space="preserve">, </w:t>
-      </w:r>
-      <w:r>
-        <w:rPr>
-          <w:rFonts w:hint="eastAsia"/>
-          <w:b/>
-          <w:bCs/>
-          <w:lang w:eastAsia="ko-KR"/>
-        </w:rPr>
-        <w:t>PENDING</w:t>
+          <w:b/>
+          <w:bCs/>
+          <w:lang w:eastAsia="ko-KR"/>
+        </w:rPr>
+        <w:t xml:space="preserve">Moon, J. </w:t>
+      </w:r>
+      <w:r>
+        <w:rPr>
+          <w:lang w:eastAsia="ko-KR"/>
+        </w:rPr>
+        <w:t xml:space="preserve">(Project Lead/Applicant) (Submitted August 2026; proposed four-month project). </w:t>
+      </w:r>
+      <w:r>
+        <w:rPr>
+          <w:i/>
+          <w:iCs/>
+          <w:lang w:eastAsia="ko-KR"/>
+        </w:rPr>
+        <w:t>OpenPolicy Receipts: Open Receipts and Safety Tests for Accountable Public-Interest AI Agents</w:t>
+      </w:r>
+      <w:r>
+        <w:rPr>
+          <w:lang w:eastAsia="ko-KR"/>
+        </w:rPr>
+        <w:t xml:space="preserve">, Total requested $50,000, Sentient Foundation Open Source AGI Grant Program, Grant Track, </w:t>
+      </w:r>
+      <w:r>
+        <w:rPr>
+          <w:b/>
+          <w:bCs/>
+          <w:lang w:eastAsia="ko-KR"/>
+        </w:rPr>
+        <w:t>PENDING.</w:t>
       </w:r>
     </w:p>
     <w:p>
@@ -5062,28 +4944,169 @@
       </w:pPr>
       <w:r>
         <w:rPr>
-          <w:bCs/>
-        </w:rPr>
-        <w:t>Hu, F. (Lead PI),</w:t>
-      </w:r>
-      <w:r>
-        <w:rPr>
-          <w:b/>
-        </w:rPr>
-        <w:t xml:space="preserve"> Moon, J. (PI), &amp; </w:t>
-      </w:r>
-      <w:r>
-        <w:rPr>
-          <w:bCs/>
-        </w:rPr>
-        <w:t>Shen, X. (PI)</w:t>
-      </w:r>
-      <w:r>
-        <w:t xml:space="preserve"> (October 2026 - September 2029). CyberAI Innovation: Teaching AI as Target and Defender through a Full-Stack Immersive AI Ecosystem, National Science Foundation (NSF), Proposal 26-0572, proposed total amount $497,460.00, submission deadline April 3, 2026, submitted to sponsor March 10, 2026, </w:t>
-      </w:r>
-      <w:r>
-        <w:rPr>
-          <w:b/>
+          <w:rFonts w:hint="eastAsia"/>
+          <w:b/>
+          <w:bCs/>
+          <w:lang w:eastAsia="ko-KR"/>
+        </w:rPr>
+        <w:t xml:space="preserve">Moon, J. (Lead PI) </w:t>
+      </w:r>
+      <w:r>
+        <w:rPr>
+          <w:rFonts w:hint="eastAsia"/>
+          <w:lang w:eastAsia="ko-KR"/>
+        </w:rPr>
+        <w:t>(</w:t>
+      </w:r>
+      <w:r>
+        <w:rPr>
+          <w:rFonts w:hint="eastAsia"/>
+          <w:lang w:eastAsia="ko-KR"/>
+        </w:rPr>
+        <w:t>September</w:t>
+      </w:r>
+      <w:r>
+        <w:rPr>
+          <w:rFonts w:hint="eastAsia"/>
+          <w:lang w:eastAsia="ko-KR"/>
+        </w:rPr>
+        <w:t xml:space="preserve"> 202</w:t>
+      </w:r>
+      <w:r>
+        <w:rPr>
+          <w:rFonts w:hint="eastAsia"/>
+          <w:lang w:eastAsia="ko-KR"/>
+        </w:rPr>
+        <w:t>6</w:t>
+      </w:r>
+      <w:r>
+        <w:rPr>
+          <w:rFonts w:hint="eastAsia"/>
+          <w:lang w:eastAsia="ko-KR"/>
+        </w:rPr>
+        <w:t xml:space="preserve"> </w:t>
+      </w:r>
+      <w:r>
+        <w:rPr>
+          <w:lang w:eastAsia="ko-KR"/>
+        </w:rPr>
+        <w:t>–</w:t>
+      </w:r>
+      <w:r>
+        <w:rPr>
+          <w:rFonts w:hint="eastAsia"/>
+          <w:lang w:eastAsia="ko-KR"/>
+        </w:rPr>
+        <w:t xml:space="preserve"> </w:t>
+      </w:r>
+      <w:r>
+        <w:rPr>
+          <w:rFonts w:hint="eastAsia"/>
+          <w:lang w:eastAsia="ko-KR"/>
+        </w:rPr>
+        <w:t>August</w:t>
+      </w:r>
+      <w:r>
+        <w:rPr>
+          <w:rFonts w:hint="eastAsia"/>
+          <w:lang w:eastAsia="ko-KR"/>
+        </w:rPr>
+        <w:t xml:space="preserve"> 202</w:t>
+      </w:r>
+      <w:r>
+        <w:rPr>
+          <w:rFonts w:hint="eastAsia"/>
+          <w:lang w:eastAsia="ko-KR"/>
+        </w:rPr>
+        <w:t>8</w:t>
+      </w:r>
+      <w:r>
+        <w:rPr>
+          <w:rFonts w:hint="eastAsia"/>
+          <w:lang w:eastAsia="ko-KR"/>
+        </w:rPr>
+        <w:t xml:space="preserve">). </w:t>
+      </w:r>
+      <w:r>
+        <w:rPr>
+          <w:lang w:eastAsia="ko-KR"/>
+        </w:rPr>
+        <w:t>Who Benefits from High School Computer Science? Heterogeneous Causal Effects of CS Coursework on STEM Major Declaration: A Bayesian Causal Forest Analysis of HSLS:09</w:t>
+      </w:r>
+      <w:r>
+        <w:rPr>
+          <w:rFonts w:hint="eastAsia"/>
+          <w:lang w:eastAsia="ko-KR"/>
+        </w:rPr>
+        <w:t xml:space="preserve">, </w:t>
+      </w:r>
+      <w:r>
+        <w:rPr>
+          <w:lang w:eastAsia="ko-KR"/>
+        </w:rPr>
+        <w:t>Total</w:t>
+      </w:r>
+      <w:r>
+        <w:rPr>
+          <w:rFonts w:hint="eastAsia"/>
+          <w:lang w:eastAsia="ko-KR"/>
+        </w:rPr>
+        <w:t xml:space="preserve"> award $</w:t>
+      </w:r>
+      <w:r>
+        <w:rPr>
+          <w:rFonts w:hint="eastAsia"/>
+          <w:lang w:eastAsia="ko-KR"/>
+        </w:rPr>
+        <w:t>35</w:t>
+      </w:r>
+      <w:r>
+        <w:rPr>
+          <w:lang w:eastAsia="ko-KR"/>
+        </w:rPr>
+        <w:t>,</w:t>
+      </w:r>
+      <w:r>
+        <w:rPr>
+          <w:rFonts w:hint="eastAsia"/>
+          <w:lang w:eastAsia="ko-KR"/>
+        </w:rPr>
+        <w:t>000</w:t>
+      </w:r>
+      <w:r>
+        <w:rPr>
+          <w:rFonts w:hint="eastAsia"/>
+          <w:lang w:eastAsia="ko-KR"/>
+        </w:rPr>
+        <w:t xml:space="preserve">, </w:t>
+      </w:r>
+      <w:r>
+        <w:rPr>
+          <w:rFonts w:hint="eastAsia"/>
+          <w:lang w:eastAsia="ko-KR"/>
+        </w:rPr>
+        <w:t xml:space="preserve">AERA-NSF Research </w:t>
+      </w:r>
+      <w:r>
+        <w:rPr>
+          <w:rFonts w:hint="eastAsia"/>
+          <w:lang w:eastAsia="ko-KR"/>
+        </w:rPr>
+        <w:t>Grant Program</w:t>
+      </w:r>
+      <w:r>
+        <w:rPr>
+          <w:rFonts w:hint="eastAsia"/>
+          <w:lang w:eastAsia="ko-KR"/>
+        </w:rPr>
+        <w:t xml:space="preserve">, </w:t>
+      </w:r>
+      <w:r>
+        <w:rPr>
+          <w:rFonts w:hint="eastAsia"/>
+          <w:b/>
+          <w:bCs/>
+          <w:lang w:eastAsia="ko-KR"/>
         </w:rPr>
         <w:t>PENDING</w:t>
       </w:r>
@@ -5099,69 +5122,31 @@
         </w:pBdr>
         <w:ind w:left="720" w:hanging="720"/>
         <w:rPr>
-          <w:lang w:eastAsia="ko-KR"/>
-        </w:rPr>
-      </w:pPr>
-      <w:r>
-        <w:rPr>
-          <w:rFonts w:hint="eastAsia"/>
-          <w:b/>
-          <w:bCs/>
-          <w:lang w:eastAsia="ko-KR"/>
-        </w:rPr>
-        <w:t xml:space="preserve">Moon, J. </w:t>
-      </w:r>
-      <w:r>
-        <w:rPr>
-          <w:rFonts w:hint="eastAsia"/>
-          <w:lang w:eastAsia="ko-KR"/>
-        </w:rPr>
-        <w:t>(Key Personnel</w:t>
-      </w:r>
-      <w:r>
-        <w:rPr>
-          <w:rFonts w:hint="eastAsia"/>
-          <w:b/>
-          <w:bCs/>
-          <w:lang w:eastAsia="ko-KR"/>
-        </w:rPr>
-        <w:t xml:space="preserve"> / </w:t>
-      </w:r>
-      <w:r>
-        <w:rPr>
-          <w:rFonts w:hint="eastAsia"/>
-          <w:lang w:eastAsia="ko-KR"/>
-        </w:rPr>
-        <w:t xml:space="preserve">External Evaluator). (January 2027 </w:t>
-      </w:r>
-      <w:r>
-        <w:rPr>
-          <w:lang w:eastAsia="ko-KR"/>
-        </w:rPr>
-        <w:t>–</w:t>
-      </w:r>
-      <w:r>
-        <w:rPr>
-          <w:rFonts w:hint="eastAsia"/>
-          <w:lang w:eastAsia="ko-KR"/>
-        </w:rPr>
-        <w:t xml:space="preserve"> December 2029). </w:t>
-      </w:r>
-      <w:r>
-        <w:rPr>
-          <w:lang w:eastAsia="ko-KR"/>
-        </w:rPr>
-        <w:t>Collaborative Research: Phase I CAMEL-CN: Connecting Human Sensing with Math Understanding to Build Novel RF Datasets and Instructional Sequences</w:t>
-      </w:r>
-      <w:r>
-        <w:rPr>
-          <w:rFonts w:hint="eastAsia"/>
-          <w:lang w:eastAsia="ko-KR"/>
-        </w:rPr>
-        <w:t xml:space="preserve">. </w:t>
-      </w:r>
-      <w:r>
-        <w:t xml:space="preserve"> </w:t>
+          <w:b/>
+          <w:bCs/>
+          <w:lang w:eastAsia="ko-KR"/>
+        </w:rPr>
+      </w:pPr>
+      <w:r>
+        <w:rPr>
+          <w:bCs/>
+        </w:rPr>
+        <w:t>Hu, F. (Lead PI),</w:t>
+      </w:r>
+      <w:r>
+        <w:rPr>
+          <w:b/>
+        </w:rPr>
+        <w:t xml:space="preserve"> Moon, J. (PI), &amp; </w:t>
+      </w:r>
+      <w:r>
+        <w:rPr>
+          <w:bCs/>
+        </w:rPr>
+        <w:t>Shen, X. (PI)</w:t>
+      </w:r>
+      <w:r>
+        <w:t xml:space="preserve"> (October 2026 - September 2029). CyberAI Innovation: Teaching AI as Target and Defender through a Full-Stack Immersive AI Ecosystem, National Science Foundation (NSF), Proposal 26-0572, proposed total amount $497,460.00, submission deadline April 3, 2026, submitted to sponsor March 10, 2026, </w:t>
       </w:r>
       <w:r>
         <w:rPr>
@@ -5181,20 +5166,69 @@
         </w:pBdr>
         <w:ind w:left="720" w:hanging="720"/>
         <w:rPr>
-          <w:b/>
-        </w:rPr>
-      </w:pPr>
-      <w:r>
-        <w:t xml:space="preserve">Sumengen, A. (Lead PI), Chen, K. (PI), </w:t>
-      </w:r>
-      <w:r>
-        <w:rPr>
-          <w:b/>
-        </w:rPr>
-        <w:t>Moon, J. (PI)</w:t>
-      </w:r>
-      <w:r>
-        <w:t xml:space="preserve">, &amp; McCoy, T. (PI) (April 2027 - March 2029). A Biofeedback-Based Virtual Reality Implementation to Teach Metered Dose Inhaler Technique Education for Pediatric Asthma Patients: A Development and Feasibility Study. National Institutes of Health (NIH), total requested $399,946, submitted July 10, 2026, </w:t>
+          <w:lang w:eastAsia="ko-KR"/>
+        </w:rPr>
+      </w:pPr>
+      <w:r>
+        <w:rPr>
+          <w:rFonts w:hint="eastAsia"/>
+          <w:b/>
+          <w:bCs/>
+          <w:lang w:eastAsia="ko-KR"/>
+        </w:rPr>
+        <w:t xml:space="preserve">Moon, J. </w:t>
+      </w:r>
+      <w:r>
+        <w:rPr>
+          <w:rFonts w:hint="eastAsia"/>
+          <w:lang w:eastAsia="ko-KR"/>
+        </w:rPr>
+        <w:t>(Key Personnel</w:t>
+      </w:r>
+      <w:r>
+        <w:rPr>
+          <w:rFonts w:hint="eastAsia"/>
+          <w:b/>
+          <w:bCs/>
+          <w:lang w:eastAsia="ko-KR"/>
+        </w:rPr>
+        <w:t xml:space="preserve"> / </w:t>
+      </w:r>
+      <w:r>
+        <w:rPr>
+          <w:rFonts w:hint="eastAsia"/>
+          <w:lang w:eastAsia="ko-KR"/>
+        </w:rPr>
+        <w:t xml:space="preserve">External Evaluator). (January 2027 </w:t>
+      </w:r>
+      <w:r>
+        <w:rPr>
+          <w:lang w:eastAsia="ko-KR"/>
+        </w:rPr>
+        <w:t>–</w:t>
+      </w:r>
+      <w:r>
+        <w:rPr>
+          <w:rFonts w:hint="eastAsia"/>
+          <w:lang w:eastAsia="ko-KR"/>
+        </w:rPr>
+        <w:t xml:space="preserve"> December 2029). </w:t>
+      </w:r>
+      <w:r>
+        <w:rPr>
+          <w:lang w:eastAsia="ko-KR"/>
+        </w:rPr>
+        <w:t>Collaborative Research: Phase I CAMEL-CN: Connecting Human Sensing with Math Understanding to Build Novel RF Datasets and Instructional Sequences</w:t>
+      </w:r>
+      <w:r>
+        <w:rPr>
+          <w:rFonts w:hint="eastAsia"/>
+          <w:lang w:eastAsia="ko-KR"/>
+        </w:rPr>
+        <w:t xml:space="preserve">. </w:t>
+      </w:r>
+      <w:r>
+        <w:t xml:space="preserve"> </w:t>
       </w:r>
       <w:r>
         <w:rPr>
@@ -5214,9 +5248,27 @@
         </w:pBdr>
         <w:ind w:left="720" w:hanging="720"/>
         <w:rPr>
-          <w:lang w:eastAsia="ko-KR"/>
-        </w:rPr>
-      </w:pPr>
+          <w:b/>
+        </w:rPr>
+      </w:pPr>
+      <w:r>
+        <w:t xml:space="preserve">Sumengen, A. (Lead PI), Chen, K. (PI), </w:t>
+      </w:r>
+      <w:r>
+        <w:rPr>
+          <w:b/>
+        </w:rPr>
+        <w:t>Moon, J. (PI)</w:t>
+      </w:r>
+      <w:r>
+        <w:t xml:space="preserve">, &amp; McCoy, T. (PI) (April 2027 - March 2029). A Biofeedback-Based Virtual Reality Implementation to Teach Metered Dose Inhaler Technique Education for Pediatric Asthma Patients: A Development and Feasibility Study. National Institutes of Health (NIH), total requested $399,946, submitted July 10, 2026, </w:t>
+      </w:r>
+      <w:r>
+        <w:rPr>
+          <w:b/>
+        </w:rPr>
+        <w:t>PENDING</w:t>
+      </w:r>
     </w:p>
     <w:p>
       <w:pPr>
@@ -5229,22 +5281,9 @@
         </w:pBdr>
         <w:ind w:left="720" w:hanging="720"/>
         <w:rPr>
-          <w:b/>
-          <w:bCs/>
-          <w:u w:val="single"/>
-          <w:lang w:eastAsia="ko-KR"/>
-        </w:rPr>
-      </w:pPr>
-      <w:r>
-        <w:rPr>
-          <w:rFonts w:hint="eastAsia"/>
-          <w:b/>
-          <w:bCs/>
-          <w:u w:val="single"/>
-          <w:lang w:eastAsia="ko-KR"/>
-        </w:rPr>
-        <w:t>Unfunded</w:t>
-      </w:r>
+          <w:lang w:eastAsia="ko-KR"/>
+        </w:rPr>
+      </w:pPr>
     </w:p>
     <w:p>
       <w:pPr>
@@ -5259,160 +5298,19 @@
         <w:rPr>
           <w:b/>
           <w:bCs/>
-        </w:rPr>
-      </w:pPr>
-      <w:r>
-        <w:rPr>
-          <w:rFonts w:hint="eastAsia"/>
-          <w:b/>
-          <w:bCs/>
-          <w:lang w:eastAsia="ko-KR"/>
-        </w:rPr>
-        <w:t xml:space="preserve">Moon, J. (Lead PI) </w:t>
-      </w:r>
-      <w:r>
-        <w:rPr>
-          <w:rFonts w:hint="eastAsia"/>
-          <w:lang w:eastAsia="ko-KR"/>
-        </w:rPr>
-        <w:t>(</w:t>
-      </w:r>
-      <w:r>
-        <w:rPr>
-          <w:rFonts w:hint="eastAsia"/>
-          <w:lang w:eastAsia="ko-KR"/>
-        </w:rPr>
-        <w:t>August</w:t>
-      </w:r>
-      <w:r>
-        <w:rPr>
-          <w:rFonts w:hint="eastAsia"/>
-          <w:lang w:eastAsia="ko-KR"/>
-        </w:rPr>
-        <w:t xml:space="preserve"> 202</w:t>
-      </w:r>
-      <w:r>
-        <w:rPr>
-          <w:rFonts w:hint="eastAsia"/>
-          <w:lang w:eastAsia="ko-KR"/>
-        </w:rPr>
-        <w:t>6</w:t>
-      </w:r>
-      <w:r>
-        <w:rPr>
-          <w:rFonts w:hint="eastAsia"/>
-          <w:lang w:eastAsia="ko-KR"/>
-        </w:rPr>
-        <w:t xml:space="preserve"> </w:t>
-      </w:r>
-      <w:r>
-        <w:rPr>
-          <w:lang w:eastAsia="ko-KR"/>
-        </w:rPr>
-        <w:t>–</w:t>
-      </w:r>
-      <w:r>
-        <w:rPr>
-          <w:rFonts w:hint="eastAsia"/>
-          <w:lang w:eastAsia="ko-KR"/>
-        </w:rPr>
-        <w:t xml:space="preserve"> </w:t>
-      </w:r>
-      <w:r>
-        <w:rPr>
-          <w:rFonts w:hint="eastAsia"/>
-          <w:lang w:eastAsia="ko-KR"/>
-        </w:rPr>
-        <w:t>August</w:t>
-      </w:r>
-      <w:r>
-        <w:rPr>
-          <w:rFonts w:hint="eastAsia"/>
-          <w:lang w:eastAsia="ko-KR"/>
-        </w:rPr>
-        <w:t xml:space="preserve"> 202</w:t>
-      </w:r>
-      <w:r>
-        <w:rPr>
-          <w:rFonts w:hint="eastAsia"/>
-          <w:lang w:eastAsia="ko-KR"/>
-        </w:rPr>
-        <w:t>7</w:t>
-      </w:r>
-      <w:r>
-        <w:rPr>
-          <w:rFonts w:hint="eastAsia"/>
-          <w:lang w:eastAsia="ko-KR"/>
-        </w:rPr>
-        <w:t xml:space="preserve">). </w:t>
-      </w:r>
-      <w:r>
-        <w:rPr>
-          <w:lang w:eastAsia="ko-KR"/>
-        </w:rPr>
-        <w:t>Shift the Lens: Uncovering Students' Assets in Written Math Work via Multimodal AI</w:t>
-      </w:r>
-      <w:r>
-        <w:rPr>
-          <w:rFonts w:hint="eastAsia"/>
-          <w:lang w:eastAsia="ko-KR"/>
-        </w:rPr>
-        <w:t xml:space="preserve">, </w:t>
-      </w:r>
-      <w:r>
-        <w:rPr>
-          <w:lang w:eastAsia="ko-KR"/>
-        </w:rPr>
-        <w:t>Total</w:t>
-      </w:r>
-      <w:r>
-        <w:rPr>
-          <w:rFonts w:hint="eastAsia"/>
-          <w:lang w:eastAsia="ko-KR"/>
-        </w:rPr>
-        <w:t xml:space="preserve"> award $</w:t>
-      </w:r>
-      <w:r>
-        <w:rPr>
-          <w:rFonts w:hint="eastAsia"/>
-          <w:lang w:eastAsia="ko-KR"/>
-        </w:rPr>
-        <w:t>5</w:t>
-      </w:r>
-      <w:r>
-        <w:rPr>
-          <w:lang w:eastAsia="ko-KR"/>
-        </w:rPr>
-        <w:t>0,</w:t>
-      </w:r>
-      <w:r>
-        <w:rPr>
-          <w:rFonts w:hint="eastAsia"/>
-          <w:lang w:eastAsia="ko-KR"/>
-        </w:rPr>
-        <w:t>000</w:t>
-      </w:r>
-      <w:r>
-        <w:rPr>
-          <w:rFonts w:hint="eastAsia"/>
-          <w:lang w:eastAsia="ko-KR"/>
-        </w:rPr>
-        <w:t xml:space="preserve">, </w:t>
-      </w:r>
-      <w:r>
-        <w:rPr>
-          <w:rFonts w:hint="eastAsia"/>
-          <w:lang w:eastAsia="ko-KR"/>
-        </w:rPr>
-        <w:t xml:space="preserve">Advanced Innovative Math Solutions Collaboratory, </w:t>
-      </w:r>
-      <w:r>
-        <w:rPr>
-          <w:b/>
-          <w:bCs/>
           <w:u w:val="single"/>
-        </w:rPr>
-        <w:t>NOT FUNDED</w:t>
+          <w:lang w:eastAsia="ko-KR"/>
+        </w:rPr>
+      </w:pPr>
+      <w:r>
+        <w:rPr>
+          <w:rFonts w:hint="eastAsia"/>
+          <w:b/>
+          <w:bCs/>
+          <w:u w:val="single"/>
+          <w:lang w:eastAsia="ko-KR"/>
+        </w:rPr>
+        <w:t>Unfunded</w:t>
       </w:r>
     </w:p>
     <w:p>
@@ -5451,7 +5349,7 @@
           <w:rFonts w:hint="eastAsia"/>
           <w:lang w:eastAsia="ko-KR"/>
         </w:rPr>
-        <w:t>June</w:t>
+        <w:t>August</w:t>
       </w:r>
       <w:r>
         <w:rPr>
@@ -5492,7 +5390,7 @@
           <w:rFonts w:hint="eastAsia"/>
           <w:lang w:eastAsia="ko-KR"/>
         </w:rPr>
-        <w:t>May</w:t>
+        <w:t>August</w:t>
       </w:r>
       <w:r>
         <w:rPr>
@@ -5573,7 +5471,15 @@
           <w:rFonts w:hint="eastAsia"/>
           <w:lang w:eastAsia="ko-KR"/>
         </w:rPr>
-        <w:t xml:space="preserve">Advanced Innovative Math Solutions Collaboratory, </w:t>
+        <w:t xml:space="preserve">Advanced Innovative </w:t>
+      </w:r>
+      <w:r>
+        <w:rPr>
+          <w:rFonts w:hint="eastAsia"/>
+          <w:lang w:eastAsia="ko-KR"/>
+        </w:rPr>
+        <w:lastRenderedPageBreak/>
+        <w:t xml:space="preserve">Math Solutions Collaboratory, </w:t>
       </w:r>
       <w:r>
         <w:rPr>
@@ -5594,90 +5500,155 @@
           <w:between w:val="nil"/>
         </w:pBdr>
         <w:ind w:left="720" w:hanging="720"/>
-      </w:pPr>
-      <w:r>
-        <w:lastRenderedPageBreak/>
-        <w:t>Suh, J.</w:t>
-      </w:r>
-      <w:r>
-        <w:rPr>
-          <w:b/>
-          <w:bCs/>
+        <w:rPr>
+          <w:b/>
+          <w:bCs/>
+        </w:rPr>
+      </w:pPr>
+      <w:r>
+        <w:rPr>
+          <w:rFonts w:hint="eastAsia"/>
+          <w:b/>
+          <w:bCs/>
+          <w:lang w:eastAsia="ko-KR"/>
+        </w:rPr>
+        <w:t xml:space="preserve">Moon, J. (Lead PI) </w:t>
+      </w:r>
+      <w:r>
+        <w:rPr>
+          <w:rFonts w:hint="eastAsia"/>
+          <w:lang w:eastAsia="ko-KR"/>
+        </w:rPr>
+        <w:t>(</w:t>
+      </w:r>
+      <w:r>
+        <w:rPr>
+          <w:rFonts w:hint="eastAsia"/>
+          <w:lang w:eastAsia="ko-KR"/>
+        </w:rPr>
+        <w:t>June</w:t>
+      </w:r>
+      <w:r>
+        <w:rPr>
+          <w:rFonts w:hint="eastAsia"/>
+          <w:lang w:eastAsia="ko-KR"/>
+        </w:rPr>
+        <w:t xml:space="preserve"> 202</w:t>
+      </w:r>
+      <w:r>
+        <w:rPr>
+          <w:rFonts w:hint="eastAsia"/>
+          <w:lang w:eastAsia="ko-KR"/>
+        </w:rPr>
+        <w:t>6</w:t>
+      </w:r>
+      <w:r>
+        <w:rPr>
+          <w:rFonts w:hint="eastAsia"/>
+          <w:lang w:eastAsia="ko-KR"/>
         </w:rPr>
         <w:t xml:space="preserve"> </w:t>
       </w:r>
       <w:r>
-        <w:t>(Lead PI),</w:t>
-      </w:r>
-      <w:r>
-        <w:rPr>
-          <w:b/>
-          <w:bCs/>
-        </w:rPr>
-        <w:t xml:space="preserve"> Moon, J. (PI),</w:t>
-      </w:r>
-      <w:r>
-        <w:t xml:space="preserve"> &amp; Worsley, M. (PI) (July 202</w:t>
-      </w:r>
-      <w:r>
-        <w:rPr>
-          <w:rFonts w:hint="eastAsia"/>
-          <w:lang w:eastAsia="ko-KR"/>
-        </w:rPr>
-        <w:t>6</w:t>
-      </w:r>
-      <w:r>
-        <w:t xml:space="preserve"> – June 202</w:t>
-      </w:r>
-      <w:r>
-        <w:rPr>
-          <w:rFonts w:hint="eastAsia"/>
-          <w:lang w:eastAsia="ko-KR"/>
-        </w:rPr>
-        <w:t>9</w:t>
-      </w:r>
-      <w:r>
+        <w:rPr>
+          <w:lang w:eastAsia="ko-KR"/>
+        </w:rPr>
+        <w:t>–</w:t>
+      </w:r>
+      <w:r>
+        <w:rPr>
+          <w:rFonts w:hint="eastAsia"/>
+          <w:lang w:eastAsia="ko-KR"/>
+        </w:rPr>
+        <w:t xml:space="preserve"> </w:t>
+      </w:r>
+      <w:r>
+        <w:rPr>
+          <w:rFonts w:hint="eastAsia"/>
+          <w:lang w:eastAsia="ko-KR"/>
+        </w:rPr>
+        <w:t>May</w:t>
+      </w:r>
+      <w:r>
+        <w:rPr>
+          <w:rFonts w:hint="eastAsia"/>
+          <w:lang w:eastAsia="ko-KR"/>
+        </w:rPr>
+        <w:t xml:space="preserve"> 202</w:t>
+      </w:r>
+      <w:r>
+        <w:rPr>
+          <w:rFonts w:hint="eastAsia"/>
+          <w:lang w:eastAsia="ko-KR"/>
+        </w:rPr>
+        <w:t>7</w:t>
+      </w:r>
+      <w:r>
+        <w:rPr>
+          <w:rFonts w:hint="eastAsia"/>
+          <w:lang w:eastAsia="ko-KR"/>
+        </w:rPr>
         <w:t xml:space="preserve">). </w:t>
       </w:r>
       <w:r>
         <w:rPr>
-          <w:i/>
-          <w:iCs/>
-        </w:rPr>
-        <w:t>Data-informed Adaptive Teaching Analytics (DATA): Leveraging Artificial Intelligence for Adaptive Teaching and Generative Learning</w:t>
-      </w:r>
-      <w:r>
-        <w:t>. National Science Foundation</w:t>
-      </w:r>
-      <w:r>
-        <w:rPr>
-          <w:rFonts w:hint="eastAsia"/>
-          <w:lang w:eastAsia="ko-KR"/>
-        </w:rPr>
-        <w:t>, RITEL</w:t>
-      </w:r>
-      <w:r>
-        <w:t>, Total award $</w:t>
-      </w:r>
-      <w:r>
-        <w:rPr>
-          <w:rFonts w:hint="eastAsia"/>
-          <w:lang w:eastAsia="ko-KR"/>
-        </w:rPr>
-        <w:t>109</w:t>
-      </w:r>
-      <w:r>
-        <w:t>,</w:t>
-      </w:r>
-      <w:r>
-        <w:rPr>
-          <w:rFonts w:hint="eastAsia"/>
-          <w:lang w:eastAsia="ko-KR"/>
-        </w:rPr>
-        <w:t>846</w:t>
-      </w:r>
-      <w:r>
+          <w:lang w:eastAsia="ko-KR"/>
+        </w:rPr>
+        <w:t>Shift the Lens: Uncovering Students' Assets in Written Math Work via Multimodal AI</w:t>
+      </w:r>
+      <w:r>
+        <w:rPr>
+          <w:rFonts w:hint="eastAsia"/>
+          <w:lang w:eastAsia="ko-KR"/>
+        </w:rPr>
         <w:t xml:space="preserve">, </w:t>
+      </w:r>
+      <w:r>
+        <w:rPr>
+          <w:lang w:eastAsia="ko-KR"/>
+        </w:rPr>
+        <w:t>Total</w:t>
+      </w:r>
+      <w:r>
+        <w:rPr>
+          <w:rFonts w:hint="eastAsia"/>
+          <w:lang w:eastAsia="ko-KR"/>
+        </w:rPr>
+        <w:t xml:space="preserve"> award $</w:t>
+      </w:r>
+      <w:r>
+        <w:rPr>
+          <w:rFonts w:hint="eastAsia"/>
+          <w:lang w:eastAsia="ko-KR"/>
+        </w:rPr>
+        <w:t>5</w:t>
+      </w:r>
+      <w:r>
+        <w:rPr>
+          <w:lang w:eastAsia="ko-KR"/>
+        </w:rPr>
+        <w:t>0,</w:t>
+      </w:r>
+      <w:r>
+        <w:rPr>
+          <w:rFonts w:hint="eastAsia"/>
+          <w:lang w:eastAsia="ko-KR"/>
+        </w:rPr>
+        <w:t>000</w:t>
+      </w:r>
+      <w:r>
+        <w:rPr>
+          <w:rFonts w:hint="eastAsia"/>
+          <w:lang w:eastAsia="ko-KR"/>
+        </w:rPr>
+        <w:t xml:space="preserve">, </w:t>
+      </w:r>
+      <w:r>
+        <w:rPr>
+          <w:rFonts w:hint="eastAsia"/>
+          <w:lang w:eastAsia="ko-KR"/>
+        </w:rPr>
+        <w:t xml:space="preserve">Advanced Innovative Math Solutions Collaboratory, </w:t>
       </w:r>
       <w:r>
         <w:rPr>
@@ -5698,102 +5669,89 @@
           <w:between w:val="nil"/>
         </w:pBdr>
         <w:ind w:left="720" w:hanging="720"/>
-        <w:rPr>
-          <w:b/>
-          <w:bCs/>
-          <w:lang w:eastAsia="ko-KR"/>
-        </w:rPr>
-      </w:pPr>
-      <w:r>
-        <w:rPr>
-          <w:rFonts w:hint="eastAsia"/>
-          <w:b/>
-          <w:bCs/>
-          <w:lang w:eastAsia="ko-KR"/>
-        </w:rPr>
-        <w:t xml:space="preserve">Moon, J. (Lead PI) </w:t>
-      </w:r>
-      <w:r>
-        <w:rPr>
-          <w:rFonts w:hint="eastAsia"/>
-          <w:lang w:eastAsia="ko-KR"/>
-        </w:rPr>
-        <w:t xml:space="preserve">(April 2026 </w:t>
-      </w:r>
-      <w:r>
-        <w:rPr>
-          <w:rFonts w:hint="eastAsia"/>
-          <w:lang w:eastAsia="ko-KR"/>
-        </w:rPr>
-        <w:t>–</w:t>
-      </w:r>
-      <w:r>
-        <w:rPr>
-          <w:rFonts w:hint="eastAsia"/>
-          <w:lang w:eastAsia="ko-KR"/>
-        </w:rPr>
-        <w:t xml:space="preserve"> March 2031</w:t>
-      </w:r>
-      <w:r>
-        <w:rPr>
-          <w:rFonts w:hint="eastAsia"/>
-          <w:lang w:eastAsia="ko-KR"/>
-        </w:rPr>
+      </w:pPr>
+      <w:r>
+        <w:t>Suh, J.</w:t>
+      </w:r>
+      <w:r>
+        <w:rPr>
+          <w:b/>
+          <w:bCs/>
+        </w:rPr>
+        <w:t xml:space="preserve"> </w:t>
+      </w:r>
+      <w:r>
+        <w:t>(Lead PI),</w:t>
+      </w:r>
+      <w:r>
+        <w:rPr>
+          <w:b/>
+          <w:bCs/>
+        </w:rPr>
+        <w:t xml:space="preserve"> Moon, J. (PI),</w:t>
+      </w:r>
+      <w:r>
+        <w:t xml:space="preserve"> &amp; Worsley, M. (PI) (July 202</w:t>
+      </w:r>
+      <w:r>
+        <w:rPr>
+          <w:rFonts w:hint="eastAsia"/>
+          <w:lang w:eastAsia="ko-KR"/>
+        </w:rPr>
+        <w:t>6</w:t>
+      </w:r>
+      <w:r>
+        <w:t xml:space="preserve"> – June 202</w:t>
+      </w:r>
+      <w:r>
+        <w:rPr>
+          <w:rFonts w:hint="eastAsia"/>
+          <w:lang w:eastAsia="ko-KR"/>
+        </w:rPr>
+        <w:t>9</w:t>
+      </w:r>
+      <w:r>
         <w:t xml:space="preserve">). </w:t>
       </w:r>
       <w:r>
         <w:rPr>
-          <w:rFonts w:hint="eastAsia"/>
-          <w:lang w:eastAsia="ko-KR"/>
-        </w:rPr>
-        <w:t xml:space="preserve">CAREER: </w:t>
-      </w:r>
-      <w:r>
-        <w:rPr>
-          <w:lang w:eastAsia="ko-KR"/>
-        </w:rPr>
-        <w:t>SCALE-XR - Co-Intelligent XR Learning Environment for Undergraduate STEM Education</w:t>
-      </w:r>
-      <w:r>
-        <w:rPr>
-          <w:rFonts w:hint="eastAsia"/>
-          <w:lang w:eastAsia="ko-KR"/>
-        </w:rPr>
+          <w:i/>
+          <w:iCs/>
+        </w:rPr>
+        <w:t>Data-informed Adaptive Teaching Analytics (DATA): Leveraging Artificial Intelligence for Adaptive Teaching and Generative Learning</w:t>
+      </w:r>
+      <w:r>
+        <w:t>. National Science Foundation</w:t>
+      </w:r>
+      <w:r>
+        <w:rPr>
+          <w:rFonts w:hint="eastAsia"/>
+          <w:lang w:eastAsia="ko-KR"/>
+        </w:rPr>
+        <w:t>, RITEL</w:t>
+      </w:r>
+      <w:r>
+        <w:t>, Total award $</w:t>
+      </w:r>
+      <w:r>
+        <w:rPr>
+          <w:rFonts w:hint="eastAsia"/>
+          <w:lang w:eastAsia="ko-KR"/>
+        </w:rPr>
+        <w:t>109</w:t>
+      </w:r>
+      <w:r>
+        <w:t>,</w:t>
+      </w:r>
+      <w:r>
+        <w:rPr>
+          <w:rFonts w:hint="eastAsia"/>
+          <w:lang w:eastAsia="ko-KR"/>
+        </w:rPr>
+        <w:t>846</w:t>
+      </w:r>
+      <w:r>
         <w:t xml:space="preserve">, </w:t>
-      </w:r>
-      <w:r>
-        <w:rPr>
-          <w:lang w:eastAsia="ko-KR"/>
-        </w:rPr>
-        <w:t>Total</w:t>
-      </w:r>
-      <w:r>
-        <w:rPr>
-          <w:rFonts w:hint="eastAsia"/>
-          <w:lang w:eastAsia="ko-KR"/>
-        </w:rPr>
-        <w:t xml:space="preserve"> award $</w:t>
-      </w:r>
-      <w:r>
-        <w:rPr>
-          <w:rFonts w:hint="eastAsia"/>
-          <w:lang w:eastAsia="ko-KR"/>
-        </w:rPr>
-        <w:t>602,382</w:t>
-      </w:r>
-      <w:r>
-        <w:rPr>
-          <w:rFonts w:hint="eastAsia"/>
-          <w:lang w:eastAsia="ko-KR"/>
-        </w:rPr>
-        <w:t>,</w:t>
-      </w:r>
-      <w:r>
-        <w:rPr>
-          <w:rFonts w:hint="eastAsia"/>
-          <w:lang w:eastAsia="ko-KR"/>
-        </w:rPr>
-        <w:t xml:space="preserve"> National Science Foundation, </w:t>
       </w:r>
       <w:r>
         <w:rPr>
@@ -5827,24 +5785,14 @@
           <w:bCs/>
           <w:lang w:eastAsia="ko-KR"/>
         </w:rPr>
-        <w:t>Moon, J</w:t>
-      </w:r>
-      <w:r>
-        <w:rPr>
-          <w:rFonts w:hint="eastAsia"/>
-          <w:lang w:eastAsia="ko-KR"/>
-        </w:rPr>
-        <w:t xml:space="preserve">. </w:t>
-      </w:r>
-      <w:r>
-        <w:t>(</w:t>
-      </w:r>
-      <w:r>
-        <w:rPr>
-          <w:rFonts w:hint="eastAsia"/>
-          <w:lang w:eastAsia="ko-KR"/>
-        </w:rPr>
-        <w:t xml:space="preserve">September 2025 </w:t>
+        <w:t xml:space="preserve">Moon, J. (Lead PI) </w:t>
+      </w:r>
+      <w:r>
+        <w:rPr>
+          <w:rFonts w:hint="eastAsia"/>
+          <w:lang w:eastAsia="ko-KR"/>
+        </w:rPr>
+        <w:t xml:space="preserve">(April 2026 </w:t>
       </w:r>
       <w:r>
         <w:rPr>
@@ -5858,19 +5806,27 @@
           <w:rFonts w:hint="eastAsia"/>
           <w:lang w:eastAsia="ko-KR"/>
         </w:rPr>
-        <w:t xml:space="preserve"> August 2026</w:t>
-      </w:r>
-      <w:r>
+        <w:t xml:space="preserve"> March 2031</w:t>
+      </w:r>
+      <w:r>
+        <w:rPr>
+          <w:rFonts w:hint="eastAsia"/>
+          <w:lang w:eastAsia="ko-KR"/>
+        </w:rPr>
         <w:t xml:space="preserve">). </w:t>
       </w:r>
       <w:r>
         <w:rPr>
           <w:rFonts w:hint="eastAsia"/>
-          <w:i/>
-          <w:iCs/>
-          <w:lang w:eastAsia="ko-KR"/>
-        </w:rPr>
-        <w:t>ALA-AI Fellowship (Junior)</w:t>
+          <w:lang w:eastAsia="ko-KR"/>
+        </w:rPr>
+        <w:t xml:space="preserve">CAREER: </w:t>
+      </w:r>
+      <w:r>
+        <w:rPr>
+          <w:lang w:eastAsia="ko-KR"/>
+        </w:rPr>
+        <w:t>SCALE-XR - Co-Intelligent XR Learning Environment for Undergraduate STEM Education</w:t>
       </w:r>
       <w:r>
         <w:rPr>
@@ -5883,17 +5839,25 @@
         <w:rPr>
           <w:lang w:eastAsia="ko-KR"/>
         </w:rPr>
-        <w:t>$</w:t>
-      </w:r>
-      <w:r>
-        <w:rPr>
-          <w:rFonts w:hint="eastAsia"/>
-          <w:lang w:eastAsia="ko-KR"/>
-        </w:rPr>
-        <w:t>6</w:t>
-      </w:r>
-      <w:r>
-        <w:rPr>
+        <w:t>Total</w:t>
+      </w:r>
+      <w:r>
+        <w:rPr>
+          <w:rFonts w:hint="eastAsia"/>
+          <w:lang w:eastAsia="ko-KR"/>
+        </w:rPr>
+        <w:t xml:space="preserve"> award $</w:t>
+      </w:r>
+      <w:r>
+        <w:rPr>
+          <w:rFonts w:hint="eastAsia"/>
+          <w:lang w:eastAsia="ko-KR"/>
+        </w:rPr>
+        <w:t>602,382</w:t>
+      </w:r>
+      <w:r>
+        <w:rPr>
+          <w:rFonts w:hint="eastAsia"/>
           <w:lang w:eastAsia="ko-KR"/>
         </w:rPr>
         <w:t>,</w:t>
@@ -5903,7 +5867,15 @@
           <w:rFonts w:hint="eastAsia"/>
           <w:lang w:eastAsia="ko-KR"/>
         </w:rPr>
-        <w:t>000</w:t>
+        <w:t xml:space="preserve"> National Science Foundation, </w:t>
+      </w:r>
+      <w:r>
+        <w:rPr>
+          <w:b/>
+          <w:bCs/>
+          <w:u w:val="single"/>
+        </w:rPr>
+        <w:t>NOT FUNDED</w:t>
       </w:r>
     </w:p>
     <w:p>
@@ -5929,37 +5901,63 @@
           <w:bCs/>
           <w:lang w:eastAsia="ko-KR"/>
         </w:rPr>
-        <w:t xml:space="preserve">Moon, J. (Lead PI) &amp; </w:t>
-      </w:r>
-      <w:r>
-        <w:rPr>
-          <w:rFonts w:hint="eastAsia"/>
-          <w:lang w:eastAsia="ko-KR"/>
-        </w:rPr>
-        <w:t>Avraham, R. (PI)</w:t>
-      </w:r>
-      <w:r>
-        <w:rPr>
-          <w:rFonts w:hint="eastAsia"/>
-          <w:b/>
-          <w:bCs/>
-          <w:lang w:eastAsia="ko-KR"/>
-        </w:rPr>
-        <w:t xml:space="preserve"> </w:t>
-      </w:r>
-      <w:r>
-        <w:rPr>
-          <w:rFonts w:hint="eastAsia"/>
-          <w:lang w:eastAsia="ko-KR"/>
-        </w:rPr>
-        <w:t>(Jan</w:t>
-      </w:r>
-      <w:r>
-        <w:rPr>
-          <w:rFonts w:hint="eastAsia"/>
-          <w:lang w:eastAsia="ko-KR"/>
-        </w:rPr>
-        <w:t xml:space="preserve"> 202</w:t>
+        <w:t>Moon, J</w:t>
+      </w:r>
+      <w:r>
+        <w:rPr>
+          <w:rFonts w:hint="eastAsia"/>
+          <w:lang w:eastAsia="ko-KR"/>
+        </w:rPr>
+        <w:t xml:space="preserve">. </w:t>
+      </w:r>
+      <w:r>
+        <w:t>(</w:t>
+      </w:r>
+      <w:r>
+        <w:rPr>
+          <w:rFonts w:hint="eastAsia"/>
+          <w:lang w:eastAsia="ko-KR"/>
+        </w:rPr>
+        <w:t xml:space="preserve">September 2025 </w:t>
+      </w:r>
+      <w:r>
+        <w:rPr>
+          <w:rFonts w:hint="eastAsia"/>
+          <w:lang w:eastAsia="ko-KR"/>
+        </w:rPr>
+        <w:t>–</w:t>
+      </w:r>
+      <w:r>
+        <w:rPr>
+          <w:rFonts w:hint="eastAsia"/>
+          <w:lang w:eastAsia="ko-KR"/>
+        </w:rPr>
+        <w:t xml:space="preserve"> August 2026</w:t>
+      </w:r>
+      <w:r>
+        <w:t xml:space="preserve">). </w:t>
+      </w:r>
+      <w:r>
+        <w:rPr>
+          <w:rFonts w:hint="eastAsia"/>
+          <w:i/>
+          <w:iCs/>
+          <w:lang w:eastAsia="ko-KR"/>
+        </w:rPr>
+        <w:t>ALA-AI Fellowship (Junior)</w:t>
+      </w:r>
+      <w:r>
+        <w:rPr>
+          <w:rFonts w:hint="eastAsia"/>
+          <w:lang w:eastAsia="ko-KR"/>
+        </w:rPr>
+        <w:t xml:space="preserve">, </w:t>
+      </w:r>
+      <w:r>
+        <w:rPr>
+          <w:lang w:eastAsia="ko-KR"/>
+        </w:rPr>
+        <w:t>$</w:t>
       </w:r>
       <w:r>
         <w:rPr>
@@ -5970,88 +5968,6 @@
       </w:r>
       <w:r>
         <w:rPr>
-          <w:rFonts w:hint="eastAsia"/>
-          <w:lang w:eastAsia="ko-KR"/>
-        </w:rPr>
-        <w:t xml:space="preserve"> </w:t>
-      </w:r>
-      <w:r>
-        <w:rPr>
-          <w:lang w:eastAsia="ko-KR"/>
-        </w:rPr>
-        <w:t>–</w:t>
-      </w:r>
-      <w:r>
-        <w:rPr>
-          <w:rFonts w:hint="eastAsia"/>
-          <w:lang w:eastAsia="ko-KR"/>
-        </w:rPr>
-        <w:t xml:space="preserve"> </w:t>
-      </w:r>
-      <w:r>
-        <w:rPr>
-          <w:rFonts w:hint="eastAsia"/>
-          <w:lang w:eastAsia="ko-KR"/>
-        </w:rPr>
-        <w:t>December</w:t>
-      </w:r>
-      <w:r>
-        <w:rPr>
-          <w:rFonts w:hint="eastAsia"/>
-          <w:lang w:eastAsia="ko-KR"/>
-        </w:rPr>
-        <w:t xml:space="preserve"> 20</w:t>
-      </w:r>
-      <w:r>
-        <w:rPr>
-          <w:rFonts w:hint="eastAsia"/>
-          <w:lang w:eastAsia="ko-KR"/>
-        </w:rPr>
-        <w:t>27</w:t>
-      </w:r>
-      <w:r>
-        <w:rPr>
-          <w:rFonts w:hint="eastAsia"/>
-          <w:lang w:eastAsia="ko-KR"/>
-        </w:rPr>
-        <w:t xml:space="preserve">). </w:t>
-      </w:r>
-      <w:r>
-        <w:rPr>
-          <w:lang w:eastAsia="ko-KR"/>
-        </w:rPr>
-        <w:t>Collaborative Development and Evaluation of a Gamified AI Chatbot to Enhance Rehabilitation Nurses’ Intentions and Behaviors in Addressing Healthy Sexuality</w:t>
-      </w:r>
-      <w:r>
-        <w:rPr>
-          <w:rFonts w:hint="eastAsia"/>
-          <w:lang w:eastAsia="ko-KR"/>
-        </w:rPr>
-        <w:t xml:space="preserve">, </w:t>
-      </w:r>
-      <w:r>
-        <w:rPr>
-          <w:lang w:eastAsia="ko-KR"/>
-        </w:rPr>
-        <w:t>Total</w:t>
-      </w:r>
-      <w:r>
-        <w:rPr>
-          <w:rFonts w:hint="eastAsia"/>
-          <w:lang w:eastAsia="ko-KR"/>
-        </w:rPr>
-        <w:t xml:space="preserve"> award $</w:t>
-      </w:r>
-      <w:r>
-        <w:rPr>
-          <w:rFonts w:hint="eastAsia"/>
-          <w:lang w:eastAsia="ko-KR"/>
-        </w:rPr>
-        <w:t>30,000</w:t>
-      </w:r>
-      <w:r>
-        <w:rPr>
-          <w:rFonts w:hint="eastAsia"/>
           <w:lang w:eastAsia="ko-KR"/>
         </w:rPr>
         <w:t>,</w:t>
@@ -6061,15 +5977,7 @@
           <w:rFonts w:hint="eastAsia"/>
           <w:lang w:eastAsia="ko-KR"/>
         </w:rPr>
-        <w:t xml:space="preserve"> </w:t>
-      </w:r>
-      <w:r>
-        <w:rPr>
-          <w:b/>
-          <w:bCs/>
-          <w:u w:val="single"/>
-        </w:rPr>
-        <w:t>NOT FUNDED</w:t>
+        <w:t>000</w:t>
       </w:r>
     </w:p>
     <w:p>
@@ -6095,14 +6003,51 @@
           <w:bCs/>
           <w:lang w:eastAsia="ko-KR"/>
         </w:rPr>
-        <w:t xml:space="preserve">Moon, J. (Lead PI) </w:t>
-      </w:r>
-      <w:r>
-        <w:rPr>
-          <w:rFonts w:hint="eastAsia"/>
-          <w:lang w:eastAsia="ko-KR"/>
-        </w:rPr>
-        <w:t xml:space="preserve">(September 2025 </w:t>
+        <w:t xml:space="preserve">Moon, J. (Lead PI) &amp; </w:t>
+      </w:r>
+      <w:r>
+        <w:rPr>
+          <w:rFonts w:hint="eastAsia"/>
+          <w:lang w:eastAsia="ko-KR"/>
+        </w:rPr>
+        <w:t>Avraham, R. (PI)</w:t>
+      </w:r>
+      <w:r>
+        <w:rPr>
+          <w:rFonts w:hint="eastAsia"/>
+          <w:b/>
+          <w:bCs/>
+          <w:lang w:eastAsia="ko-KR"/>
+        </w:rPr>
+        <w:t xml:space="preserve"> </w:t>
+      </w:r>
+      <w:r>
+        <w:rPr>
+          <w:rFonts w:hint="eastAsia"/>
+          <w:lang w:eastAsia="ko-KR"/>
+        </w:rPr>
+        <w:t>(Jan</w:t>
+      </w:r>
+      <w:r>
+        <w:rPr>
+          <w:rFonts w:hint="eastAsia"/>
+          <w:lang w:eastAsia="ko-KR"/>
+        </w:rPr>
+        <w:t xml:space="preserve"> 202</w:t>
+      </w:r>
+      <w:r>
+        <w:rPr>
+          <w:rFonts w:hint="eastAsia"/>
+          <w:lang w:eastAsia="ko-KR"/>
+        </w:rPr>
+        <w:t>6</w:t>
+      </w:r>
+      <w:r>
+        <w:rPr>
+          <w:rFonts w:hint="eastAsia"/>
+          <w:lang w:eastAsia="ko-KR"/>
+        </w:rPr>
+        <w:t xml:space="preserve"> </w:t>
       </w:r>
       <w:r>
         <w:rPr>
@@ -6115,32 +6060,48 @@
           <w:rFonts w:hint="eastAsia"/>
           <w:lang w:eastAsia="ko-KR"/>
         </w:rPr>
-        <w:t xml:space="preserve"> August 2028)</w:t>
-      </w:r>
-      <w:r>
-        <w:rPr>
-          <w:rFonts w:hint="eastAsia"/>
-          <w:b/>
-          <w:bCs/>
-          <w:lang w:eastAsia="ko-KR"/>
-        </w:rPr>
-        <w:t xml:space="preserve">. </w:t>
-      </w:r>
-      <w:r>
-        <w:rPr>
-          <w:rFonts w:hint="eastAsia"/>
-          <w:lang w:eastAsia="ko-KR"/>
-        </w:rPr>
-        <w:t>Immersive AI Analytics in Teacher Education: Enhancing Reflection and Pedagogical Adaptability</w:t>
-      </w:r>
-      <w:r>
-        <w:rPr>
-          <w:rFonts w:hint="eastAsia"/>
-          <w:b/>
-          <w:bCs/>
-          <w:lang w:eastAsia="ko-KR"/>
-        </w:rPr>
-        <w:t xml:space="preserve">. </w:t>
+        <w:t xml:space="preserve"> </w:t>
+      </w:r>
+      <w:r>
+        <w:rPr>
+          <w:rFonts w:hint="eastAsia"/>
+          <w:lang w:eastAsia="ko-KR"/>
+        </w:rPr>
+        <w:t>December</w:t>
+      </w:r>
+      <w:r>
+        <w:rPr>
+          <w:rFonts w:hint="eastAsia"/>
+          <w:lang w:eastAsia="ko-KR"/>
+        </w:rPr>
+        <w:t xml:space="preserve"> 20</w:t>
+      </w:r>
+      <w:r>
+        <w:rPr>
+          <w:rFonts w:hint="eastAsia"/>
+          <w:lang w:eastAsia="ko-KR"/>
+        </w:rPr>
+        <w:t>27</w:t>
+      </w:r>
+      <w:r>
+        <w:rPr>
+          <w:rFonts w:hint="eastAsia"/>
+          <w:lang w:eastAsia="ko-KR"/>
+        </w:rPr>
+        <w:t xml:space="preserve">). </w:t>
+      </w:r>
+      <w:r>
+        <w:rPr>
+          <w:lang w:eastAsia="ko-KR"/>
+        </w:rPr>
+        <w:t>Collaborative Development and Evaluation of a Gamified AI Chatbot to Enhance Rehabilitation Nurses’ Intentions and Behaviors in Addressing Healthy Sexuality</w:t>
+      </w:r>
+      <w:r>
+        <w:rPr>
+          <w:rFonts w:hint="eastAsia"/>
+          <w:lang w:eastAsia="ko-KR"/>
+        </w:rPr>
+        <w:t xml:space="preserve">, </w:t>
       </w:r>
       <w:r>
         <w:rPr>
@@ -6153,34 +6114,25 @@
           <w:rFonts w:hint="eastAsia"/>
           <w:lang w:eastAsia="ko-KR"/>
         </w:rPr>
-        <w:t xml:space="preserve"> award $5</w:t>
-      </w:r>
-      <w:r>
-        <w:rPr>
-          <w:rFonts w:hint="eastAsia"/>
-          <w:lang w:eastAsia="ko-KR"/>
-        </w:rPr>
-        <w:t>0,</w:t>
-      </w:r>
-      <w:r>
-        <w:rPr>
-          <w:rFonts w:hint="eastAsia"/>
-          <w:lang w:eastAsia="ko-KR"/>
-        </w:rPr>
-        <w:t xml:space="preserve">000, </w:t>
-      </w:r>
-      <w:r>
-        <w:rPr>
-          <w:rFonts w:hint="eastAsia"/>
-          <w:lang w:eastAsia="ko-KR"/>
-        </w:rPr>
-        <w:t>Spencer Foundation Small Research Grant Program,</w:t>
-      </w:r>
-      <w:r>
-        <w:rPr>
-          <w:rFonts w:hint="eastAsia"/>
-          <w:b/>
-          <w:bCs/>
+        <w:t xml:space="preserve"> award $</w:t>
+      </w:r>
+      <w:r>
+        <w:rPr>
+          <w:rFonts w:hint="eastAsia"/>
+          <w:lang w:eastAsia="ko-KR"/>
+        </w:rPr>
+        <w:t>30,000</w:t>
+      </w:r>
+      <w:r>
+        <w:rPr>
+          <w:rFonts w:hint="eastAsia"/>
+          <w:lang w:eastAsia="ko-KR"/>
+        </w:rPr>
+        <w:t>,</w:t>
+      </w:r>
+      <w:r>
+        <w:rPr>
+          <w:rFonts w:hint="eastAsia"/>
           <w:lang w:eastAsia="ko-KR"/>
         </w:rPr>
         <w:t xml:space="preserve"> </w:t>
@@ -6192,15 +6144,6 @@
           <w:u w:val="single"/>
         </w:rPr>
         <w:t>NOT FUNDED</w:t>
-      </w:r>
-      <w:r>
-        <w:rPr>
-          <w:rFonts w:hint="eastAsia"/>
-          <w:b/>
-          <w:bCs/>
-          <w:lang w:eastAsia="ko-KR"/>
-        </w:rPr>
-        <w:t xml:space="preserve"> </w:t>
       </w:r>
     </w:p>
     <w:p>
@@ -6216,6 +6159,7 @@
         <w:rPr>
           <w:b/>
           <w:bCs/>
+          <w:lang w:eastAsia="ko-KR"/>
         </w:rPr>
       </w:pPr>
       <w:r>
@@ -6232,21 +6176,7 @@
           <w:rFonts w:hint="eastAsia"/>
           <w:lang w:eastAsia="ko-KR"/>
         </w:rPr>
-        <w:t>(</w:t>
-      </w:r>
-      <w:r>
-        <w:rPr>
-          <w:rFonts w:hint="eastAsia"/>
-          <w:lang w:eastAsia="ko-KR"/>
-        </w:rPr>
-        <w:t>June</w:t>
-      </w:r>
-      <w:r>
-        <w:rPr>
-          <w:rFonts w:hint="eastAsia"/>
-          <w:lang w:eastAsia="ko-KR"/>
-        </w:rPr>
-        <w:t xml:space="preserve"> 2025 </w:t>
+        <w:t xml:space="preserve">(September 2025 </w:t>
       </w:r>
       <w:r>
         <w:rPr>
@@ -6259,95 +6189,92 @@
           <w:rFonts w:hint="eastAsia"/>
           <w:lang w:eastAsia="ko-KR"/>
         </w:rPr>
+        <w:t xml:space="preserve"> August 2028)</w:t>
+      </w:r>
+      <w:r>
+        <w:rPr>
+          <w:rFonts w:hint="eastAsia"/>
+          <w:b/>
+          <w:bCs/>
+          <w:lang w:eastAsia="ko-KR"/>
+        </w:rPr>
+        <w:t xml:space="preserve">. </w:t>
+      </w:r>
+      <w:r>
+        <w:rPr>
+          <w:rFonts w:hint="eastAsia"/>
+          <w:lang w:eastAsia="ko-KR"/>
+        </w:rPr>
+        <w:t>Immersive AI Analytics in Teacher Education: Enhancing Reflection and Pedagogical Adaptability</w:t>
+      </w:r>
+      <w:r>
+        <w:rPr>
+          <w:rFonts w:hint="eastAsia"/>
+          <w:b/>
+          <w:bCs/>
+          <w:lang w:eastAsia="ko-KR"/>
+        </w:rPr>
+        <w:t xml:space="preserve">. </w:t>
+      </w:r>
+      <w:r>
+        <w:rPr>
+          <w:lang w:eastAsia="ko-KR"/>
+        </w:rPr>
+        <w:t>Total</w:t>
+      </w:r>
+      <w:r>
+        <w:rPr>
+          <w:rFonts w:hint="eastAsia"/>
+          <w:lang w:eastAsia="ko-KR"/>
+        </w:rPr>
+        <w:t xml:space="preserve"> award $5</w:t>
+      </w:r>
+      <w:r>
+        <w:rPr>
+          <w:rFonts w:hint="eastAsia"/>
+          <w:lang w:eastAsia="ko-KR"/>
+        </w:rPr>
+        <w:t>0,</w:t>
+      </w:r>
+      <w:r>
+        <w:rPr>
+          <w:rFonts w:hint="eastAsia"/>
+          <w:lang w:eastAsia="ko-KR"/>
+        </w:rPr>
+        <w:t xml:space="preserve">000, </w:t>
+      </w:r>
+      <w:r>
+        <w:rPr>
+          <w:rFonts w:hint="eastAsia"/>
+          <w:lang w:eastAsia="ko-KR"/>
+        </w:rPr>
+        <w:t>Spencer Foundation Small Research Grant Program,</w:t>
+      </w:r>
+      <w:r>
+        <w:rPr>
+          <w:rFonts w:hint="eastAsia"/>
+          <w:b/>
+          <w:bCs/>
+          <w:lang w:eastAsia="ko-KR"/>
+        </w:rPr>
         <w:t xml:space="preserve"> </w:t>
       </w:r>
       <w:r>
         <w:rPr>
-          <w:rFonts w:hint="eastAsia"/>
-          <w:lang w:eastAsia="ko-KR"/>
-        </w:rPr>
-        <w:t>May</w:t>
-      </w:r>
-      <w:r>
-        <w:rPr>
-          <w:rFonts w:hint="eastAsia"/>
-          <w:lang w:eastAsia="ko-KR"/>
-        </w:rPr>
-        <w:t xml:space="preserve"> 202</w:t>
-      </w:r>
-      <w:r>
-        <w:rPr>
-          <w:rFonts w:hint="eastAsia"/>
-          <w:lang w:eastAsia="ko-KR"/>
-        </w:rPr>
-        <w:t>6</w:t>
-      </w:r>
-      <w:r>
-        <w:rPr>
-          <w:rFonts w:hint="eastAsia"/>
-          <w:lang w:eastAsia="ko-KR"/>
-        </w:rPr>
-        <w:t xml:space="preserve">). </w:t>
-      </w:r>
-      <w:r>
-        <w:rPr>
-          <w:lang w:eastAsia="ko-KR"/>
-        </w:rPr>
-        <w:t>Optimizing</w:t>
-      </w:r>
-      <w:r>
-        <w:rPr>
-          <w:lang w:eastAsia="ko-KR"/>
-        </w:rPr>
-        <w:t xml:space="preserve"> Digital Math Learning Through Temporal Analytics: Exploring Spacing Effects and Time-on-Task Behaviors in Khan Academy</w:t>
-      </w:r>
-      <w:r>
-        <w:rPr>
-          <w:rFonts w:hint="eastAsia"/>
-          <w:lang w:eastAsia="ko-KR"/>
-        </w:rPr>
-        <w:t xml:space="preserve">, </w:t>
-      </w:r>
-      <w:r>
-        <w:rPr>
-          <w:lang w:eastAsia="ko-KR"/>
-        </w:rPr>
-        <w:t>Total</w:t>
-      </w:r>
-      <w:r>
-        <w:rPr>
-          <w:rFonts w:hint="eastAsia"/>
-          <w:lang w:eastAsia="ko-KR"/>
-        </w:rPr>
-        <w:t xml:space="preserve"> award $</w:t>
-      </w:r>
-      <w:r>
-        <w:rPr>
-          <w:lang w:eastAsia="ko-KR"/>
-        </w:rPr>
-        <w:t>40,255</w:t>
-      </w:r>
-      <w:r>
-        <w:rPr>
-          <w:rFonts w:hint="eastAsia"/>
-          <w:lang w:eastAsia="ko-KR"/>
-        </w:rPr>
-        <w:t xml:space="preserve">, </w:t>
-      </w:r>
-      <w:r>
-        <w:rPr>
-          <w:rFonts w:hint="eastAsia"/>
-          <w:lang w:eastAsia="ko-KR"/>
-        </w:rPr>
-        <w:t xml:space="preserve">Advanced Innovative Math Solutions Collaboratory, </w:t>
-      </w:r>
-      <w:r>
-        <w:rPr>
           <w:b/>
           <w:bCs/>
           <w:u w:val="single"/>
         </w:rPr>
         <w:t>NOT FUNDED</w:t>
+      </w:r>
+      <w:r>
+        <w:rPr>
+          <w:rFonts w:hint="eastAsia"/>
+          <w:b/>
+          <w:bCs/>
+          <w:lang w:eastAsia="ko-KR"/>
+        </w:rPr>
+        <w:t xml:space="preserve"> </w:t>
       </w:r>
     </w:p>
     <w:p>
@@ -6366,114 +6293,127 @@
         </w:rPr>
       </w:pPr>
       <w:r>
-        <w:t>Shi, Y. (Lead PI),</w:t>
-      </w:r>
-      <w:r>
-        <w:rPr>
-          <w:b/>
-          <w:bCs/>
+        <w:rPr>
+          <w:rFonts w:hint="eastAsia"/>
+          <w:b/>
+          <w:bCs/>
+          <w:lang w:eastAsia="ko-KR"/>
+        </w:rPr>
+        <w:t xml:space="preserve">Moon, J. (Lead PI) </w:t>
+      </w:r>
+      <w:r>
+        <w:rPr>
+          <w:rFonts w:hint="eastAsia"/>
+          <w:lang w:eastAsia="ko-KR"/>
+        </w:rPr>
+        <w:t>(</w:t>
+      </w:r>
+      <w:r>
+        <w:rPr>
+          <w:rFonts w:hint="eastAsia"/>
+          <w:lang w:eastAsia="ko-KR"/>
+        </w:rPr>
+        <w:t>June</w:t>
+      </w:r>
+      <w:r>
+        <w:rPr>
+          <w:rFonts w:hint="eastAsia"/>
+          <w:lang w:eastAsia="ko-KR"/>
+        </w:rPr>
+        <w:t xml:space="preserve"> 2025 </w:t>
+      </w:r>
+      <w:r>
+        <w:rPr>
+          <w:lang w:eastAsia="ko-KR"/>
+        </w:rPr>
+        <w:t>–</w:t>
+      </w:r>
+      <w:r>
+        <w:rPr>
+          <w:rFonts w:hint="eastAsia"/>
+          <w:lang w:eastAsia="ko-KR"/>
         </w:rPr>
         <w:t xml:space="preserve"> </w:t>
       </w:r>
       <w:r>
-        <w:t>Du, J. (Lead PI)</w:t>
-      </w:r>
-      <w:r>
-        <w:rPr>
-          <w:b/>
-          <w:bCs/>
+        <w:rPr>
+          <w:rFonts w:hint="eastAsia"/>
+          <w:lang w:eastAsia="ko-KR"/>
+        </w:rPr>
+        <w:t>May</w:t>
+      </w:r>
+      <w:r>
+        <w:rPr>
+          <w:rFonts w:hint="eastAsia"/>
+          <w:lang w:eastAsia="ko-KR"/>
+        </w:rPr>
+        <w:t xml:space="preserve"> 202</w:t>
+      </w:r>
+      <w:r>
+        <w:rPr>
+          <w:rFonts w:hint="eastAsia"/>
+          <w:lang w:eastAsia="ko-KR"/>
+        </w:rPr>
+        <w:t>6</w:t>
+      </w:r>
+      <w:r>
+        <w:rPr>
+          <w:rFonts w:hint="eastAsia"/>
+          <w:lang w:eastAsia="ko-KR"/>
+        </w:rPr>
+        <w:t xml:space="preserve">). </w:t>
+      </w:r>
+      <w:r>
+        <w:rPr>
+          <w:lang w:eastAsia="ko-KR"/>
+        </w:rPr>
+        <w:t>Optimizing</w:t>
+      </w:r>
+      <w:r>
+        <w:rPr>
+          <w:lang w:eastAsia="ko-KR"/>
+        </w:rPr>
+        <w:t xml:space="preserve"> Digital Math Learning Through Temporal Analytics: Exploring Spacing Effects and Time-on-Task Behaviors in Khan Academy</w:t>
+      </w:r>
+      <w:r>
+        <w:rPr>
+          <w:rFonts w:hint="eastAsia"/>
+          <w:lang w:eastAsia="ko-KR"/>
         </w:rPr>
         <w:t xml:space="preserve">, </w:t>
       </w:r>
       <w:r>
         <w:rPr>
-          <w:b/>
-          <w:bCs/>
-        </w:rPr>
-        <w:t>Moon, J</w:t>
-      </w:r>
-      <w:r>
-        <w:rPr>
-          <w:b/>
-          <w:bCs/>
-        </w:rPr>
-        <w:t>. (Lead PI),</w:t>
-      </w:r>
-      <w:r>
-        <w:t xml:space="preserve"> Myers, L. </w:t>
-      </w:r>
-      <w:r>
-        <w:t>(PI)</w:t>
-      </w:r>
-      <w:r>
-        <w:rPr>
-          <w:b/>
-          <w:bCs/>
-        </w:rPr>
-        <w:t xml:space="preserve"> </w:t>
-      </w:r>
-      <w:r>
-        <w:t>(</w:t>
-      </w:r>
-      <w:r>
-        <w:t>August</w:t>
-      </w:r>
-      <w:r>
-        <w:t xml:space="preserve"> 202</w:t>
-      </w:r>
-      <w:r>
-        <w:rPr>
-          <w:rFonts w:hint="eastAsia"/>
-          <w:lang w:eastAsia="ko-KR"/>
-        </w:rPr>
-        <w:t>5</w:t>
-      </w:r>
-      <w:r>
-        <w:t xml:space="preserve"> – </w:t>
-      </w:r>
-      <w:r>
-        <w:t>July</w:t>
-      </w:r>
-      <w:r>
-        <w:t xml:space="preserve"> 202</w:t>
-      </w:r>
-      <w:r>
-        <w:rPr>
-          <w:rFonts w:hint="eastAsia"/>
-          <w:lang w:eastAsia="ko-KR"/>
-        </w:rPr>
-        <w:t>8</w:t>
-      </w:r>
-      <w:r>
-        <w:t xml:space="preserve">). </w:t>
-      </w:r>
-      <w:r>
-        <w:t>Collaborative Research: RITEL: Preparing First Responders for Future Robotic Technologies through Distributed and Embodied Virtual Learning Environment</w:t>
-      </w:r>
-      <w:r>
-        <w:t xml:space="preserve">. </w:t>
-      </w:r>
-      <w:r>
-        <w:t>National Science Foundation</w:t>
-      </w:r>
-      <w:r>
-        <w:t>, Total award $</w:t>
-      </w:r>
-      <w:r>
-        <w:t>2</w:t>
-      </w:r>
-      <w:r>
-        <w:rPr>
-          <w:rFonts w:hint="eastAsia"/>
-          <w:lang w:eastAsia="ko-KR"/>
-        </w:rPr>
-        <w:t>2</w:t>
-      </w:r>
-      <w:r>
-        <w:t>0,000</w:t>
-      </w:r>
-      <w:r>
+          <w:lang w:eastAsia="ko-KR"/>
+        </w:rPr>
+        <w:t>Total</w:t>
+      </w:r>
+      <w:r>
+        <w:rPr>
+          <w:rFonts w:hint="eastAsia"/>
+          <w:lang w:eastAsia="ko-KR"/>
+        </w:rPr>
+        <w:t xml:space="preserve"> award $</w:t>
+      </w:r>
+      <w:r>
+        <w:rPr>
+          <w:lang w:eastAsia="ko-KR"/>
+        </w:rPr>
+        <w:t>40,255</w:t>
+      </w:r>
+      <w:r>
+        <w:rPr>
+          <w:rFonts w:hint="eastAsia"/>
+          <w:lang w:eastAsia="ko-KR"/>
+        </w:rPr>
         <w:t xml:space="preserve">, </w:t>
+      </w:r>
+      <w:r>
+        <w:rPr>
+          <w:rFonts w:hint="eastAsia"/>
+          <w:lang w:eastAsia="ko-KR"/>
+        </w:rPr>
+        <w:t xml:space="preserve">Advanced Innovative Math Solutions Collaboratory, </w:t>
       </w:r>
       <w:r>
         <w:rPr>
@@ -6497,84 +6437,117 @@
         <w:rPr>
           <w:b/>
           <w:bCs/>
-          <w:lang w:eastAsia="ko-KR"/>
-        </w:rPr>
-      </w:pPr>
-      <w:r>
-        <w:rPr>
-          <w:rFonts w:hint="eastAsia"/>
-          <w:b/>
-          <w:bCs/>
-          <w:lang w:eastAsia="ko-KR"/>
-        </w:rPr>
-        <w:t xml:space="preserve">Moon, J. (Lead PI) </w:t>
-      </w:r>
-      <w:r>
-        <w:rPr>
-          <w:rFonts w:hint="eastAsia"/>
-          <w:lang w:eastAsia="ko-KR"/>
-        </w:rPr>
-        <w:t xml:space="preserve">(May 2025 </w:t>
-      </w:r>
-      <w:r>
-        <w:rPr>
-          <w:lang w:eastAsia="ko-KR"/>
-        </w:rPr>
-        <w:t>–</w:t>
-      </w:r>
-      <w:r>
-        <w:rPr>
-          <w:rFonts w:hint="eastAsia"/>
-          <w:lang w:eastAsia="ko-KR"/>
-        </w:rPr>
-        <w:t xml:space="preserve"> May 2027). </w:t>
-      </w:r>
-      <w:r>
-        <w:rPr>
-          <w:lang w:eastAsia="ko-KR"/>
-        </w:rPr>
-        <w:t>Transforming Rural Teacher Preparation: An AI-Powered 3D Simulation for Real-World Classroom Problem-Solving</w:t>
-      </w:r>
-      <w:r>
-        <w:rPr>
-          <w:rFonts w:hint="eastAsia"/>
-          <w:lang w:eastAsia="ko-KR"/>
-        </w:rPr>
+        </w:rPr>
+      </w:pPr>
+      <w:r>
+        <w:t>Shi, Y. (Lead PI),</w:t>
+      </w:r>
+      <w:r>
+        <w:rPr>
+          <w:b/>
+          <w:bCs/>
+        </w:rPr>
+        <w:t xml:space="preserve"> </w:t>
+      </w:r>
+      <w:r>
+        <w:t>Du, J. (Lead PI)</w:t>
+      </w:r>
+      <w:r>
+        <w:rPr>
+          <w:b/>
+          <w:bCs/>
+        </w:rPr>
+        <w:t xml:space="preserve">, </w:t>
+      </w:r>
+      <w:r>
+        <w:rPr>
+          <w:b/>
+          <w:bCs/>
+        </w:rPr>
+        <w:t>Moon, J</w:t>
+      </w:r>
+      <w:r>
+        <w:rPr>
+          <w:b/>
+          <w:bCs/>
+        </w:rPr>
+        <w:t>. (Lead PI),</w:t>
+      </w:r>
+      <w:r>
+        <w:t xml:space="preserve"> Myers, L. </w:t>
+      </w:r>
+      <w:r>
+        <w:t>(PI)</w:t>
+      </w:r>
+      <w:r>
+        <w:rPr>
+          <w:b/>
+          <w:bCs/>
+        </w:rPr>
+        <w:t xml:space="preserve"> </w:t>
+      </w:r>
+      <w:r>
+        <w:t>(</w:t>
+      </w:r>
+      <w:r>
+        <w:t>August</w:t>
+      </w:r>
+      <w:r>
+        <w:t xml:space="preserve"> 202</w:t>
+      </w:r>
+      <w:r>
+        <w:rPr>
+          <w:rFonts w:hint="eastAsia"/>
+          <w:lang w:eastAsia="ko-KR"/>
+        </w:rPr>
+        <w:t>5</w:t>
+      </w:r>
+      <w:r>
+        <w:t xml:space="preserve"> – </w:t>
+      </w:r>
+      <w:r>
+        <w:t>July</w:t>
+      </w:r>
+      <w:r>
+        <w:t xml:space="preserve"> 202</w:t>
+      </w:r>
+      <w:r>
+        <w:rPr>
+          <w:rFonts w:hint="eastAsia"/>
+          <w:lang w:eastAsia="ko-KR"/>
+        </w:rPr>
+        <w:t>8</w:t>
+      </w:r>
+      <w:r>
+        <w:t xml:space="preserve">). </w:t>
+      </w:r>
+      <w:r>
+        <w:t>Collaborative Research: RITEL: Preparing First Responders for Future Robotic Technologies through Distributed and Embodied Virtual Learning Environment</w:t>
+      </w:r>
+      <w:r>
         <w:t xml:space="preserve">. </w:t>
       </w:r>
       <w:r>
-        <w:rPr>
-          <w:lang w:eastAsia="ko-KR"/>
-        </w:rPr>
-        <w:t>Total</w:t>
-      </w:r>
-      <w:r>
-        <w:rPr>
-          <w:rFonts w:hint="eastAsia"/>
-          <w:lang w:eastAsia="ko-KR"/>
-        </w:rPr>
-        <w:t xml:space="preserve"> award $95</w:t>
-      </w:r>
-      <w:r>
-        <w:rPr>
-          <w:rFonts w:hint="eastAsia"/>
-          <w:lang w:eastAsia="ko-KR"/>
-        </w:rPr>
-        <w:t>,</w:t>
-      </w:r>
-      <w:r>
-        <w:rPr>
-          <w:rFonts w:hint="eastAsia"/>
-          <w:lang w:eastAsia="ko-KR"/>
-        </w:rPr>
-        <w:t xml:space="preserve">000, </w:t>
-      </w:r>
-      <w:r>
-        <w:rPr>
-          <w:rFonts w:hint="eastAsia"/>
-          <w:lang w:eastAsia="ko-KR"/>
-        </w:rPr>
-        <w:t xml:space="preserve">Unity Humanity Grant, </w:t>
+        <w:t>National Science Foundation</w:t>
+      </w:r>
+      <w:r>
+        <w:t>, Total award $</w:t>
+      </w:r>
+      <w:r>
+        <w:t>2</w:t>
+      </w:r>
+      <w:r>
+        <w:rPr>
+          <w:rFonts w:hint="eastAsia"/>
+          <w:lang w:eastAsia="ko-KR"/>
+        </w:rPr>
+        <w:t>2</w:t>
+      </w:r>
+      <w:r>
+        <w:t>0,000</w:t>
+      </w:r>
+      <w:r>
+        <w:t xml:space="preserve">, </w:t>
       </w:r>
       <w:r>
         <w:rPr>
@@ -6595,98 +6568,87 @@
           <w:between w:val="nil"/>
         </w:pBdr>
         <w:ind w:left="720" w:hanging="720"/>
-      </w:pPr>
-      <w:r>
-        <w:t xml:space="preserve">Liu, J. (Lead PI), Dalal, R. (PI), Myers, L. (PI), </w:t>
-      </w:r>
-      <w:r>
-        <w:rPr>
-          <w:b/>
-          <w:bCs/>
-        </w:rPr>
-        <w:t>Moon, J.</w:t>
-      </w:r>
-      <w:r>
-        <w:rPr>
-          <w:b/>
-          <w:bCs/>
-        </w:rPr>
-        <w:t xml:space="preserve"> (PI)</w:t>
-      </w:r>
-      <w:r>
-        <w:rPr>
-          <w:b/>
-          <w:bCs/>
-        </w:rPr>
-        <w:t xml:space="preserve">, </w:t>
-      </w:r>
-      <w:r>
-        <w:t>Shi, Y. (PI), Wang, H. (PI), Ni, S. (PI), Trouvé, A. (PI), Stoliarov, S. (PI). Co-DEMP</w:t>
-      </w:r>
-      <w:r>
-        <w:t xml:space="preserve">: </w:t>
-      </w:r>
-      <w:r>
-        <w:rPr>
-          <w:u w:val="single"/>
-        </w:rPr>
-        <w:t>Co</w:t>
-      </w:r>
-      <w:r>
-        <w:t>-</w:t>
-      </w:r>
-      <w:r>
-        <w:rPr>
-          <w:u w:val="single"/>
-        </w:rPr>
-        <w:t>De</w:t>
-      </w:r>
-      <w:r>
-        <w:t xml:space="preserve">signed </w:t>
-      </w:r>
-      <w:r>
-        <w:rPr>
-          <w:u w:val="single"/>
-        </w:rPr>
-        <w:t>M</w:t>
-      </w:r>
-      <w:r>
-        <w:t>ulti-</w:t>
-      </w:r>
-      <w:r>
-        <w:rPr>
-          <w:u w:val="single"/>
-        </w:rPr>
-        <w:t>P</w:t>
-      </w:r>
-      <w:r>
-        <w:t>hase Training for Electric Vehicle Emergency Responses. Department of Energy</w:t>
-      </w:r>
-      <w:r>
-        <w:t>, U.S. Government.</w:t>
-      </w:r>
-      <w:r>
-        <w:t xml:space="preserve"> </w:t>
-      </w:r>
-      <w:r>
-        <w:rPr>
-          <w:rFonts w:hint="eastAsia"/>
-          <w:lang w:eastAsia="ko-KR"/>
-        </w:rPr>
-        <w:t xml:space="preserve"> </w:t>
-      </w:r>
-      <w:r>
-        <w:t xml:space="preserve">Total award </w:t>
-      </w:r>
-      <w:r>
-        <w:t>$2,500,000</w:t>
-      </w:r>
-      <w:r>
-        <w:rPr>
-          <w:rFonts w:hint="eastAsia"/>
-          <w:lang w:eastAsia="ko-KR"/>
-        </w:rPr>
-        <w:t xml:space="preserve">, </w:t>
+        <w:rPr>
+          <w:b/>
+          <w:bCs/>
+          <w:lang w:eastAsia="ko-KR"/>
+        </w:rPr>
+      </w:pPr>
+      <w:r>
+        <w:rPr>
+          <w:rFonts w:hint="eastAsia"/>
+          <w:b/>
+          <w:bCs/>
+          <w:lang w:eastAsia="ko-KR"/>
+        </w:rPr>
+        <w:t xml:space="preserve">Moon, J. (Lead PI) </w:t>
+      </w:r>
+      <w:r>
+        <w:rPr>
+          <w:rFonts w:hint="eastAsia"/>
+          <w:lang w:eastAsia="ko-KR"/>
+        </w:rPr>
+        <w:t xml:space="preserve">(May 2025 </w:t>
+      </w:r>
+      <w:r>
+        <w:rPr>
+          <w:lang w:eastAsia="ko-KR"/>
+        </w:rPr>
+        <w:t>–</w:t>
+      </w:r>
+      <w:r>
+        <w:rPr>
+          <w:rFonts w:hint="eastAsia"/>
+          <w:lang w:eastAsia="ko-KR"/>
+        </w:rPr>
+        <w:t xml:space="preserve"> May 2027). </w:t>
+      </w:r>
+      <w:r>
+        <w:rPr>
+          <w:lang w:eastAsia="ko-KR"/>
+        </w:rPr>
+        <w:t>Transforming Rural Teacher Preparation: An AI-Powered 3D Simulation for Real-World Classroom Problem-Solving</w:t>
+      </w:r>
+      <w:r>
+        <w:rPr>
+          <w:rFonts w:hint="eastAsia"/>
+          <w:lang w:eastAsia="ko-KR"/>
+        </w:rPr>
+        <w:t xml:space="preserve">. </w:t>
+      </w:r>
+      <w:r>
+        <w:rPr>
+          <w:lang w:eastAsia="ko-KR"/>
+        </w:rPr>
+        <w:t>Total</w:t>
+      </w:r>
+      <w:r>
+        <w:rPr>
+          <w:rFonts w:hint="eastAsia"/>
+          <w:lang w:eastAsia="ko-KR"/>
+        </w:rPr>
+        <w:t xml:space="preserve"> award $95</w:t>
+      </w:r>
+      <w:r>
+        <w:rPr>
+          <w:rFonts w:hint="eastAsia"/>
+          <w:lang w:eastAsia="ko-KR"/>
+        </w:rPr>
+        <w:t>,</w:t>
+      </w:r>
+      <w:r>
+        <w:rPr>
+          <w:rFonts w:hint="eastAsia"/>
+          <w:lang w:eastAsia="ko-KR"/>
+        </w:rPr>
+        <w:t xml:space="preserve">000, </w:t>
+      </w:r>
+      <w:r>
+        <w:rPr>
+          <w:rFonts w:hint="eastAsia"/>
+          <w:lang w:eastAsia="ko-KR"/>
+        </w:rPr>
+        <w:t xml:space="preserve">Unity Humanity Grant, </w:t>
       </w:r>
       <w:r>
         <w:rPr>
@@ -6707,199 +6669,106 @@
           <w:between w:val="nil"/>
         </w:pBdr>
         <w:ind w:left="720" w:hanging="720"/>
-        <w:rPr>
-          <w:b/>
-          <w:bCs/>
-        </w:rPr>
-      </w:pPr>
-      <w:r>
-        <w:t>McNeill, L. (Lead PI),</w:t>
-      </w:r>
-      <w:r>
-        <w:rPr>
-          <w:b/>
-          <w:bCs/>
-        </w:rPr>
-        <w:t xml:space="preserve"> Moon, J</w:t>
-      </w:r>
-      <w:r>
-        <w:t xml:space="preserve">. </w:t>
-      </w:r>
-      <w:r>
-        <w:rPr>
-          <w:b/>
-          <w:bCs/>
-        </w:rPr>
-        <w:t>(PI)</w:t>
-      </w:r>
-      <w:r>
-        <w:t xml:space="preserve">, Edmonds, C. (PI) (July 2024 – June 2027). </w:t>
-      </w:r>
-      <w:r>
-        <w:rPr>
-          <w:i/>
-          <w:iCs/>
-        </w:rPr>
-        <w:t>HOPE: Harnessing Opportunities for Promoting Heterophily and Engagement in Business Education through Gamification</w:t>
-      </w:r>
-      <w:r>
-        <w:t xml:space="preserve">. Spencer Foundation, Total award $500,000, </w:t>
-      </w:r>
-      <w:r>
-        <w:rPr>
-          <w:b/>
-          <w:bCs/>
+      </w:pPr>
+      <w:r>
+        <w:t xml:space="preserve">Liu, J. (Lead PI), Dalal, R. (PI), Myers, L. (PI), </w:t>
+      </w:r>
+      <w:r>
+        <w:rPr>
+          <w:b/>
+          <w:bCs/>
+        </w:rPr>
+        <w:t>Moon, J.</w:t>
+      </w:r>
+      <w:r>
+        <w:rPr>
+          <w:b/>
+          <w:bCs/>
+        </w:rPr>
+        <w:t xml:space="preserve"> (PI)</w:t>
+      </w:r>
+      <w:r>
+        <w:rPr>
+          <w:b/>
+          <w:bCs/>
+        </w:rPr>
+        <w:t xml:space="preserve">, </w:t>
+      </w:r>
+      <w:r>
+        <w:t>Shi, Y. (PI), Wang, H. (PI), Ni, S. (PI), Trouvé, A. (PI), Stoliarov, S. (PI). Co-DEMP</w:t>
+      </w:r>
+      <w:r>
+        <w:t xml:space="preserve">: </w:t>
+      </w:r>
+      <w:r>
+        <w:rPr>
           <w:u w:val="single"/>
         </w:rPr>
+        <w:t>Co</w:t>
+      </w:r>
+      <w:r>
+        <w:t>-</w:t>
+      </w:r>
+      <w:r>
+        <w:rPr>
+          <w:u w:val="single"/>
+        </w:rPr>
+        <w:t>De</w:t>
+      </w:r>
+      <w:r>
+        <w:t xml:space="preserve">signed </w:t>
+      </w:r>
+      <w:r>
+        <w:rPr>
+          <w:u w:val="single"/>
+        </w:rPr>
+        <w:t>M</w:t>
+      </w:r>
+      <w:r>
+        <w:t>ulti-</w:t>
+      </w:r>
+      <w:r>
+        <w:rPr>
+          <w:u w:val="single"/>
+        </w:rPr>
+        <w:t>P</w:t>
+      </w:r>
+      <w:r>
+        <w:t>hase Training for Electric Vehicle Emergency Responses. Department of Energy</w:t>
+      </w:r>
+      <w:r>
+        <w:t>, U.S. Government.</w:t>
+      </w:r>
+      <w:r>
+        <w:t xml:space="preserve"> </w:t>
+      </w:r>
+      <w:r>
+        <w:rPr>
+          <w:rFonts w:hint="eastAsia"/>
+          <w:lang w:eastAsia="ko-KR"/>
+        </w:rPr>
+        <w:t xml:space="preserve"> </w:t>
+      </w:r>
+      <w:r>
+        <w:t xml:space="preserve">Total award </w:t>
+      </w:r>
+      <w:r>
+        <w:t>$2,500,000</w:t>
+      </w:r>
+      <w:r>
+        <w:rPr>
+          <w:rFonts w:hint="eastAsia"/>
+          <w:lang w:eastAsia="ko-KR"/>
+        </w:rPr>
+        <w:t xml:space="preserve">, </w:t>
+      </w:r>
+      <w:r>
+        <w:rPr>
+          <w:b/>
+          <w:bCs/>
+          <w:u w:val="single"/>
+        </w:rPr>
         <w:t>NOT FUNDED</w:t>
-      </w:r>
-    </w:p>
-    <w:p>
-      <w:pPr>
-        <w:keepNext/>
-        <w:widowControl/>
-        <w:ind w:left="720" w:hanging="720"/>
-        <w:rPr>
-          <w:b/>
-          <w:bCs/>
-          <w:u w:val="single"/>
-        </w:rPr>
-      </w:pPr>
-      <w:r>
-        <w:rPr>
-          <w:b/>
-          <w:bCs/>
-        </w:rPr>
-        <w:t>Moon, J</w:t>
-      </w:r>
-      <w:r>
-        <w:t xml:space="preserve">. </w:t>
-      </w:r>
-      <w:r>
-        <w:rPr>
-          <w:b/>
-          <w:bCs/>
-        </w:rPr>
-        <w:t xml:space="preserve">(Lead PI) </w:t>
-      </w:r>
-      <w:r>
-        <w:t xml:space="preserve">&amp; Suh, J. (PI) (Sep 2022 – Aug 2024). </w:t>
-      </w:r>
-      <w:r>
-        <w:rPr>
-          <w:i/>
-          <w:iCs/>
-        </w:rPr>
-        <w:t>Developing a Teaching Analytic System for Middle School Science Teachers</w:t>
-      </w:r>
-      <w:r>
-        <w:t xml:space="preserve">. ORED Internal Funding, Total award $12,000, </w:t>
-      </w:r>
-      <w:r>
-        <w:rPr>
-          <w:b/>
-          <w:bCs/>
-          <w:u w:val="single"/>
-        </w:rPr>
-        <w:t>NOT FUNDED</w:t>
-      </w:r>
-    </w:p>
-    <w:p>
-      <w:pPr>
-        <w:keepNext/>
-        <w:widowControl/>
-        <w:ind w:left="720" w:hanging="720"/>
-        <w:rPr>
-          <w:b/>
-          <w:bCs/>
-          <w:u w:val="single"/>
-        </w:rPr>
-      </w:pPr>
-      <w:r>
-        <w:rPr>
-          <w:b/>
-          <w:bCs/>
-        </w:rPr>
-        <w:t>Moon, J</w:t>
-      </w:r>
-      <w:r>
-        <w:t xml:space="preserve">. </w:t>
-      </w:r>
-      <w:r>
-        <w:rPr>
-          <w:b/>
-          <w:bCs/>
-        </w:rPr>
-        <w:t>(Lead PI</w:t>
-      </w:r>
-      <w:r>
-        <w:rPr>
-          <w:b/>
-          <w:bCs/>
-        </w:rPr>
-        <w:t xml:space="preserve">) </w:t>
-      </w:r>
-      <w:r>
-        <w:t>&amp;</w:t>
-      </w:r>
-      <w:r>
-        <w:t xml:space="preserve"> </w:t>
-      </w:r>
-      <w:r>
-        <w:t xml:space="preserve">Shi, Y. </w:t>
-      </w:r>
-      <w:r>
-        <w:t>(PI</w:t>
-      </w:r>
-      <w:r>
-        <w:t>)</w:t>
-      </w:r>
-      <w:r>
-        <w:t xml:space="preserve"> (Jan 2022 – Dec 202</w:t>
-      </w:r>
-      <w:r>
-        <w:t>5</w:t>
-      </w:r>
-      <w:r>
-        <w:t xml:space="preserve">). </w:t>
-      </w:r>
-      <w:r>
-        <w:rPr>
-          <w:i/>
-          <w:iCs/>
-        </w:rPr>
-        <w:t>Design and Development of Adaptive Game-based Training to Enhance Computational Thinking of Rural Adolescents with Autism via Minecraft Gameplay</w:t>
-      </w:r>
-      <w:r>
-        <w:t xml:space="preserve">. </w:t>
-      </w:r>
-      <w:r>
-        <w:t>National Science Foundation</w:t>
-      </w:r>
-      <w:r>
-        <w:t>, Total award $</w:t>
-      </w:r>
-      <w:r>
-        <w:t>298,279</w:t>
-      </w:r>
-      <w:r>
-        <w:t xml:space="preserve">, </w:t>
-      </w:r>
-      <w:r>
-        <w:rPr>
-          <w:b/>
-          <w:bCs/>
-          <w:u w:val="single"/>
-        </w:rPr>
-        <w:t xml:space="preserve">NOT </w:t>
-      </w:r>
-      <w:r>
-        <w:rPr>
-          <w:b/>
-          <w:bCs/>
-          <w:u w:val="single"/>
-        </w:rPr>
-        <w:t>FUNDED</w:t>
       </w:r>
     </w:p>
     <w:p>
@@ -6913,6 +6782,219 @@
         </w:pBdr>
         <w:ind w:left="720" w:hanging="720"/>
         <w:rPr>
+          <w:b/>
+          <w:bCs/>
+        </w:rPr>
+      </w:pPr>
+      <w:r>
+        <w:t>McNeill, L. (Lead PI),</w:t>
+      </w:r>
+      <w:r>
+        <w:rPr>
+          <w:b/>
+          <w:bCs/>
+        </w:rPr>
+        <w:t xml:space="preserve"> Moon, J</w:t>
+      </w:r>
+      <w:r>
+        <w:t xml:space="preserve">. </w:t>
+      </w:r>
+      <w:r>
+        <w:rPr>
+          <w:b/>
+          <w:bCs/>
+        </w:rPr>
+        <w:t>(PI)</w:t>
+      </w:r>
+      <w:r>
+        <w:t xml:space="preserve">, Edmonds, C. (PI) (July 2024 – June 2027). </w:t>
+      </w:r>
+      <w:r>
+        <w:rPr>
+          <w:i/>
+          <w:iCs/>
+        </w:rPr>
+        <w:t>HOPE: Harnessing Opportunities for Promoting Heterophily and Engagement in Business Education through Gamification</w:t>
+      </w:r>
+      <w:r>
+        <w:t xml:space="preserve">. Spencer Foundation, Total award $500,000, </w:t>
+      </w:r>
+      <w:r>
+        <w:rPr>
+          <w:b/>
+          <w:bCs/>
+          <w:u w:val="single"/>
+        </w:rPr>
+        <w:t>NOT FUNDED</w:t>
+      </w:r>
+    </w:p>
+    <w:p>
+      <w:pPr>
+        <w:keepNext/>
+        <w:widowControl/>
+        <w:ind w:left="720" w:hanging="720"/>
+        <w:rPr>
+          <w:b/>
+          <w:bCs/>
+          <w:u w:val="single"/>
+        </w:rPr>
+      </w:pPr>
+      <w:r>
+        <w:rPr>
+          <w:b/>
+          <w:bCs/>
+        </w:rPr>
+        <w:t>Moon, J</w:t>
+      </w:r>
+      <w:r>
+        <w:t xml:space="preserve">. </w:t>
+      </w:r>
+      <w:r>
+        <w:rPr>
+          <w:b/>
+          <w:bCs/>
+        </w:rPr>
+        <w:t xml:space="preserve">(Lead PI) </w:t>
+      </w:r>
+      <w:r>
+        <w:t xml:space="preserve">&amp; Suh, J. (PI) (Sep 2022 – Aug 2024). </w:t>
+      </w:r>
+      <w:r>
+        <w:rPr>
+          <w:i/>
+          <w:iCs/>
+        </w:rPr>
+        <w:t>Developing a Teaching Analytic System for Middle School Science Teachers</w:t>
+      </w:r>
+      <w:r>
+        <w:t xml:space="preserve">. ORED Internal Funding, Total award $12,000, </w:t>
+      </w:r>
+      <w:r>
+        <w:rPr>
+          <w:b/>
+          <w:bCs/>
+          <w:u w:val="single"/>
+        </w:rPr>
+        <w:t>NOT FUNDED</w:t>
+      </w:r>
+    </w:p>
+    <w:p>
+      <w:pPr>
+        <w:keepNext/>
+        <w:widowControl/>
+        <w:ind w:left="720" w:hanging="720"/>
+        <w:rPr>
+          <w:b/>
+          <w:bCs/>
+          <w:u w:val="single"/>
+        </w:rPr>
+      </w:pPr>
+      <w:r>
+        <w:rPr>
+          <w:b/>
+          <w:bCs/>
+        </w:rPr>
+        <w:t>Moon, J</w:t>
+      </w:r>
+      <w:r>
+        <w:t xml:space="preserve">. </w:t>
+      </w:r>
+      <w:r>
+        <w:rPr>
+          <w:b/>
+          <w:bCs/>
+        </w:rPr>
+        <w:t>(Lead PI</w:t>
+      </w:r>
+      <w:r>
+        <w:rPr>
+          <w:b/>
+          <w:bCs/>
+        </w:rPr>
+        <w:t xml:space="preserve">) </w:t>
+      </w:r>
+      <w:r>
+        <w:t>&amp;</w:t>
+      </w:r>
+      <w:r>
+        <w:t xml:space="preserve"> </w:t>
+      </w:r>
+      <w:r>
+        <w:t xml:space="preserve">Shi, Y. </w:t>
+      </w:r>
+      <w:r>
+        <w:t>(PI</w:t>
+      </w:r>
+      <w:r>
+        <w:t>)</w:t>
+      </w:r>
+      <w:r>
+        <w:t xml:space="preserve"> (Jan 2022 – Dec 202</w:t>
+      </w:r>
+      <w:r>
+        <w:t>5</w:t>
+      </w:r>
+      <w:r>
+        <w:t xml:space="preserve">). </w:t>
+      </w:r>
+      <w:r>
+        <w:rPr>
+          <w:i/>
+          <w:iCs/>
+        </w:rPr>
+        <w:t xml:space="preserve">Design and Development of Adaptive Game-based Training to Enhance Computational Thinking of Rural Adolescents with </w:t>
+      </w:r>
+      <w:r>
+        <w:rPr>
+          <w:i/>
+          <w:iCs/>
+        </w:rPr>
+        <w:lastRenderedPageBreak/>
+        <w:t>Autism via Minecraft Gameplay</w:t>
+      </w:r>
+      <w:r>
+        <w:t xml:space="preserve">. </w:t>
+      </w:r>
+      <w:r>
+        <w:t>National Science Foundation</w:t>
+      </w:r>
+      <w:r>
+        <w:t>, Total award $</w:t>
+      </w:r>
+      <w:r>
+        <w:t>298,279</w:t>
+      </w:r>
+      <w:r>
+        <w:t xml:space="preserve">, </w:t>
+      </w:r>
+      <w:r>
+        <w:rPr>
+          <w:b/>
+          <w:bCs/>
+          <w:u w:val="single"/>
+        </w:rPr>
+        <w:t xml:space="preserve">NOT </w:t>
+      </w:r>
+      <w:r>
+        <w:rPr>
+          <w:b/>
+          <w:bCs/>
+          <w:u w:val="single"/>
+        </w:rPr>
+        <w:t>FUNDED</w:t>
+      </w:r>
+    </w:p>
+    <w:p>
+      <w:pPr>
+        <w:pBdr>
+          <w:top w:val="nil"/>
+          <w:left w:val="nil"/>
+          <w:bottom w:val="nil"/>
+          <w:right w:val="nil"/>
+          <w:between w:val="nil"/>
+        </w:pBdr>
+        <w:ind w:left="720" w:hanging="720"/>
+        <w:rPr>
           <w:lang w:eastAsia="ko-KR"/>
         </w:rPr>
       </w:pPr>
@@ -7022,15 +7104,7 @@
           <w:rFonts w:hint="eastAsia"/>
           <w:lang w:eastAsia="ko-KR"/>
         </w:rPr>
-        <w:t xml:space="preserve"> award </w:t>
-      </w:r>
-      <w:r>
-        <w:rPr>
-          <w:rFonts w:hint="eastAsia"/>
-          <w:lang w:eastAsia="ko-KR"/>
-        </w:rPr>
-        <w:lastRenderedPageBreak/>
-        <w:t>$</w:t>
+        <w:t xml:space="preserve"> award $</w:t>
       </w:r>
       <w:r>
         <w:rPr>
@@ -7716,21 +7790,7 @@
           <w:rFonts w:hint="eastAsia"/>
           <w:lang w:eastAsia="ko-KR"/>
         </w:rPr>
-        <w:t>[</w:t>
-      </w:r>
-      <w:r>
-        <w:rPr>
-          <w:rFonts w:hint="eastAsia"/>
-          <w:lang w:eastAsia="ko-KR"/>
-        </w:rPr>
-        <w:t>6</w:t>
-      </w:r>
-      <w:r>
-        <w:rPr>
-          <w:rFonts w:hint="eastAsia"/>
-          <w:lang w:eastAsia="ko-KR"/>
-        </w:rPr>
-        <w:t xml:space="preserve">2] </w:t>
+        <w:t xml:space="preserve">[62] </w:t>
       </w:r>
       <w:r>
         <w:t xml:space="preserve">‡ </w:t>
@@ -7792,61 +7852,6 @@
           <w:lang w:eastAsia="ko-KR"/>
         </w:rPr>
         <w:t>Design affordance diagnostic framework: Screening construct-irrelevant variance in computational thinking assessment</w:t>
-      </w:r>
-      <w:r>
-        <w:rPr>
-          <w:rFonts w:hint="eastAsia"/>
-          <w:lang w:eastAsia="ko-KR"/>
-        </w:rPr>
-      </w:r>
-      <w:r>
-        <w:rPr>
-          <w:lang w:eastAsia="ko-KR"/>
-        </w:rPr>
-      </w:r>
-      <w:r>
-        <w:rPr>
-          <w:rFonts w:hint="eastAsia"/>
-          <w:lang w:eastAsia="ko-KR"/>
-        </w:rPr>
-      </w:r>
-      <w:r>
-        <w:rPr>
-          <w:lang w:eastAsia="ko-KR"/>
-        </w:rPr>
-      </w:r>
-      <w:r>
-        <w:rPr>
-          <w:rFonts w:hint="eastAsia"/>
-          <w:lang w:eastAsia="ko-KR"/>
-        </w:rPr>
-      </w:r>
-      <w:r>
-        <w:rPr>
-          <w:lang w:eastAsia="ko-KR"/>
-        </w:rPr>
-      </w:r>
-      <w:r>
-        <w:rPr>
-          <w:rFonts w:hint="eastAsia"/>
-          <w:lang w:eastAsia="ko-KR"/>
-        </w:rPr>
-      </w:r>
-      <w:r>
-        <w:rPr>
-          <w:lang w:eastAsia="ko-KR"/>
-        </w:rPr>
-      </w:r>
-      <w:r>
-        <w:rPr>
-          <w:rFonts w:hint="eastAsia"/>
-          <w:lang w:eastAsia="ko-KR"/>
-        </w:rPr>
-      </w:r>
-      <w:r>
-        <w:rPr>
-          <w:lang w:eastAsia="ko-KR"/>
-        </w:rPr>
       </w:r>
       <w:r>
         <w:rPr>
@@ -8426,105 +8431,6 @@
           <w:lang w:eastAsia="ko-KR"/>
         </w:rPr>
         <w:t>Challenges, safeguards, and professional learning needs for AI integration: insights from a two-week AI literacy module with preservice teachers</w:t>
-      </w:r>
-      <w:r>
-        <w:rPr>
-          <w:rFonts w:hint="eastAsia"/>
-          <w:lang w:eastAsia="ko-KR"/>
-        </w:rPr>
-      </w:r>
-      <w:r>
-        <w:rPr>
-          <w:lang w:eastAsia="ko-KR"/>
-        </w:rPr>
-      </w:r>
-      <w:r>
-        <w:rPr>
-          <w:rFonts w:hint="eastAsia"/>
-          <w:lang w:eastAsia="ko-KR"/>
-        </w:rPr>
-      </w:r>
-      <w:r>
-        <w:rPr>
-          <w:lang w:eastAsia="ko-KR"/>
-        </w:rPr>
-      </w:r>
-      <w:r>
-        <w:rPr>
-          <w:rFonts w:hint="eastAsia"/>
-          <w:lang w:eastAsia="ko-KR"/>
-        </w:rPr>
-      </w:r>
-      <w:r>
-        <w:rPr>
-          <w:lang w:eastAsia="ko-KR"/>
-        </w:rPr>
-      </w:r>
-      <w:r>
-        <w:rPr>
-          <w:rFonts w:hint="eastAsia"/>
-          <w:lang w:eastAsia="ko-KR"/>
-        </w:rPr>
-      </w:r>
-      <w:r>
-        <w:rPr>
-          <w:lang w:eastAsia="ko-KR"/>
-        </w:rPr>
-      </w:r>
-      <w:r>
-        <w:rPr>
-          <w:rFonts w:hint="eastAsia"/>
-          <w:lang w:eastAsia="ko-KR"/>
-        </w:rPr>
-      </w:r>
-      <w:r>
-        <w:rPr>
-          <w:lang w:eastAsia="ko-KR"/>
-        </w:rPr>
-      </w:r>
-      <w:r>
-        <w:rPr>
-          <w:rFonts w:hint="eastAsia"/>
-          <w:lang w:eastAsia="ko-KR"/>
-        </w:rPr>
-      </w:r>
-      <w:r>
-        <w:rPr>
-          <w:lang w:eastAsia="ko-KR"/>
-        </w:rPr>
-      </w:r>
-      <w:r>
-        <w:rPr>
-          <w:rFonts w:hint="eastAsia"/>
-          <w:lang w:eastAsia="ko-KR"/>
-        </w:rPr>
-      </w:r>
-      <w:r>
-        <w:rPr>
-          <w:lang w:eastAsia="ko-KR"/>
-        </w:rPr>
-      </w:r>
-      <w:r>
-        <w:rPr>
-          <w:rFonts w:hint="eastAsia"/>
-          <w:lang w:eastAsia="ko-KR"/>
-        </w:rPr>
-      </w:r>
-      <w:r>
-        <w:rPr>
-          <w:lang w:eastAsia="ko-KR"/>
-        </w:rPr>
-      </w:r>
-      <w:r>
-        <w:rPr>
-          <w:rFonts w:hint="eastAsia"/>
-          <w:lang w:eastAsia="ko-KR"/>
-        </w:rPr>
-      </w:r>
-      <w:r>
-        <w:rPr>
-          <w:lang w:eastAsia="ko-KR"/>
-        </w:rPr>
       </w:r>
       <w:r>
         <w:rPr>
@@ -9659,6 +9565,7 @@
           <w:i/>
           <w:iCs/>
         </w:rPr>
+        <w:lastRenderedPageBreak/>
         <w:t>[</w:t>
       </w:r>
       <w:r>
@@ -9885,14 +9792,7 @@
         <w:rPr>
           <w:lang w:eastAsia="ko-KR"/>
         </w:rPr>
-        <w:t xml:space="preserve">Validity of Eye-Tracking Measures in Immersive Virtual Reality: Using Cognitive </w:t>
-      </w:r>
-      <w:r>
-        <w:rPr>
-          <w:lang w:eastAsia="ko-KR"/>
-        </w:rPr>
-        <w:lastRenderedPageBreak/>
-        <w:t>Theories of Learning</w:t>
+        <w:t>Validity of Eye-Tracking Measures in Immersive Virtual Reality: Using Cognitive Theories of Learning</w:t>
       </w:r>
       <w:r>
         <w:rPr>
@@ -12830,7 +12730,18 @@
           <w:iCs/>
           <w:lang w:eastAsia="ko-KR"/>
         </w:rPr>
-        <w:t>Education Science</w:t>
+        <w:t xml:space="preserve">Education </w:t>
+      </w:r>
+      <w:r>
+        <w:rPr>
+          <w:rFonts w:hint="eastAsia"/>
+          <w:bCs/>
+          <w:i/>
+          <w:iCs/>
+          <w:lang w:eastAsia="ko-KR"/>
+        </w:rPr>
+        <w:lastRenderedPageBreak/>
+        <w:t>Science</w:t>
       </w:r>
       <w:r>
         <w:rPr>
@@ -13307,18 +13218,7 @@
           <w:iCs/>
           <w:lang w:eastAsia="ko-KR"/>
         </w:rPr>
-        <w:t xml:space="preserve"> </w:t>
-      </w:r>
-      <w:r>
-        <w:rPr>
-          <w:rFonts w:hint="eastAsia"/>
-          <w:bCs/>
-          <w:i/>
-          <w:iCs/>
-          <w:lang w:eastAsia="ko-KR"/>
-        </w:rPr>
-        <w:lastRenderedPageBreak/>
-        <w:t>in Education and Teaching International</w:t>
+        <w:t xml:space="preserve"> in Education and Teaching International</w:t>
       </w:r>
       <w:r>
         <w:rPr>
@@ -15971,7 +15871,14 @@
         <w:rPr>
           <w:bCs/>
         </w:rPr>
-        <w:t xml:space="preserve">). Using multimodal learning analytics as a formative assessment tool: Exploring collaborative dynamics in mathematics teacher education. </w:t>
+        <w:t xml:space="preserve">). Using multimodal learning analytics as a formative assessment tool: Exploring collaborative dynamics in </w:t>
+      </w:r>
+      <w:r>
+        <w:rPr>
+          <w:bCs/>
+        </w:rPr>
+        <w:lastRenderedPageBreak/>
+        <w:t xml:space="preserve">mathematics teacher education. </w:t>
       </w:r>
       <w:r>
         <w:rPr>
@@ -18085,7 +17992,11 @@
         <w:t>2023</w:t>
       </w:r>
       <w:r>
-        <w:t xml:space="preserve">). Learner experience design and unpacking sociocultural, technological, and pedagogical design considerations of spherical video-based virtual reality systems for autistic learners: A systematic literature review. </w:t>
+        <w:t xml:space="preserve">). Learner experience design and unpacking sociocultural, technological, and pedagogical design </w:t>
+      </w:r>
+      <w:r>
+        <w:lastRenderedPageBreak/>
+        <w:t xml:space="preserve">considerations of spherical video-based virtual reality systems for autistic learners: A systematic literature review. </w:t>
       </w:r>
       <w:r>
         <w:rPr>
@@ -18271,11 +18182,7 @@
         <w:t>2023</w:t>
       </w:r>
       <w:r>
-        <w:t xml:space="preserve">). Few-shot is </w:t>
-      </w:r>
-      <w:r>
-        <w:lastRenderedPageBreak/>
-        <w:t xml:space="preserve">enough: Exploring ChatGPT prompt engineering method for automatic question generation in English education. </w:t>
+        <w:t xml:space="preserve">). Few-shot is enough: Exploring ChatGPT prompt engineering method for automatic question generation in English education. </w:t>
       </w:r>
       <w:r>
         <w:rPr>
@@ -20567,14 +20474,7 @@
         <w:rPr>
           <w:i/>
         </w:rPr>
-        <w:t xml:space="preserve">The International Review of Research in Open </w:t>
-      </w:r>
-      <w:r>
-        <w:rPr>
-          <w:i/>
-        </w:rPr>
-        <w:lastRenderedPageBreak/>
-        <w:t>and Distributed Learning</w:t>
+        <w:t>The International Review of Research in Open and Distributed Learning</w:t>
       </w:r>
       <w:r>
         <w:rPr>
@@ -22833,6 +22733,7 @@
           <w:szCs w:val="26"/>
           <w:u w:val="single"/>
         </w:rPr>
+        <w:lastRenderedPageBreak/>
         <w:t>Korean</w:t>
       </w:r>
       <w:r>
@@ -22954,7 +22855,6 @@
         </w:rPr>
       </w:pPr>
       <w:r>
-        <w:lastRenderedPageBreak/>
         <w:t xml:space="preserve">[2] </w:t>
       </w:r>
       <w:r>
@@ -23206,7 +23106,7 @@
           <w:szCs w:val="28"/>
           <w:lang w:eastAsia="ko-KR"/>
         </w:rPr>
-        <w:t>9</w:t>
+        <w:t>10</w:t>
       </w:r>
       <w:r>
         <w:rPr>
@@ -23260,7 +23160,7 @@
           <w:u w:val="single"/>
           <w:lang w:eastAsia="ko-KR"/>
         </w:rPr>
-        <w:t>9</w:t>
+        <w:t>10</w:t>
       </w:r>
       <w:r>
         <w:rPr>
@@ -23271,6 +23171,53 @@
           <w:u w:val="single"/>
         </w:rPr>
         <w:t>)</w:t>
+      </w:r>
+    </w:p>
+    <w:p>
+      <w:pPr>
+        <w:ind w:left="720" w:hanging="720"/>
+        <w:rPr>
+          <w:bCs/>
+          <w:lang w:eastAsia="ko-KR"/>
+        </w:rPr>
+      </w:pPr>
+      <w:r>
+        <w:rPr>
+          <w:bCs/>
+          <w:lang w:eastAsia="ko-KR"/>
+        </w:rPr>
+        <w:t>Kim, T., &amp; Moon, J. (</w:t>
+      </w:r>
+      <w:r>
+        <w:rPr>
+          <w:rFonts w:hint="eastAsia"/>
+          <w:bCs/>
+          <w:lang w:eastAsia="ko-KR"/>
+        </w:rPr>
+        <w:t>Accepted, 2027</w:t>
+      </w:r>
+      <w:r>
+        <w:rPr>
+          <w:bCs/>
+          <w:lang w:eastAsia="ko-KR"/>
+        </w:rPr>
+        <w:t xml:space="preserve">). Beyond behavioral traces: Modeling epistemic reasoning structures through multimodal serious games analytics in immersive virtual reality. In C. S. Loh, Y. Sheng, &amp; D. Ifenthaler (Eds.), </w:t>
+      </w:r>
+      <w:r>
+        <w:rPr>
+          <w:bCs/>
+          <w:i/>
+          <w:iCs/>
+          <w:lang w:eastAsia="ko-KR"/>
+        </w:rPr>
+        <w:t>Serious games analytics in the age of AI</w:t>
+      </w:r>
+      <w:r>
+        <w:rPr>
+          <w:bCs/>
+          <w:lang w:eastAsia="ko-KR"/>
+        </w:rPr>
+        <w:t>. Springer.</w:t>
       </w:r>
     </w:p>
     <w:p>
@@ -23465,7 +23412,6 @@
       <w:bookmarkStart w:id="5" w:name="_Hlk197519187"/>
       <w:bookmarkEnd w:id="5"/>
       <w:r>
-        <w:rPr/>
         <w:t xml:space="preserve">[7] *‡ Abu, S., Ghooreian, A., Ogunniran, M., Awoyemi, I., &amp; </w:t>
       </w:r>
       <w:r>
@@ -23475,7 +23421,6 @@
         <w:t>Moon, J.</w:t>
       </w:r>
       <w:r>
-        <w:rPr/>
         <w:t xml:space="preserve"> (2026). Game-based learning for social change. In P. P. Trifonas &amp; P. P. Trifonas (Eds.), </w:t>
       </w:r>
       <w:r>
@@ -23485,7 +23430,6 @@
         <w:t>Handbook of theory and research in digital media and education</w:t>
       </w:r>
       <w:r>
-        <w:rPr/>
         <w:t>. Springer. https://doi.org/10.1007/978-3-032-04596-6_29-1</w:t>
       </w:r>
     </w:p>
@@ -23493,12 +23437,11 @@
       <w:pPr>
         <w:ind w:left="720" w:hanging="720"/>
       </w:pPr>
-      <w:bookmarkStart w:id="6" w:name="_Hlk197519199"/>
-      <w:bookmarkStart w:id="7" w:name="_Hlk197519194"/>
+      <w:bookmarkStart w:id="6" w:name="_Hlk197519194"/>
+      <w:bookmarkStart w:id="7" w:name="_Hlk197519199"/>
+      <w:bookmarkEnd w:id="6"/>
       <w:bookmarkEnd w:id="7"/>
-      <w:bookmarkEnd w:id="6"/>
-      <w:r>
-        <w:rPr/>
+      <w:r>
         <w:t xml:space="preserve">[6] * Hong, S., </w:t>
       </w:r>
       <w:r>
@@ -23508,7 +23451,6 @@
         <w:t>Moon, J.</w:t>
       </w:r>
       <w:r>
-        <w:rPr/>
         <w:t xml:space="preserve">, Eom, T., Hwang, J., Lim, J., &amp; Park, S. (2026). Immersive and engaging design for teacher simulation: Theoretical foundations and innovative approaches. In P. P. Trifonas &amp; P. P. Trifonas (Eds.), </w:t>
       </w:r>
       <w:r>
@@ -23518,7 +23460,6 @@
         <w:t>Handbook of theory and research in digital media and education</w:t>
       </w:r>
       <w:r>
-        <w:rPr/>
         <w:t>. Springer. https://doi.org/10.1007/978-3-032-04596-6_22-1</w:t>
       </w:r>
     </w:p>
@@ -23581,7 +23522,17 @@
           <w:iCs/>
           <w:lang w:eastAsia="ko-KR"/>
         </w:rPr>
-        <w:t>Designing online continuing professional development for STEM teacher education (pp. 194–204)</w:t>
+        <w:t xml:space="preserve">Designing </w:t>
+      </w:r>
+      <w:r>
+        <w:rPr>
+          <w:bCs/>
+          <w:i/>
+          <w:iCs/>
+          <w:lang w:eastAsia="ko-KR"/>
+        </w:rPr>
+        <w:lastRenderedPageBreak/>
+        <w:t>online continuing professional development for STEM teacher education (pp. 194–204)</w:t>
       </w:r>
       <w:r>
         <w:rPr>
@@ -23687,15 +23638,7 @@
           <w:i/>
           <w:iCs/>
         </w:rPr>
-        <w:t xml:space="preserve">Open Education Resources in “Belt and </w:t>
-      </w:r>
-      <w:r>
-        <w:rPr>
-          <w:i/>
-          <w:iCs/>
-        </w:rPr>
-        <w:lastRenderedPageBreak/>
-        <w:t>Road” Countries</w:t>
+        <w:t>Open Education Resources in “Belt and Road” Countries</w:t>
       </w:r>
       <w:r>
         <w:t xml:space="preserve">, Lecture Note Series in Educational Technology. Springer, Singapore. </w:t>
@@ -24607,14 +24550,7 @@
         <w:rPr>
           <w:bCs/>
         </w:rPr>
-        <w:t xml:space="preserve">). Using deep learning to track representational flexibility development of students with autism in a nurturing virtual </w:t>
-      </w:r>
-      <w:r>
-        <w:rPr>
-          <w:bCs/>
-        </w:rPr>
-        <w:lastRenderedPageBreak/>
-        <w:t xml:space="preserve">reality environment. </w:t>
+        <w:t xml:space="preserve">). Using deep learning to track representational flexibility development of students with autism in a nurturing virtual reality environment. </w:t>
       </w:r>
       <w:r>
         <w:rPr>
@@ -25067,7 +25003,14 @@
         <w:rPr>
           <w:color w:val="000000"/>
         </w:rPr>
-        <w:t> (pp. 973-976). International Society of the Learning Sciences. London, U</w:t>
+        <w:t xml:space="preserve"> (pp. 973-976). International Society of </w:t>
+      </w:r>
+      <w:r>
+        <w:rPr>
+          <w:color w:val="000000"/>
+        </w:rPr>
+        <w:lastRenderedPageBreak/>
+        <w:t>the Learning Sciences. London, U</w:t>
       </w:r>
       <w:r>
         <w:t>nited Kingdom.</w:t>
@@ -25158,15 +25101,7 @@
           <w:i/>
           <w:color w:val="000000"/>
         </w:rPr>
-        <w:t xml:space="preserve">the 11th </w:t>
-      </w:r>
-      <w:r>
-        <w:rPr>
-          <w:i/>
-          <w:color w:val="000000"/>
-        </w:rPr>
-        <w:lastRenderedPageBreak/>
-        <w:t>International Conference on Educational Data Mining</w:t>
+        <w:t>the 11th International Conference on Educational Data Mining</w:t>
       </w:r>
       <w:r>
         <w:rPr>
@@ -26329,7 +26264,17 @@
           <w:color w:val="222222"/>
           <w:lang w:eastAsia="ko-KR"/>
         </w:rPr>
-        <w:t xml:space="preserve">rts-Integrated AI </w:t>
+        <w:t>rts-</w:t>
+      </w:r>
+      <w:r>
+        <w:rPr>
+          <w:i/>
+          <w:iCs/>
+          <w:color w:val="222222"/>
+          <w:lang w:eastAsia="ko-KR"/>
+        </w:rPr>
+        <w:lastRenderedPageBreak/>
+        <w:t xml:space="preserve">Integrated AI </w:t>
       </w:r>
       <w:r>
         <w:rPr>
@@ -27057,7 +27002,6 @@
           <w:color w:val="222222"/>
           <w:lang w:eastAsia="ko-KR"/>
         </w:rPr>
-        <w:lastRenderedPageBreak/>
         <w:t xml:space="preserve">[61] </w:t>
       </w:r>
       <w:r>
@@ -29670,6 +29614,7 @@
           <w:color w:val="222222"/>
           <w:lang w:eastAsia="ko-KR"/>
         </w:rPr>
+        <w:lastRenderedPageBreak/>
         <w:t>a</w:t>
       </w:r>
       <w:r>
@@ -30187,7 +30132,6 @@
           <w:color w:val="222222"/>
           <w:lang w:eastAsia="ko-KR"/>
         </w:rPr>
-        <w:lastRenderedPageBreak/>
         <w:t>p</w:t>
       </w:r>
       <w:r>
@@ -31643,6 +31587,7 @@
         <w:ind w:left="720" w:hanging="720"/>
       </w:pPr>
       <w:r>
+        <w:lastRenderedPageBreak/>
         <w:t>[3</w:t>
       </w:r>
       <w:r>
@@ -31793,15 +31738,7 @@
           <w:i/>
           <w:iCs/>
         </w:rPr>
-        <w:t xml:space="preserve">Teachers’ integration of immersive virtual reality in enhancing mathematics competence among high school students in an online learning </w:t>
-      </w:r>
-      <w:r>
-        <w:rPr>
-          <w:i/>
-          <w:iCs/>
-        </w:rPr>
-        <w:lastRenderedPageBreak/>
-        <w:t>environment: A narrative review</w:t>
+        <w:t>Teachers’ integration of immersive virtual reality in enhancing mathematics competence among high school students in an online learning environment: A narrative review</w:t>
       </w:r>
       <w:r>
         <w:t xml:space="preserve">. </w:t>
@@ -33100,6 +33037,7 @@
         </w:rPr>
       </w:pPr>
       <w:r>
+        <w:lastRenderedPageBreak/>
         <w:t xml:space="preserve">[19] </w:t>
       </w:r>
       <w:r>
@@ -33655,7 +33593,6 @@
         </w:rPr>
       </w:pPr>
       <w:r>
-        <w:lastRenderedPageBreak/>
         <w:t xml:space="preserve">[16] </w:t>
       </w:r>
       <w:r>
@@ -35621,31 +35558,6 @@
         </w:rPr>
         <w:t>Submitted or Under Review (n = 31)</w:t>
       </w:r>
-      <w:r>
-        <w:rPr>
-          <w:b/>
-          <w:bCs/>
-        </w:rPr>
-        <w:t xml:space="preserve"/>
-      </w:r>
-      <w:r>
-        <w:rPr>
-          <w:rFonts w:hint="eastAsia"/>
-          <w:b/>
-          <w:bCs/>
-          <w:lang w:eastAsia="ko-KR"/>
-        </w:rPr>
-        <w:t/>
-      </w:r>
-      <w:r>
-        <w:rPr>
-          <w:rFonts w:hint="eastAsia"/>
-          <w:b/>
-          <w:bCs/>
-          <w:lang w:eastAsia="ko-KR"/>
-        </w:rPr>
-        <w:t/>
-      </w:r>
     </w:p>
     <w:p>
       <w:pPr>
@@ -35666,29 +35578,7 @@
           <w:iCs/>
           <w:u w:val="single"/>
         </w:rPr>
-        <w:t xml:space="preserve">Journal Manuscript (n = 29)</w:t>
-      </w:r>
-      <w:r>
-        <w:rPr>
-          <w:rFonts w:hint="eastAsia"/>
-          <w:b/>
-          <w:bCs/>
-          <w:i/>
-          <w:iCs/>
-          <w:u w:val="single"/>
-          <w:lang w:eastAsia="ko-KR"/>
-        </w:rPr>
-        <w:t/>
-      </w:r>
-      <w:r>
-        <w:rPr>
-          <w:b/>
-          <w:bCs/>
-          <w:i/>
-          <w:iCs/>
-          <w:u w:val="single"/>
-        </w:rPr>
-        <w:t/>
+        <w:t>Journal Manuscript (n = 29)</w:t>
       </w:r>
     </w:p>
     <w:p>
@@ -44432,6 +44322,7 @@
           <w:iCs/>
           <w:color w:val="000000"/>
         </w:rPr>
+        <w:lastRenderedPageBreak/>
         <w:t>British Journal of Educational Technology</w:t>
       </w:r>
     </w:p>
@@ -44460,7 +44351,6 @@
           <w:color w:val="000000"/>
           <w:lang w:eastAsia="ko-KR"/>
         </w:rPr>
-        <w:lastRenderedPageBreak/>
         <w:t>British Journal of Special Education</w:t>
       </w:r>
     </w:p>
@@ -45391,7 +45281,11 @@
         <w:t>Excellent Award (2016). DIGITECH 2016, Project Title: Virtual Ancient Asia</w:t>
       </w:r>
       <w:r>
-        <w:t>, Florida State University</w:t>
+        <w:t xml:space="preserve">, Florida State </w:t>
+      </w:r>
+      <w:r>
+        <w:lastRenderedPageBreak/>
+        <w:t>University</w:t>
       </w:r>
     </w:p>
     <w:p>
@@ -45409,7 +45303,6 @@
         <w:ind w:left="720" w:hanging="720"/>
       </w:pPr>
       <w:r>
-        <w:lastRenderedPageBreak/>
         <w:t>Gagne and Briggs Scholarship (2015). Instructional Systems and Learning Technologies Program, Florida State University.</w:t>
       </w:r>
     </w:p>
@@ -45450,6 +45343,23 @@
     </w:p>
     <w:p>
       <w:pPr>
+        <w:rPr>
+          <w:b/>
+          <w:sz w:val="28"/>
+          <w:szCs w:val="28"/>
+        </w:rPr>
+      </w:pPr>
+      <w:r>
+        <w:rPr>
+          <w:b/>
+          <w:sz w:val="28"/>
+          <w:szCs w:val="28"/>
+        </w:rPr>
+        <w:br w:type="page"/>
+      </w:r>
+    </w:p>
+    <w:p>
+      <w:pPr>
         <w:pBdr>
           <w:top w:val="nil"/>
           <w:left w:val="nil"/>
@@ -45470,6 +45380,7 @@
           <w:sz w:val="28"/>
           <w:szCs w:val="28"/>
         </w:rPr>
+        <w:lastRenderedPageBreak/>
         <w:t>CERTIFICATES</w:t>
       </w:r>
     </w:p>
@@ -47058,7 +46969,6 @@
   <w:style w:type="character" w:default="1" w:styleId="DefaultParagraphFont">
     <w:name w:val="Default Paragraph Font"/>
     <w:uiPriority w:val="1"/>
-    <w:semiHidden/>
     <w:unhideWhenUsed/>
   </w:style>
   <w:style w:type="table" w:default="1" w:styleId="TableNormal">
@@ -47572,14 +47482,6 @@
 </file>
 
 <file path=customXml/item2.xml><?xml version="1.0" encoding="utf-8"?>
-<p:properties xmlns:p="http://schemas.microsoft.com/office/2006/metadata/properties" xmlns:xsi="http://www.w3.org/2001/XMLSchema-instance" xmlns:pc="http://schemas.microsoft.com/office/infopath/2007/PartnerControls">
-  <documentManagement>
-    <_activity xmlns="6a4161d7-0e07-4bb5-8cdd-a87a7602a445" xsi:nil="true"/>
-  </documentManagement>
-</p:properties>
-</file>
-
-<file path=customXml/item3.xml><?xml version="1.0" encoding="utf-8"?>
 <ct:contentTypeSchema xmlns:ct="http://schemas.microsoft.com/office/2006/metadata/contentType" xmlns:ma="http://schemas.microsoft.com/office/2006/metadata/properties/metaAttributes" ct:_="" ma:_="" ma:contentTypeName="Document" ma:contentTypeID="0x010100FA54A6C77D34E44FB33E0184D6F9C744" ma:contentTypeVersion="18" ma:contentTypeDescription="Create a new document." ma:contentTypeScope="" ma:versionID="9c28832654d292338743ef1185d20088">
   <xsd:schema xmlns:xsd="http://www.w3.org/2001/XMLSchema" xmlns:xs="http://www.w3.org/2001/XMLSchema" xmlns:p="http://schemas.microsoft.com/office/2006/metadata/properties" xmlns:ns3="6a4161d7-0e07-4bb5-8cdd-a87a7602a445" xmlns:ns4="30453fea-43c5-4a0b-a417-834186a09351" targetNamespace="http://schemas.microsoft.com/office/2006/metadata/properties" ma:root="true" ma:fieldsID="aadbfd92c1be4506f2c2f9fc093c4d0b" ns3:_="" ns4:_="">
     <xsd:import namespace="6a4161d7-0e07-4bb5-8cdd-a87a7602a445"/>
@@ -47832,8 +47734,16 @@
 </ct:contentTypeSchema>
 </file>
 
+<file path=customXml/item3.xml><?xml version="1.0" encoding="utf-8"?>
+<b:Sources xmlns:b="http://schemas.openxmlformats.org/officeDocument/2006/bibliography" xmlns="http://schemas.openxmlformats.org/officeDocument/2006/bibliography" SelectedStyle="\APASixthEditionOfficeOnline.xsl" StyleName="APA" Version="6"/>
+</file>
+
 <file path=customXml/item4.xml><?xml version="1.0" encoding="utf-8"?>
-<b:Sources xmlns:b="http://schemas.openxmlformats.org/officeDocument/2006/bibliography" xmlns="http://schemas.openxmlformats.org/officeDocument/2006/bibliography" SelectedStyle="\APASixthEditionOfficeOnline.xsl" StyleName="APA" Version="6"/>
+<p:properties xmlns:p="http://schemas.microsoft.com/office/2006/metadata/properties" xmlns:xsi="http://www.w3.org/2001/XMLSchema-instance" xmlns:pc="http://schemas.microsoft.com/office/infopath/2007/PartnerControls">
+  <documentManagement>
+    <_activity xmlns="6a4161d7-0e07-4bb5-8cdd-a87a7602a445" xsi:nil="true"/>
+  </documentManagement>
+</p:properties>
 </file>
 
 <file path=customXml/itemProps1.xml><?xml version="1.0" encoding="utf-8"?>
@@ -47845,16 +47755,6 @@
 </file>
 
 <file path=customXml/itemProps2.xml><?xml version="1.0" encoding="utf-8"?>
-<ds:datastoreItem xmlns:ds="http://schemas.openxmlformats.org/officeDocument/2006/customXml" ds:itemID="{7C24488D-A36D-4C56-91ED-753F5C27550A}">
-  <ds:schemaRefs>
-    <ds:schemaRef ds:uri="http://schemas.microsoft.com/office/2006/metadata/properties"/>
-    <ds:schemaRef ds:uri="http://schemas.microsoft.com/office/infopath/2007/PartnerControls"/>
-    <ds:schemaRef ds:uri="6a4161d7-0e07-4bb5-8cdd-a87a7602a445"/>
-  </ds:schemaRefs>
-</ds:datastoreItem>
-</file>
-
-<file path=customXml/itemProps3.xml><?xml version="1.0" encoding="utf-8"?>
 <ds:datastoreItem xmlns:ds="http://schemas.openxmlformats.org/officeDocument/2006/customXml" ds:itemID="{44F19B31-977D-45A4-A748-143054BB9DA7}">
   <ds:schemaRefs>
     <ds:schemaRef ds:uri="http://schemas.microsoft.com/office/2006/metadata/contentType"/>
@@ -47873,10 +47773,20 @@
 </ds:datastoreItem>
 </file>
 
-<file path=customXml/itemProps4.xml><?xml version="1.0" encoding="utf-8"?>
+<file path=customXml/itemProps3.xml><?xml version="1.0" encoding="utf-8"?>
 <ds:datastoreItem xmlns:ds="http://schemas.openxmlformats.org/officeDocument/2006/customXml" ds:itemID="{E286DD98-9466-43F6-BF97-336366EE54DF}">
   <ds:schemaRefs>
     <ds:schemaRef ds:uri="http://schemas.openxmlformats.org/officeDocument/2006/bibliography"/>
   </ds:schemaRefs>
 </ds:datastoreItem>
+</file>
+
+<file path=customXml/itemProps4.xml><?xml version="1.0" encoding="utf-8"?>
+<ds:datastoreItem xmlns:ds="http://schemas.openxmlformats.org/officeDocument/2006/customXml" ds:itemID="{7C24488D-A36D-4C56-91ED-753F5C27550A}">
+  <ds:schemaRefs>
+    <ds:schemaRef ds:uri="http://schemas.microsoft.com/office/2006/metadata/properties"/>
+    <ds:schemaRef ds:uri="http://schemas.microsoft.com/office/infopath/2007/PartnerControls"/>
+    <ds:schemaRef ds:uri="6a4161d7-0e07-4bb5-8cdd-a87a7602a445"/>
+  </ds:schemaRefs>
+</ds:datastoreItem>
 </file>
</xml_diff>

<commit_message>
Remove Behaviormetrika publication from CV
Remove DOI 10.1007/s41237-025-00286-1 only; update journal totals and sequential numbering. Preserve other CV content and formatting.
</commit_message>
<xml_diff>
--- a/CV_202605_MOON.docx
+++ b/CV_202605_MOON.docx
@@ -7696,7 +7696,7 @@
           <w:szCs w:val="28"/>
           <w:lang w:eastAsia="ko-KR"/>
         </w:rPr>
-        <w:t>5</w:t>
+        <w:t>4</w:t>
       </w:r>
       <w:r>
         <w:rPr>
@@ -7880,7 +7880,7 @@
           <w:u w:val="single"/>
           <w:lang w:eastAsia="ko-KR"/>
         </w:rPr>
-        <w:t>2</w:t>
+        <w:t>1</w:t>
       </w:r>
       <w:r>
         <w:rPr>
@@ -7906,7 +7906,7 @@
           <w:rFonts w:hint="eastAsia"/>
           <w:lang w:eastAsia="ko-KR"/>
         </w:rPr>
-        <w:t xml:space="preserve">[62] </w:t>
+        <w:t xml:space="preserve">[61] </w:t>
       </w:r>
       <w:r>
         <w:t xml:space="preserve">‡ </w:t>
@@ -8122,7 +8122,7 @@
           <w:rFonts w:hint="eastAsia"/>
           <w:lang w:eastAsia="ko-KR"/>
         </w:rPr>
-        <w:t>61</w:t>
+        <w:t>60</w:t>
       </w:r>
       <w:r>
         <w:rPr>
@@ -8539,7 +8539,7 @@
           <w:rFonts w:hint="eastAsia"/>
           <w:lang w:eastAsia="ko-KR"/>
         </w:rPr>
-        <w:t>60</w:t>
+        <w:t>59</w:t>
       </w:r>
       <w:r>
         <w:rPr>
@@ -8738,7 +8738,7 @@
           <w:rFonts w:hint="eastAsia"/>
           <w:lang w:eastAsia="ko-KR"/>
         </w:rPr>
-        <w:t>59</w:t>
+        <w:t>58</w:t>
       </w:r>
       <w:r>
         <w:rPr>
@@ -9105,7 +9105,7 @@
           <w:rFonts w:hint="eastAsia"/>
           <w:lang w:eastAsia="ko-KR"/>
         </w:rPr>
-        <w:t>8</w:t>
+        <w:t>7</w:t>
       </w:r>
       <w:r>
         <w:rPr>
@@ -9562,7 +9562,7 @@
           <w:rFonts w:hint="eastAsia"/>
           <w:lang w:eastAsia="ko-KR"/>
         </w:rPr>
-        <w:t>7</w:t>
+        <w:t>6</w:t>
       </w:r>
       <w:r>
         <w:t xml:space="preserve">] </w:t>
@@ -9886,7 +9886,7 @@
           <w:rFonts w:hint="eastAsia"/>
           <w:lang w:eastAsia="ko-KR"/>
         </w:rPr>
-        <w:t>6</w:t>
+        <w:t>5</w:t>
       </w:r>
       <w:r>
         <w:rPr>
@@ -10149,7 +10149,7 @@
           <w:rFonts w:hint="eastAsia"/>
           <w:lang w:eastAsia="ko-KR"/>
         </w:rPr>
-        <w:t xml:space="preserve">[55] </w:t>
+        <w:t xml:space="preserve">[54] </w:t>
       </w:r>
       <w:r>
         <w:t xml:space="preserve">‡ </w:t>
@@ -10479,7 +10479,7 @@
           <w:rFonts w:hint="eastAsia"/>
           <w:lang w:eastAsia="ko-KR"/>
         </w:rPr>
-        <w:t xml:space="preserve">[54] </w:t>
+        <w:t xml:space="preserve">[53] </w:t>
       </w:r>
       <w:r>
         <w:rPr>
@@ -10790,7 +10790,7 @@
           <w:rFonts w:hint="eastAsia"/>
           <w:lang w:eastAsia="ko-KR"/>
         </w:rPr>
-        <w:t>3</w:t>
+        <w:t>2</w:t>
       </w:r>
       <w:r>
         <w:rPr>
@@ -11075,7 +11075,7 @@
         <w:rPr>
           <w:lang w:eastAsia="ko-KR"/>
         </w:rPr>
-        <w:t xml:space="preserve">[52] </w:t>
+        <w:t xml:space="preserve">[51] </w:t>
       </w:r>
       <w:r>
         <w:t>*</w:t>
@@ -11245,104 +11245,6 @@
           <w:lang w:eastAsia="ko-KR"/>
         </w:rPr>
         <w:t xml:space="preserve"> </w:t>
-      </w:r>
-    </w:p>
-    <w:p>
-      <w:pPr>
-        <w:keepNext/>
-        <w:widowControl/>
-        <w:pBdr>
-          <w:top w:val="nil"/>
-          <w:left w:val="nil"/>
-          <w:bottom w:val="nil"/>
-          <w:right w:val="nil"/>
-          <w:between w:val="nil"/>
-        </w:pBdr>
-        <w:ind w:left="720" w:hanging="720"/>
-      </w:pPr>
-      <w:r>
-        <w:t>[5</w:t>
-      </w:r>
-      <w:r>
-        <w:rPr>
-          <w:lang w:eastAsia="ko-KR"/>
-        </w:rPr>
-        <w:t>1</w:t>
-      </w:r>
-      <w:r>
-        <w:t>] ‡ * </w:t>
-      </w:r>
-      <w:r>
-        <w:rPr>
-          <w:b/>
-          <w:bCs/>
-        </w:rPr>
-        <w:t>Moon, J</w:t>
-      </w:r>
-      <w:r>
-        <w:t>., Awoyemi, I., Abu, S., Marchiori, S., &amp; Song, S. (202</w:t>
-      </w:r>
-      <w:r>
-        <w:t>6</w:t>
-      </w:r>
-      <w:r>
-        <w:t xml:space="preserve">). Decoding immersive learning states: A reproducible </w:t>
-      </w:r>
-      <w:proofErr w:type="spellStart"/>
-      <w:r>
-        <w:t>microgenetic</w:t>
-      </w:r>
-      <w:proofErr w:type="spellEnd"/>
-      <w:r>
-        <w:t xml:space="preserve"> pipeline for behavioral data in virtual reality safety training. </w:t>
-      </w:r>
-      <w:r>
-        <w:rPr>
-          <w:i/>
-          <w:iCs/>
-        </w:rPr>
-        <w:t>Behaviormetrika</w:t>
-      </w:r>
-      <w:r>
-        <w:t>. </w:t>
-      </w:r>
-      <w:hyperlink r:id="rId25" w:history="1">
-        <w:r>
-          <w:rPr>
-            <w:rStyle w:val="Hyperlink"/>
-          </w:rPr>
-          <w:t>https://doi.org/10.1007/s41237-025-00286-1</w:t>
-        </w:r>
-      </w:hyperlink>
-      <w:r>
-        <w:t xml:space="preserve"> </w:t>
-      </w:r>
-      <w:r>
-        <w:rPr>
-          <w:b/>
-          <w:bCs/>
-          <w:i/>
-          <w:iCs/>
-        </w:rPr>
-        <w:t xml:space="preserve"> </w:t>
-      </w:r>
-      <w:r>
-        <w:rPr>
-          <w:b/>
-          <w:bCs/>
-          <w:i/>
-          <w:iCs/>
-        </w:rPr>
-        <w:t xml:space="preserve"> </w:t>
-      </w:r>
-      <w:r>
-        <w:rPr>
-          <w:b/>
-          <w:bCs/>
-          <w:i/>
-          <w:iCs/>
-        </w:rPr>
-        <w:t>[SCOPUS-indexed]</w:t>
       </w:r>
     </w:p>
     <w:p>

</xml_diff>

<commit_message>
Remove two requested publications from current CV
Remove only the cultural-historical activity theory article (10.1080/10494820.2026.2690104) and Decoding immersive learning states (10.1007/s41237-025-00286-1). Preserve all other CV content.
</commit_message>
<xml_diff>
--- a/CV_202605_MOON.docx
+++ b/CV_202605_MOON.docx
@@ -10139,338 +10139,6 @@
       <w:pPr>
         <w:ind w:left="720" w:hanging="720"/>
         <w:rPr>
-          <w:i/>
-          <w:iCs/>
-          <w:lang w:eastAsia="ko-KR"/>
-        </w:rPr>
-      </w:pPr>
-      <w:r>
-        <w:rPr>
-          <w:rFonts w:hint="eastAsia"/>
-          <w:lang w:eastAsia="ko-KR"/>
-        </w:rPr>
-        <w:t xml:space="preserve">[55] </w:t>
-      </w:r>
-      <w:r>
-        <w:t xml:space="preserve">‡ </w:t>
-      </w:r>
-      <w:r>
-        <w:rPr>
-          <w:rFonts w:hint="eastAsia"/>
-          <w:b/>
-          <w:bCs/>
-          <w:lang w:eastAsia="ko-KR"/>
-        </w:rPr>
-        <w:t>Moon, J</w:t>
-      </w:r>
-      <w:r>
-        <w:rPr>
-          <w:rFonts w:hint="eastAsia"/>
-          <w:lang w:eastAsia="ko-KR"/>
-        </w:rPr>
-        <w:t xml:space="preserve">. (2026). </w:t>
-      </w:r>
-      <w:r>
-        <w:rPr>
-          <w:lang w:eastAsia="ko-KR"/>
-        </w:rPr>
-        <w:t xml:space="preserve">A cultural-historical activity theory-anchored </w:t>
-      </w:r>
-      <w:r>
-        <w:rPr>
-          <w:rFonts w:hint="eastAsia"/>
-          <w:lang w:eastAsia="ko-KR"/>
-        </w:rPr>
-        <w:t>l</w:t>
-      </w:r>
-      <w:r>
-        <w:rPr>
-          <w:lang w:eastAsia="ko-KR"/>
-        </w:rPr>
-        <w:t xml:space="preserve">earning </w:t>
-      </w:r>
-      <w:r>
-        <w:rPr>
-          <w:rFonts w:hint="eastAsia"/>
-          <w:lang w:eastAsia="ko-KR"/>
-        </w:rPr>
-        <w:t>a</w:t>
-      </w:r>
-      <w:r>
-        <w:rPr>
-          <w:lang w:eastAsia="ko-KR"/>
-        </w:rPr>
-        <w:t xml:space="preserve">nalytics </w:t>
-      </w:r>
-      <w:r>
-        <w:rPr>
-          <w:rFonts w:hint="eastAsia"/>
-          <w:lang w:eastAsia="ko-KR"/>
-        </w:rPr>
-        <w:t>p</w:t>
-      </w:r>
-      <w:r>
-        <w:rPr>
-          <w:lang w:eastAsia="ko-KR"/>
-        </w:rPr>
-        <w:t xml:space="preserve">ipeline for </w:t>
-      </w:r>
-      <w:r>
-        <w:rPr>
-          <w:rFonts w:hint="eastAsia"/>
-          <w:lang w:eastAsia="ko-KR"/>
-        </w:rPr>
-        <w:t>e</w:t>
-      </w:r>
-      <w:r>
-        <w:rPr>
-          <w:lang w:eastAsia="ko-KR"/>
-        </w:rPr>
-        <w:t xml:space="preserve">arly </w:t>
-      </w:r>
-      <w:r>
-        <w:rPr>
-          <w:rFonts w:hint="eastAsia"/>
-          <w:lang w:eastAsia="ko-KR"/>
-        </w:rPr>
-        <w:t>d</w:t>
-      </w:r>
-      <w:r>
-        <w:rPr>
-          <w:lang w:eastAsia="ko-KR"/>
-        </w:rPr>
-        <w:t xml:space="preserve">etection and </w:t>
-      </w:r>
-      <w:r>
-        <w:rPr>
-          <w:rFonts w:hint="eastAsia"/>
-          <w:lang w:eastAsia="ko-KR"/>
-        </w:rPr>
-        <w:t>s</w:t>
-      </w:r>
-      <w:r>
-        <w:rPr>
-          <w:lang w:eastAsia="ko-KR"/>
-        </w:rPr>
-        <w:t>ocial-</w:t>
-      </w:r>
-      <w:r>
-        <w:rPr>
-          <w:rFonts w:hint="eastAsia"/>
-          <w:lang w:eastAsia="ko-KR"/>
-        </w:rPr>
-        <w:t>e</w:t>
-      </w:r>
-      <w:r>
-        <w:rPr>
-          <w:lang w:eastAsia="ko-KR"/>
-        </w:rPr>
-        <w:t xml:space="preserve">pistemic </w:t>
-      </w:r>
-      <w:r>
-        <w:rPr>
-          <w:rFonts w:hint="eastAsia"/>
-          <w:lang w:eastAsia="ko-KR"/>
-        </w:rPr>
-        <w:t>i</w:t>
-      </w:r>
-      <w:r>
-        <w:rPr>
-          <w:lang w:eastAsia="ko-KR"/>
-        </w:rPr>
-        <w:t xml:space="preserve">ntegration in AI </w:t>
-      </w:r>
-      <w:r>
-        <w:rPr>
-          <w:rFonts w:hint="eastAsia"/>
-          <w:lang w:eastAsia="ko-KR"/>
-        </w:rPr>
-        <w:t>l</w:t>
-      </w:r>
-      <w:r>
-        <w:rPr>
-          <w:lang w:eastAsia="ko-KR"/>
-        </w:rPr>
-        <w:t xml:space="preserve">iteracy </w:t>
-      </w:r>
-      <w:r>
-        <w:rPr>
-          <w:rFonts w:hint="eastAsia"/>
-          <w:lang w:eastAsia="ko-KR"/>
-        </w:rPr>
-        <w:t>e</w:t>
-      </w:r>
-      <w:r>
-        <w:rPr>
-          <w:lang w:eastAsia="ko-KR"/>
-        </w:rPr>
-        <w:t>ducation</w:t>
-      </w:r>
-      <w:r>
-        <w:rPr>
-          <w:rFonts w:hint="eastAsia"/>
-          <w:lang w:eastAsia="ko-KR"/>
-        </w:rPr>
-        <w:t xml:space="preserve">. </w:t>
-      </w:r>
-      <w:r>
-        <w:rPr>
-          <w:rFonts w:hint="eastAsia"/>
-          <w:i/>
-          <w:iCs/>
-          <w:lang w:eastAsia="ko-KR"/>
-        </w:rPr>
-        <w:t>Interactive Learning Environments.</w:t>
-      </w:r>
-      <w:r>
-        <w:rPr>
-          <w:rFonts w:hint="eastAsia"/>
-          <w:i/>
-          <w:iCs/>
-          <w:lang w:eastAsia="ko-KR"/>
-        </w:rPr>
-        <w:t xml:space="preserve"> </w:t>
-      </w:r>
-      <w:hyperlink r:id="rId21" w:history="1">
-        <w:r>
-          <w:rPr>
-            <w:rStyle w:val="Hyperlink"/>
-            <w:lang w:eastAsia="ko-KR"/>
-          </w:rPr>
-          <w:t>https://doi.org/10.1080/10494820.2026.2690104</w:t>
-        </w:r>
-      </w:hyperlink>
-      <w:r>
-        <w:rPr>
-          <w:rFonts w:hint="eastAsia"/>
-          <w:lang w:eastAsia="ko-KR"/>
-        </w:rPr>
-        <w:t xml:space="preserve"> </w:t>
-      </w:r>
-      <w:r>
-        <w:rPr>
-          <w:rFonts w:hint="eastAsia"/>
-          <w:i/>
-          <w:iCs/>
-          <w:lang w:eastAsia="ko-KR"/>
-        </w:rPr>
-        <w:t xml:space="preserve"> </w:t>
-      </w:r>
-      <w:r>
-        <w:rPr>
-          <w:b/>
-          <w:i/>
-        </w:rPr>
-        <w:t>[SSCI-indexed</w:t>
-      </w:r>
-      <w:r>
-        <w:rPr>
-          <w:b/>
-          <w:bCs/>
-          <w:i/>
-          <w:iCs/>
-        </w:rPr>
-        <w:t>, IF =</w:t>
-      </w:r>
-      <w:r>
-        <w:rPr>
-          <w:rFonts w:hint="eastAsia"/>
-          <w:b/>
-          <w:bCs/>
-          <w:i/>
-          <w:iCs/>
-          <w:lang w:eastAsia="ko-KR"/>
-        </w:rPr>
-        <w:t>6.7</w:t>
-      </w:r>
-      <w:r>
-        <w:rPr>
-          <w:rFonts w:hint="eastAsia"/>
-          <w:b/>
-          <w:bCs/>
-          <w:i/>
-          <w:iCs/>
-          <w:lang w:eastAsia="ko-KR"/>
-        </w:rPr>
-        <w:t xml:space="preserve">, </w:t>
-      </w:r>
-      <w:r>
-        <w:rPr>
-          <w:b/>
-          <w:bCs/>
-          <w:i/>
-          <w:iCs/>
-        </w:rPr>
-        <w:t>IF</w:t>
-      </w:r>
-      <w:r>
-        <w:rPr>
-          <w:rFonts w:hint="eastAsia"/>
-          <w:b/>
-          <w:bCs/>
-          <w:i/>
-          <w:iCs/>
-          <w:lang w:eastAsia="ko-KR"/>
-        </w:rPr>
-        <w:t>5</w:t>
-      </w:r>
-      <w:r>
-        <w:rPr>
-          <w:b/>
-          <w:bCs/>
-          <w:i/>
-          <w:iCs/>
-        </w:rPr>
-        <w:t xml:space="preserve"> = </w:t>
-      </w:r>
-      <w:r>
-        <w:rPr>
-          <w:rFonts w:hint="eastAsia"/>
-          <w:b/>
-          <w:bCs/>
-          <w:i/>
-          <w:iCs/>
-          <w:lang w:eastAsia="ko-KR"/>
-        </w:rPr>
-        <w:t>7</w:t>
-      </w:r>
-      <w:r>
-        <w:rPr>
-          <w:rFonts w:hint="eastAsia"/>
-          <w:b/>
-          <w:bCs/>
-          <w:i/>
-          <w:iCs/>
-          <w:lang w:eastAsia="ko-KR"/>
-        </w:rPr>
-        <w:t>.</w:t>
-      </w:r>
-      <w:r>
-        <w:rPr>
-          <w:rFonts w:hint="eastAsia"/>
-          <w:b/>
-          <w:bCs/>
-          <w:i/>
-          <w:iCs/>
-          <w:lang w:eastAsia="ko-KR"/>
-        </w:rPr>
-        <w:t>1</w:t>
-      </w:r>
-      <w:r>
-        <w:rPr>
-          <w:b/>
-          <w:i/>
-          <w:color w:val="212121"/>
-          <w:sz w:val="28"/>
-          <w:szCs w:val="28"/>
-        </w:rPr>
-        <w:t>]</w:t>
-      </w:r>
-    </w:p>
-    <w:p>
-      <w:pPr>
-        <w:ind w:left="720" w:hanging="720"/>
-        <w:rPr>
           <w:lang w:eastAsia="ko-KR"/>
         </w:rPr>
       </w:pPr>
@@ -11245,104 +10913,6 @@
           <w:lang w:eastAsia="ko-KR"/>
         </w:rPr>
         <w:t xml:space="preserve"> </w:t>
-      </w:r>
-    </w:p>
-    <w:p>
-      <w:pPr>
-        <w:keepNext/>
-        <w:widowControl/>
-        <w:pBdr>
-          <w:top w:val="nil"/>
-          <w:left w:val="nil"/>
-          <w:bottom w:val="nil"/>
-          <w:right w:val="nil"/>
-          <w:between w:val="nil"/>
-        </w:pBdr>
-        <w:ind w:left="720" w:hanging="720"/>
-      </w:pPr>
-      <w:r>
-        <w:t>[5</w:t>
-      </w:r>
-      <w:r>
-        <w:rPr>
-          <w:lang w:eastAsia="ko-KR"/>
-        </w:rPr>
-        <w:t>1</w:t>
-      </w:r>
-      <w:r>
-        <w:t>] ‡ * </w:t>
-      </w:r>
-      <w:r>
-        <w:rPr>
-          <w:b/>
-          <w:bCs/>
-        </w:rPr>
-        <w:t>Moon, J</w:t>
-      </w:r>
-      <w:r>
-        <w:t>., Awoyemi, I., Abu, S., Marchiori, S., &amp; Song, S. (202</w:t>
-      </w:r>
-      <w:r>
-        <w:t>6</w:t>
-      </w:r>
-      <w:r>
-        <w:t xml:space="preserve">). Decoding immersive learning states: A reproducible </w:t>
-      </w:r>
-      <w:proofErr w:type="spellStart"/>
-      <w:r>
-        <w:t>microgenetic</w:t>
-      </w:r>
-      <w:proofErr w:type="spellEnd"/>
-      <w:r>
-        <w:t xml:space="preserve"> pipeline for behavioral data in virtual reality safety training. </w:t>
-      </w:r>
-      <w:r>
-        <w:rPr>
-          <w:i/>
-          <w:iCs/>
-        </w:rPr>
-        <w:t>Behaviormetrika</w:t>
-      </w:r>
-      <w:r>
-        <w:t>. </w:t>
-      </w:r>
-      <w:hyperlink r:id="rId25" w:history="1">
-        <w:r>
-          <w:rPr>
-            <w:rStyle w:val="Hyperlink"/>
-          </w:rPr>
-          <w:t>https://doi.org/10.1007/s41237-025-00286-1</w:t>
-        </w:r>
-      </w:hyperlink>
-      <w:r>
-        <w:t xml:space="preserve"> </w:t>
-      </w:r>
-      <w:r>
-        <w:rPr>
-          <w:b/>
-          <w:bCs/>
-          <w:i/>
-          <w:iCs/>
-        </w:rPr>
-        <w:t xml:space="preserve"> </w:t>
-      </w:r>
-      <w:r>
-        <w:rPr>
-          <w:b/>
-          <w:bCs/>
-          <w:i/>
-          <w:iCs/>
-        </w:rPr>
-        <w:t xml:space="preserve"> </w:t>
-      </w:r>
-      <w:r>
-        <w:rPr>
-          <w:b/>
-          <w:bCs/>
-          <w:i/>
-          <w:iCs/>
-        </w:rPr>
-        <w:t>[SCOPUS-indexed]</w:t>
       </w:r>
     </w:p>
     <w:p>

</xml_diff>

<commit_message>
Move Hong AI & Society manuscript to Under Review
Move the manuscript from journal articles to under-review manuscripts, correct publication and working-paper counts, and refresh the site-data cache version.
</commit_message>
<xml_diff>
--- a/CV_202605_MOON.docx
+++ b/CV_202605_MOON.docx
@@ -7660,7 +7660,7 @@
           <w:sz w:val="28"/>
           <w:szCs w:val="28"/>
         </w:rPr>
-        <w:t>SELECTED JOURNAL ARTICLES</w:t>
+        <w:t>SELECTED JOURNAL ARTICLES [n = 62]</w:t>
       </w:r>
       <w:r>
         <w:rPr>
@@ -7668,7 +7668,7 @@
           <w:sz w:val="28"/>
           <w:szCs w:val="28"/>
         </w:rPr>
-        <w:t xml:space="preserve"> </w:t>
+        <w:t xml:space="preserve"/>
       </w:r>
       <w:r>
         <w:rPr>
@@ -7676,7 +7676,7 @@
           <w:sz w:val="28"/>
           <w:szCs w:val="28"/>
         </w:rPr>
-        <w:t xml:space="preserve">[n = </w:t>
+        <w:t xml:space="preserve"/>
       </w:r>
       <w:r>
         <w:rPr>
@@ -7686,7 +7686,7 @@
           <w:szCs w:val="28"/>
           <w:lang w:eastAsia="ko-KR"/>
         </w:rPr>
-        <w:t>6</w:t>
+        <w:t/>
       </w:r>
       <w:r>
         <w:rPr>
@@ -7696,7 +7696,7 @@
           <w:szCs w:val="28"/>
           <w:lang w:eastAsia="ko-KR"/>
         </w:rPr>
-        <w:t>3</w:t>
+        <w:t/>
       </w:r>
       <w:r>
         <w:rPr>
@@ -7704,7 +7704,7 @@
           <w:sz w:val="28"/>
           <w:szCs w:val="28"/>
         </w:rPr>
-        <w:t>]</w:t>
+        <w:t/>
       </w:r>
     </w:p>
     <w:p>
@@ -7856,7 +7856,7 @@
           <w:szCs w:val="26"/>
           <w:u w:val="single"/>
         </w:rPr>
-        <w:t xml:space="preserve">International and Peer-reviewed (n = </w:t>
+        <w:t xml:space="preserve">International and Peer-reviewed (n = 61)</w:t>
       </w:r>
       <w:r>
         <w:rPr>
@@ -7868,7 +7868,7 @@
           <w:u w:val="single"/>
           <w:lang w:eastAsia="ko-KR"/>
         </w:rPr>
-        <w:t>6</w:t>
+        <w:t/>
       </w:r>
       <w:r>
         <w:rPr>
@@ -7880,7 +7880,7 @@
           <w:u w:val="single"/>
           <w:lang w:eastAsia="ko-KR"/>
         </w:rPr>
-        <w:t>2</w:t>
+        <w:t/>
       </w:r>
       <w:r>
         <w:rPr>
@@ -7890,7 +7890,7 @@
           <w:szCs w:val="26"/>
           <w:u w:val="single"/>
         </w:rPr>
-        <w:t>)</w:t>
+        <w:t/>
       </w:r>
     </w:p>
     <w:p>
@@ -7906,7 +7906,7 @@
           <w:rFonts w:hint="eastAsia"/>
           <w:lang w:eastAsia="ko-KR"/>
         </w:rPr>
-        <w:t xml:space="preserve">[62] </w:t>
+        <w:t xml:space="preserve">[61] </w:t>
       </w:r>
       <w:r>
         <w:t xml:space="preserve">‡ </w:t>
@@ -8094,423 +8094,6 @@
       <w:r>
         <w:rPr>
           <w:rFonts w:hint="eastAsia"/>
-          <w:lang w:eastAsia="ko-KR"/>
-        </w:rPr>
-        <w:t xml:space="preserve"> </w:t>
-      </w:r>
-    </w:p>
-    <w:p>
-      <w:pPr>
-        <w:ind w:left="720" w:hanging="720"/>
-        <w:rPr>
-          <w:b/>
-          <w:bCs/>
-          <w:i/>
-          <w:iCs/>
-          <w:lang w:eastAsia="ko-KR"/>
-        </w:rPr>
-      </w:pPr>
-      <w:r>
-        <w:rPr>
-          <w:rFonts w:hint="eastAsia"/>
-          <w:lang w:eastAsia="ko-KR"/>
-        </w:rPr>
-        <w:t>[</w:t>
-      </w:r>
-      <w:r>
-        <w:rPr>
-          <w:rFonts w:hint="eastAsia"/>
-          <w:lang w:eastAsia="ko-KR"/>
-        </w:rPr>
-        <w:t>61</w:t>
-      </w:r>
-      <w:r>
-        <w:rPr>
-          <w:rFonts w:hint="eastAsia"/>
-          <w:lang w:eastAsia="ko-KR"/>
-        </w:rPr>
-        <w:t xml:space="preserve">] * Hong, S., </w:t>
-      </w:r>
-      <w:r>
-        <w:rPr>
-          <w:rFonts w:hint="eastAsia"/>
-          <w:b/>
-          <w:bCs/>
-          <w:lang w:eastAsia="ko-KR"/>
-        </w:rPr>
-        <w:t>Moon, J.</w:t>
-      </w:r>
-      <w:r>
-        <w:rPr>
-          <w:rFonts w:hint="eastAsia"/>
-          <w:lang w:eastAsia="ko-KR"/>
-        </w:rPr>
-        <w:t>,</w:t>
-      </w:r>
-      <w:r>
-        <w:rPr>
-          <w:rFonts w:hint="eastAsia"/>
-          <w:lang w:eastAsia="ko-KR"/>
-        </w:rPr>
-        <w:t xml:space="preserve"> Cho, H., &amp; Lim, C. (</w:t>
-      </w:r>
-      <w:r>
-        <w:rPr>
-          <w:rFonts w:hint="eastAsia"/>
-          <w:bCs/>
-          <w:lang w:eastAsia="ko-KR"/>
-        </w:rPr>
-        <w:t>Accepted, 2026</w:t>
-      </w:r>
-      <w:r>
-        <w:rPr>
-          <w:rFonts w:hint="eastAsia"/>
-          <w:lang w:eastAsia="ko-KR"/>
-        </w:rPr>
-        <w:t xml:space="preserve">). </w:t>
-      </w:r>
-      <w:r>
-        <w:rPr>
-          <w:lang w:eastAsia="ko-KR"/>
-        </w:rPr>
-        <w:t xml:space="preserve">Using a </w:t>
-      </w:r>
-      <w:r>
-        <w:rPr>
-          <w:rFonts w:hint="eastAsia"/>
-          <w:lang w:eastAsia="ko-KR"/>
-        </w:rPr>
-        <w:t>g</w:t>
-      </w:r>
-      <w:r>
-        <w:rPr>
-          <w:lang w:eastAsia="ko-KR"/>
-        </w:rPr>
-        <w:t>enerative AI-</w:t>
-      </w:r>
-      <w:r>
-        <w:rPr>
-          <w:rFonts w:hint="eastAsia"/>
-          <w:lang w:eastAsia="ko-KR"/>
-        </w:rPr>
-        <w:t>e</w:t>
-      </w:r>
-      <w:r>
-        <w:rPr>
-          <w:lang w:eastAsia="ko-KR"/>
-        </w:rPr>
-        <w:t xml:space="preserve">nhanced </w:t>
-      </w:r>
-      <w:r>
-        <w:rPr>
-          <w:rFonts w:hint="eastAsia"/>
-          <w:lang w:eastAsia="ko-KR"/>
-        </w:rPr>
-        <w:t>c</w:t>
-      </w:r>
-      <w:r>
-        <w:rPr>
-          <w:lang w:eastAsia="ko-KR"/>
-        </w:rPr>
-        <w:t xml:space="preserve">hatbot to </w:t>
-      </w:r>
-      <w:r>
-        <w:rPr>
-          <w:rFonts w:hint="eastAsia"/>
-          <w:lang w:eastAsia="ko-KR"/>
-        </w:rPr>
-        <w:t>p</w:t>
-      </w:r>
-      <w:r>
-        <w:rPr>
-          <w:lang w:eastAsia="ko-KR"/>
-        </w:rPr>
-        <w:t xml:space="preserve">romote </w:t>
-      </w:r>
-      <w:r>
-        <w:rPr>
-          <w:rFonts w:hint="eastAsia"/>
-          <w:lang w:eastAsia="ko-KR"/>
-        </w:rPr>
-        <w:t>e</w:t>
-      </w:r>
-      <w:r>
-        <w:rPr>
-          <w:lang w:eastAsia="ko-KR"/>
-        </w:rPr>
-        <w:t xml:space="preserve">thical </w:t>
-      </w:r>
-      <w:r>
-        <w:rPr>
-          <w:rFonts w:hint="eastAsia"/>
-          <w:lang w:eastAsia="ko-KR"/>
-        </w:rPr>
-        <w:t>r</w:t>
-      </w:r>
-      <w:r>
-        <w:rPr>
-          <w:lang w:eastAsia="ko-KR"/>
-        </w:rPr>
-        <w:t xml:space="preserve">easoning in </w:t>
-      </w:r>
-      <w:r>
-        <w:rPr>
-          <w:rFonts w:hint="eastAsia"/>
-          <w:lang w:eastAsia="ko-KR"/>
-        </w:rPr>
-        <w:t>h</w:t>
-      </w:r>
-      <w:r>
-        <w:rPr>
-          <w:lang w:eastAsia="ko-KR"/>
-        </w:rPr>
-        <w:t xml:space="preserve">igher </w:t>
-      </w:r>
-      <w:r>
-        <w:rPr>
-          <w:rFonts w:hint="eastAsia"/>
-          <w:lang w:eastAsia="ko-KR"/>
-        </w:rPr>
-        <w:t>e</w:t>
-      </w:r>
-      <w:r>
-        <w:rPr>
-          <w:lang w:eastAsia="ko-KR"/>
-        </w:rPr>
-        <w:t xml:space="preserve">ducation: A </w:t>
-      </w:r>
-      <w:r>
-        <w:rPr>
-          <w:rFonts w:hint="eastAsia"/>
-          <w:lang w:eastAsia="ko-KR"/>
-        </w:rPr>
-        <w:t>d</w:t>
-      </w:r>
-      <w:r>
-        <w:rPr>
-          <w:lang w:eastAsia="ko-KR"/>
-        </w:rPr>
-        <w:t>ilemma-</w:t>
-      </w:r>
-      <w:r>
-        <w:rPr>
-          <w:rFonts w:hint="eastAsia"/>
-          <w:lang w:eastAsia="ko-KR"/>
-        </w:rPr>
-        <w:t>c</w:t>
-      </w:r>
-      <w:r>
-        <w:rPr>
-          <w:lang w:eastAsia="ko-KR"/>
-        </w:rPr>
-        <w:t xml:space="preserve">entered </w:t>
-      </w:r>
-      <w:r>
-        <w:rPr>
-          <w:rFonts w:hint="eastAsia"/>
-          <w:lang w:eastAsia="ko-KR"/>
-        </w:rPr>
-        <w:t>l</w:t>
-      </w:r>
-      <w:r>
-        <w:rPr>
-          <w:lang w:eastAsia="ko-KR"/>
-        </w:rPr>
-        <w:t xml:space="preserve">earning </w:t>
-      </w:r>
-      <w:r>
-        <w:rPr>
-          <w:rFonts w:hint="eastAsia"/>
-          <w:lang w:eastAsia="ko-KR"/>
-        </w:rPr>
-        <w:t>a</w:t>
-      </w:r>
-      <w:r>
-        <w:rPr>
-          <w:lang w:eastAsia="ko-KR"/>
-        </w:rPr>
-        <w:t xml:space="preserve">pproach via </w:t>
-      </w:r>
-      <w:r>
-        <w:rPr>
-          <w:rFonts w:hint="eastAsia"/>
-          <w:lang w:eastAsia="ko-KR"/>
-        </w:rPr>
-        <w:t>i</w:t>
-      </w:r>
-      <w:r>
-        <w:rPr>
-          <w:lang w:eastAsia="ko-KR"/>
-        </w:rPr>
-        <w:t>ll-</w:t>
-      </w:r>
-      <w:r>
-        <w:rPr>
-          <w:rFonts w:hint="eastAsia"/>
-          <w:lang w:eastAsia="ko-KR"/>
-        </w:rPr>
-        <w:t>s</w:t>
-      </w:r>
-      <w:r>
-        <w:rPr>
-          <w:lang w:eastAsia="ko-KR"/>
-        </w:rPr>
-        <w:t xml:space="preserve">tructured </w:t>
-      </w:r>
-      <w:r>
-        <w:rPr>
-          <w:rFonts w:hint="eastAsia"/>
-          <w:lang w:eastAsia="ko-KR"/>
-        </w:rPr>
-        <w:t>p</w:t>
-      </w:r>
-      <w:r>
-        <w:rPr>
-          <w:lang w:eastAsia="ko-KR"/>
-        </w:rPr>
-        <w:t xml:space="preserve">roblem </w:t>
-      </w:r>
-      <w:r>
-        <w:rPr>
-          <w:rFonts w:hint="eastAsia"/>
-          <w:lang w:eastAsia="ko-KR"/>
-        </w:rPr>
-        <w:t>p</w:t>
-      </w:r>
-      <w:r>
-        <w:rPr>
-          <w:lang w:eastAsia="ko-KR"/>
-        </w:rPr>
-        <w:t>edagogy</w:t>
-      </w:r>
-      <w:r>
-        <w:rPr>
-          <w:rFonts w:hint="eastAsia"/>
-          <w:lang w:eastAsia="ko-KR"/>
-        </w:rPr>
-        <w:t xml:space="preserve">. </w:t>
-      </w:r>
-      <w:r>
-        <w:rPr>
-          <w:rFonts w:hint="eastAsia"/>
-          <w:i/>
-          <w:iCs/>
-          <w:lang w:eastAsia="ko-KR"/>
-        </w:rPr>
-        <w:t>AI &amp; Society</w:t>
-      </w:r>
-      <w:r>
-        <w:rPr>
-          <w:rFonts w:hint="eastAsia"/>
-          <w:lang w:eastAsia="ko-KR"/>
-        </w:rPr>
-        <w:t xml:space="preserve">. </w:t>
-      </w:r>
-      <w:r>
-        <w:rPr>
-          <w:b/>
-          <w:bCs/>
-          <w:i/>
-          <w:iCs/>
-        </w:rPr>
-        <w:t>[</w:t>
-      </w:r>
-      <w:r>
-        <w:rPr>
-          <w:rFonts w:hint="eastAsia"/>
-          <w:b/>
-          <w:i/>
-          <w:iCs/>
-          <w:lang w:eastAsia="ko-KR"/>
-        </w:rPr>
-        <w:t>ESCI</w:t>
-      </w:r>
-      <w:r>
-        <w:rPr>
-          <w:rFonts w:hint="eastAsia"/>
-          <w:b/>
-          <w:i/>
-          <w:iCs/>
-          <w:lang w:eastAsia="ko-KR"/>
-        </w:rPr>
-        <w:t>-indexed</w:t>
-      </w:r>
-      <w:r>
-        <w:rPr>
-          <w:b/>
-          <w:bCs/>
-          <w:i/>
-          <w:iCs/>
-        </w:rPr>
-        <w:t xml:space="preserve">, IF = </w:t>
-      </w:r>
-      <w:r>
-        <w:rPr>
-          <w:rFonts w:hint="eastAsia"/>
-          <w:b/>
-          <w:bCs/>
-          <w:i/>
-          <w:iCs/>
-          <w:lang w:eastAsia="ko-KR"/>
-        </w:rPr>
-        <w:t xml:space="preserve">6.1, </w:t>
-      </w:r>
-      <w:r>
-        <w:rPr>
-          <w:b/>
-          <w:bCs/>
-          <w:i/>
-          <w:iCs/>
-        </w:rPr>
-        <w:t>IF</w:t>
-      </w:r>
-      <w:r>
-        <w:rPr>
-          <w:rFonts w:hint="eastAsia"/>
-          <w:b/>
-          <w:bCs/>
-          <w:i/>
-          <w:iCs/>
-          <w:lang w:eastAsia="ko-KR"/>
-        </w:rPr>
-        <w:t>5</w:t>
-      </w:r>
-      <w:r>
-        <w:rPr>
-          <w:b/>
-          <w:bCs/>
-          <w:i/>
-          <w:iCs/>
-        </w:rPr>
-        <w:t xml:space="preserve"> = </w:t>
-      </w:r>
-      <w:r>
-        <w:rPr>
-          <w:rFonts w:hint="eastAsia"/>
-          <w:b/>
-          <w:bCs/>
-          <w:i/>
-          <w:iCs/>
-          <w:lang w:eastAsia="ko-KR"/>
-        </w:rPr>
-        <w:t>2.1</w:t>
-      </w:r>
-      <w:r>
-        <w:rPr>
-          <w:b/>
-          <w:bCs/>
-          <w:i/>
-          <w:iCs/>
-        </w:rPr>
-        <w:t>]</w:t>
-      </w:r>
-      <w:r>
-        <w:rPr>
-          <w:rFonts w:hint="eastAsia"/>
-          <w:b/>
-          <w:bCs/>
-          <w:i/>
-          <w:iCs/>
           <w:lang w:eastAsia="ko-KR"/>
         </w:rPr>
         <w:t xml:space="preserve"> </w:t>
@@ -35398,7 +34981,7 @@
           <w:sz w:val="28"/>
           <w:szCs w:val="28"/>
         </w:rPr>
-        <w:t>WORKING PAPERS [n = 38]</w:t>
+        <w:t>WORKING PAPERS [n = 39]</w:t>
       </w:r>
     </w:p>
     <w:p>
@@ -35493,7 +35076,7 @@
           <w:bCs/>
           <w:lang w:eastAsia="ko-KR"/>
         </w:rPr>
-        <w:t>Submitted or Under Review (n = 31)</w:t>
+        <w:t>Submitted or Under Review (n = 32)</w:t>
       </w:r>
     </w:p>
     <w:p>
@@ -35515,7 +35098,424 @@
           <w:iCs/>
           <w:u w:val="single"/>
         </w:rPr>
-        <w:t>Journal Manuscript (n = 29)</w:t>
+        <w:t>Journal Manuscript (n = 30)</w:t>
+      </w:r>
+    </w:p>
+    <w:p>
+      <w:pPr>
+        <w:ind w:left="720" w:hanging="720"/>
+        <w:rPr>
+          <w:b/>
+          <w:bCs/>
+          <w:i/>
+          <w:iCs/>
+          <w:lang w:eastAsia="ko-KR"/>
+        </w:rPr>
+      </w:pPr>
+      <w:r>
+        <w:rPr>
+          <w:rFonts w:hint="eastAsia"/>
+          <w:lang w:eastAsia="ko-KR"/>
+        </w:rPr>
+        <w:t>[30]</w:t>
+      </w:r>
+      <w:r>
+        <w:rPr>
+          <w:rFonts w:hint="eastAsia"/>
+          <w:lang w:eastAsia="ko-KR"/>
+        </w:rPr>
+        <w:t/>
+      </w:r>
+      <w:r>
+        <w:rPr>
+          <w:rFonts w:hint="eastAsia"/>
+          <w:lang w:eastAsia="ko-KR"/>
+        </w:rPr>
+        <w:t xml:space="preserve"> * Hong, S., </w:t>
+      </w:r>
+      <w:r>
+        <w:rPr>
+          <w:rFonts w:hint="eastAsia"/>
+          <w:b/>
+          <w:bCs/>
+          <w:lang w:eastAsia="ko-KR"/>
+        </w:rPr>
+        <w:t>Moon, J.</w:t>
+      </w:r>
+      <w:r>
+        <w:rPr>
+          <w:rFonts w:hint="eastAsia"/>
+          <w:lang w:eastAsia="ko-KR"/>
+        </w:rPr>
+        <w:t>,</w:t>
+      </w:r>
+      <w:r>
+        <w:rPr>
+          <w:rFonts w:hint="eastAsia"/>
+          <w:lang w:eastAsia="ko-KR"/>
+        </w:rPr>
+        <w:t xml:space="preserve"> Cho, H., &amp; Lim, C. (</w:t>
+      </w:r>
+      <w:r>
+        <w:rPr>
+          <w:rFonts w:hint="eastAsia"/>
+          <w:bCs/>
+          <w:lang w:eastAsia="ko-KR"/>
+        </w:rPr>
+        <w:t>Under review</w:t>
+      </w:r>
+      <w:r>
+        <w:rPr>
+          <w:rFonts w:hint="eastAsia"/>
+          <w:lang w:eastAsia="ko-KR"/>
+        </w:rPr>
+        <w:t xml:space="preserve">). </w:t>
+      </w:r>
+      <w:r>
+        <w:rPr>
+          <w:lang w:eastAsia="ko-KR"/>
+        </w:rPr>
+        <w:t xml:space="preserve">Using a </w:t>
+      </w:r>
+      <w:r>
+        <w:rPr>
+          <w:rFonts w:hint="eastAsia"/>
+          <w:lang w:eastAsia="ko-KR"/>
+        </w:rPr>
+        <w:t>g</w:t>
+      </w:r>
+      <w:r>
+        <w:rPr>
+          <w:lang w:eastAsia="ko-KR"/>
+        </w:rPr>
+        <w:t>enerative AI-</w:t>
+      </w:r>
+      <w:r>
+        <w:rPr>
+          <w:rFonts w:hint="eastAsia"/>
+          <w:lang w:eastAsia="ko-KR"/>
+        </w:rPr>
+        <w:t>e</w:t>
+      </w:r>
+      <w:r>
+        <w:rPr>
+          <w:lang w:eastAsia="ko-KR"/>
+        </w:rPr>
+        <w:t xml:space="preserve">nhanced </w:t>
+      </w:r>
+      <w:r>
+        <w:rPr>
+          <w:rFonts w:hint="eastAsia"/>
+          <w:lang w:eastAsia="ko-KR"/>
+        </w:rPr>
+        <w:t>c</w:t>
+      </w:r>
+      <w:r>
+        <w:rPr>
+          <w:lang w:eastAsia="ko-KR"/>
+        </w:rPr>
+        <w:t xml:space="preserve">hatbot to </w:t>
+      </w:r>
+      <w:r>
+        <w:rPr>
+          <w:rFonts w:hint="eastAsia"/>
+          <w:lang w:eastAsia="ko-KR"/>
+        </w:rPr>
+        <w:t>p</w:t>
+      </w:r>
+      <w:r>
+        <w:rPr>
+          <w:lang w:eastAsia="ko-KR"/>
+        </w:rPr>
+        <w:t xml:space="preserve">romote </w:t>
+      </w:r>
+      <w:r>
+        <w:rPr>
+          <w:rFonts w:hint="eastAsia"/>
+          <w:lang w:eastAsia="ko-KR"/>
+        </w:rPr>
+        <w:t>e</w:t>
+      </w:r>
+      <w:r>
+        <w:rPr>
+          <w:lang w:eastAsia="ko-KR"/>
+        </w:rPr>
+        <w:t xml:space="preserve">thical </w:t>
+      </w:r>
+      <w:r>
+        <w:rPr>
+          <w:rFonts w:hint="eastAsia"/>
+          <w:lang w:eastAsia="ko-KR"/>
+        </w:rPr>
+        <w:t>r</w:t>
+      </w:r>
+      <w:r>
+        <w:rPr>
+          <w:lang w:eastAsia="ko-KR"/>
+        </w:rPr>
+        <w:t xml:space="preserve">easoning in </w:t>
+      </w:r>
+      <w:r>
+        <w:rPr>
+          <w:rFonts w:hint="eastAsia"/>
+          <w:lang w:eastAsia="ko-KR"/>
+        </w:rPr>
+        <w:t>h</w:t>
+      </w:r>
+      <w:r>
+        <w:rPr>
+          <w:lang w:eastAsia="ko-KR"/>
+        </w:rPr>
+        <w:t xml:space="preserve">igher </w:t>
+      </w:r>
+      <w:r>
+        <w:rPr>
+          <w:rFonts w:hint="eastAsia"/>
+          <w:lang w:eastAsia="ko-KR"/>
+        </w:rPr>
+        <w:t>e</w:t>
+      </w:r>
+      <w:r>
+        <w:rPr>
+          <w:lang w:eastAsia="ko-KR"/>
+        </w:rPr>
+        <w:t xml:space="preserve">ducation: A </w:t>
+      </w:r>
+      <w:r>
+        <w:rPr>
+          <w:rFonts w:hint="eastAsia"/>
+          <w:lang w:eastAsia="ko-KR"/>
+        </w:rPr>
+        <w:t>d</w:t>
+      </w:r>
+      <w:r>
+        <w:rPr>
+          <w:lang w:eastAsia="ko-KR"/>
+        </w:rPr>
+        <w:t>ilemma-</w:t>
+      </w:r>
+      <w:r>
+        <w:rPr>
+          <w:rFonts w:hint="eastAsia"/>
+          <w:lang w:eastAsia="ko-KR"/>
+        </w:rPr>
+        <w:t>c</w:t>
+      </w:r>
+      <w:r>
+        <w:rPr>
+          <w:lang w:eastAsia="ko-KR"/>
+        </w:rPr>
+        <w:t xml:space="preserve">entered </w:t>
+      </w:r>
+      <w:r>
+        <w:rPr>
+          <w:rFonts w:hint="eastAsia"/>
+          <w:lang w:eastAsia="ko-KR"/>
+        </w:rPr>
+        <w:t>l</w:t>
+      </w:r>
+      <w:r>
+        <w:rPr>
+          <w:lang w:eastAsia="ko-KR"/>
+        </w:rPr>
+        <w:t xml:space="preserve">earning </w:t>
+      </w:r>
+      <w:r>
+        <w:rPr>
+          <w:rFonts w:hint="eastAsia"/>
+          <w:lang w:eastAsia="ko-KR"/>
+        </w:rPr>
+        <w:t>a</w:t>
+      </w:r>
+      <w:r>
+        <w:rPr>
+          <w:lang w:eastAsia="ko-KR"/>
+        </w:rPr>
+        <w:t xml:space="preserve">pproach via </w:t>
+      </w:r>
+      <w:r>
+        <w:rPr>
+          <w:rFonts w:hint="eastAsia"/>
+          <w:lang w:eastAsia="ko-KR"/>
+        </w:rPr>
+        <w:t>i</w:t>
+      </w:r>
+      <w:r>
+        <w:rPr>
+          <w:lang w:eastAsia="ko-KR"/>
+        </w:rPr>
+        <w:t>ll-</w:t>
+      </w:r>
+      <w:r>
+        <w:rPr>
+          <w:rFonts w:hint="eastAsia"/>
+          <w:lang w:eastAsia="ko-KR"/>
+        </w:rPr>
+        <w:t>s</w:t>
+      </w:r>
+      <w:r>
+        <w:rPr>
+          <w:lang w:eastAsia="ko-KR"/>
+        </w:rPr>
+        <w:t xml:space="preserve">tructured </w:t>
+      </w:r>
+      <w:r>
+        <w:rPr>
+          <w:rFonts w:hint="eastAsia"/>
+          <w:lang w:eastAsia="ko-KR"/>
+        </w:rPr>
+        <w:t>p</w:t>
+      </w:r>
+      <w:r>
+        <w:rPr>
+          <w:lang w:eastAsia="ko-KR"/>
+        </w:rPr>
+        <w:t xml:space="preserve">roblem </w:t>
+      </w:r>
+      <w:r>
+        <w:rPr>
+          <w:rFonts w:hint="eastAsia"/>
+          <w:lang w:eastAsia="ko-KR"/>
+        </w:rPr>
+        <w:t>p</w:t>
+      </w:r>
+      <w:r>
+        <w:rPr>
+          <w:lang w:eastAsia="ko-KR"/>
+        </w:rPr>
+        <w:t>edagogy</w:t>
+      </w:r>
+      <w:r>
+        <w:rPr>
+          <w:rFonts w:hint="eastAsia"/>
+          <w:lang w:eastAsia="ko-KR"/>
+        </w:rPr>
+        <w:t xml:space="preserve">. </w:t>
+      </w:r>
+      <w:r>
+        <w:rPr>
+          <w:rFonts w:hint="eastAsia"/>
+          <w:i/>
+          <w:iCs/>
+          <w:lang w:eastAsia="ko-KR"/>
+        </w:rPr>
+        <w:t>AI &amp; Society</w:t>
+      </w:r>
+      <w:r>
+        <w:rPr>
+          <w:rFonts w:hint="eastAsia"/>
+          <w:lang w:eastAsia="ko-KR"/>
+        </w:rPr>
+        <w:t xml:space="preserve">. </w:t>
+      </w:r>
+      <w:r>
+        <w:rPr>
+          <w:b/>
+          <w:bCs/>
+          <w:i/>
+          <w:iCs/>
+        </w:rPr>
+        <w:t>(</w:t>
+      </w:r>
+      <w:r>
+        <w:rPr>
+          <w:rFonts w:hint="eastAsia"/>
+          <w:b/>
+          <w:i/>
+          <w:iCs/>
+          <w:lang w:eastAsia="ko-KR"/>
+        </w:rPr>
+        <w:t>ESCI</w:t>
+      </w:r>
+      <w:r>
+        <w:rPr>
+          <w:rFonts w:hint="eastAsia"/>
+          <w:b/>
+          <w:i/>
+          <w:iCs/>
+          <w:lang w:eastAsia="ko-KR"/>
+        </w:rPr>
+        <w:t>-indexed</w:t>
+      </w:r>
+      <w:r>
+        <w:rPr>
+          <w:b/>
+          <w:bCs/>
+          <w:i/>
+          <w:iCs/>
+        </w:rPr>
+        <w:t xml:space="preserve">, IF = </w:t>
+      </w:r>
+      <w:r>
+        <w:rPr>
+          <w:rFonts w:hint="eastAsia"/>
+          <w:b/>
+          <w:bCs/>
+          <w:i/>
+          <w:iCs/>
+          <w:lang w:eastAsia="ko-KR"/>
+        </w:rPr>
+        <w:t xml:space="preserve">6.1, </w:t>
+      </w:r>
+      <w:r>
+        <w:rPr>
+          <w:b/>
+          <w:bCs/>
+          <w:i/>
+          <w:iCs/>
+        </w:rPr>
+        <w:t>IF</w:t>
+      </w:r>
+      <w:r>
+        <w:rPr>
+          <w:rFonts w:hint="eastAsia"/>
+          <w:b/>
+          <w:bCs/>
+          <w:i/>
+          <w:iCs/>
+          <w:lang w:eastAsia="ko-KR"/>
+        </w:rPr>
+        <w:t>5</w:t>
+      </w:r>
+      <w:r>
+        <w:rPr>
+          <w:b/>
+          <w:bCs/>
+          <w:i/>
+          <w:iCs/>
+        </w:rPr>
+        <w:t xml:space="preserve"> = </w:t>
+      </w:r>
+      <w:r>
+        <w:rPr>
+          <w:rFonts w:hint="eastAsia"/>
+          <w:b/>
+          <w:bCs/>
+          <w:i/>
+          <w:iCs/>
+          <w:lang w:eastAsia="ko-KR"/>
+        </w:rPr>
+        <w:t>2.1</w:t>
+      </w:r>
+      <w:r>
+        <w:rPr>
+          <w:b/>
+          <w:bCs/>
+          <w:i/>
+          <w:iCs/>
+        </w:rPr>
+        <w:t>)</w:t>
+      </w:r>
+      <w:r>
+        <w:rPr>
+          <w:rFonts w:hint="eastAsia"/>
+          <w:b/>
+          <w:bCs/>
+          <w:i/>
+          <w:iCs/>
+          <w:lang w:eastAsia="ko-KR"/>
+        </w:rPr>
+        <w:t xml:space="preserve"> </w:t>
       </w:r>
     </w:p>
     <w:p>

</xml_diff>

<commit_message>
Reconcile international journal subtotal and citation numbering
Verified 59 international journal records plus 3 Korean-written journal records = 62 total. Renumber international entries 59 through 1 after prior removals. Preserve all citations and Under Review status.
</commit_message>
<xml_diff>
--- a/CV_202605_MOON.docx
+++ b/CV_202605_MOON.docx
@@ -7856,7 +7856,7 @@
           <w:szCs w:val="26"/>
           <w:u w:val="single"/>
         </w:rPr>
-        <w:t xml:space="preserve">International and Peer-reviewed (n = 61)</w:t>
+        <w:t xml:space="preserve">International and Peer-reviewed (n = 59)</w:t>
       </w:r>
       <w:r>
         <w:rPr>
@@ -7906,7 +7906,7 @@
           <w:rFonts w:hint="eastAsia"/>
           <w:lang w:eastAsia="ko-KR"/>
         </w:rPr>
-        <w:t xml:space="preserve">[61] </w:t>
+        <w:t xml:space="preserve">[59] </w:t>
       </w:r>
       <w:r>
         <w:t xml:space="preserve">‡ </w:t>
@@ -8115,21 +8115,21 @@
           <w:rFonts w:hint="eastAsia"/>
           <w:lang w:eastAsia="ko-KR"/>
         </w:rPr>
-        <w:t>[</w:t>
-      </w:r>
-      <w:r>
-        <w:rPr>
-          <w:rFonts w:hint="eastAsia"/>
-          <w:lang w:eastAsia="ko-KR"/>
-        </w:rPr>
-        <w:t>60</w:t>
-      </w:r>
-      <w:r>
-        <w:rPr>
-          <w:rFonts w:hint="eastAsia"/>
-          <w:lang w:eastAsia="ko-KR"/>
-        </w:rPr>
-        <w:t xml:space="preserve">] Aldemir, T., Bicer, Al., Kilinc, S., </w:t>
+        <w:t>[58]</w:t>
+      </w:r>
+      <w:r>
+        <w:rPr>
+          <w:rFonts w:hint="eastAsia"/>
+          <w:lang w:eastAsia="ko-KR"/>
+        </w:rPr>
+        <w:t/>
+      </w:r>
+      <w:r>
+        <w:rPr>
+          <w:rFonts w:hint="eastAsia"/>
+          <w:lang w:eastAsia="ko-KR"/>
+        </w:rPr>
+        <w:t xml:space="preserve"> Aldemir, T., Bicer, Al., Kilinc, S., </w:t>
       </w:r>
       <w:r>
         <w:rPr>
@@ -8314,21 +8314,21 @@
           <w:rFonts w:hint="eastAsia"/>
           <w:lang w:eastAsia="ko-KR"/>
         </w:rPr>
-        <w:t>[</w:t>
-      </w:r>
-      <w:r>
-        <w:rPr>
-          <w:rFonts w:hint="eastAsia"/>
-          <w:lang w:eastAsia="ko-KR"/>
-        </w:rPr>
-        <w:t>59</w:t>
-      </w:r>
-      <w:r>
-        <w:rPr>
-          <w:rFonts w:hint="eastAsia"/>
-          <w:lang w:eastAsia="ko-KR"/>
-        </w:rPr>
-        <w:t xml:space="preserve">] </w:t>
+        <w:t>[57]</w:t>
+      </w:r>
+      <w:r>
+        <w:rPr>
+          <w:rFonts w:hint="eastAsia"/>
+          <w:lang w:eastAsia="ko-KR"/>
+        </w:rPr>
+        <w:t/>
+      </w:r>
+      <w:r>
+        <w:rPr>
+          <w:rFonts w:hint="eastAsia"/>
+          <w:lang w:eastAsia="ko-KR"/>
+        </w:rPr>
+        <w:t xml:space="preserve"> </w:t>
       </w:r>
       <w:r>
         <w:t>*</w:t>
@@ -8674,28 +8674,28 @@
           <w:rFonts w:hint="eastAsia"/>
           <w:lang w:eastAsia="ko-KR"/>
         </w:rPr>
-        <w:t>[</w:t>
-      </w:r>
-      <w:r>
-        <w:rPr>
-          <w:rFonts w:hint="eastAsia"/>
-          <w:lang w:eastAsia="ko-KR"/>
-        </w:rPr>
-        <w:t>5</w:t>
-      </w:r>
-      <w:r>
-        <w:rPr>
-          <w:rFonts w:hint="eastAsia"/>
-          <w:lang w:eastAsia="ko-KR"/>
-        </w:rPr>
-        <w:t>8</w:t>
-      </w:r>
-      <w:r>
-        <w:rPr>
-          <w:rFonts w:hint="eastAsia"/>
-          <w:lang w:eastAsia="ko-KR"/>
-        </w:rPr>
-        <w:t xml:space="preserve">] Bicer, A., Aldemir, T., Lee, U., </w:t>
+        <w:t>[56]</w:t>
+      </w:r>
+      <w:r>
+        <w:rPr>
+          <w:rFonts w:hint="eastAsia"/>
+          <w:lang w:eastAsia="ko-KR"/>
+        </w:rPr>
+        <w:t/>
+      </w:r>
+      <w:r>
+        <w:rPr>
+          <w:rFonts w:hint="eastAsia"/>
+          <w:lang w:eastAsia="ko-KR"/>
+        </w:rPr>
+        <w:t/>
+      </w:r>
+      <w:r>
+        <w:rPr>
+          <w:rFonts w:hint="eastAsia"/>
+          <w:lang w:eastAsia="ko-KR"/>
+        </w:rPr>
+        <w:t xml:space="preserve"> Bicer, A., Aldemir, T., Lee, U., </w:t>
       </w:r>
       <w:r>
         <w:rPr>
@@ -9131,24 +9131,24 @@
         </w:rPr>
       </w:pPr>
       <w:r>
-        <w:t>[</w:t>
-      </w:r>
-      <w:r>
-        <w:rPr>
-          <w:rFonts w:hint="eastAsia"/>
-          <w:lang w:eastAsia="ko-KR"/>
-        </w:rPr>
-        <w:t>5</w:t>
-      </w:r>
-      <w:r>
-        <w:rPr>
-          <w:rFonts w:hint="eastAsia"/>
-          <w:lang w:eastAsia="ko-KR"/>
-        </w:rPr>
-        <w:t>7</w:t>
-      </w:r>
-      <w:r>
-        <w:t xml:space="preserve">] </w:t>
+        <w:t>[55]</w:t>
+      </w:r>
+      <w:r>
+        <w:rPr>
+          <w:rFonts w:hint="eastAsia"/>
+          <w:lang w:eastAsia="ko-KR"/>
+        </w:rPr>
+        <w:t/>
+      </w:r>
+      <w:r>
+        <w:rPr>
+          <w:rFonts w:hint="eastAsia"/>
+          <w:lang w:eastAsia="ko-KR"/>
+        </w:rPr>
+        <w:t/>
+      </w:r>
+      <w:r>
+        <w:t xml:space="preserve"> </w:t>
       </w:r>
       <w:r>
         <w:rPr>
@@ -9455,28 +9455,28 @@
           <w:rFonts w:hint="eastAsia"/>
           <w:lang w:eastAsia="ko-KR"/>
         </w:rPr>
-        <w:t>[</w:t>
-      </w:r>
-      <w:r>
-        <w:rPr>
-          <w:rFonts w:hint="eastAsia"/>
-          <w:lang w:eastAsia="ko-KR"/>
-        </w:rPr>
-        <w:t>5</w:t>
-      </w:r>
-      <w:r>
-        <w:rPr>
-          <w:rFonts w:hint="eastAsia"/>
-          <w:lang w:eastAsia="ko-KR"/>
-        </w:rPr>
-        <w:t>6</w:t>
-      </w:r>
-      <w:r>
-        <w:rPr>
-          <w:rFonts w:hint="eastAsia"/>
-          <w:lang w:eastAsia="ko-KR"/>
-        </w:rPr>
-        <w:t xml:space="preserve">] Lee, Y. J., </w:t>
+        <w:t>[54]</w:t>
+      </w:r>
+      <w:r>
+        <w:rPr>
+          <w:rFonts w:hint="eastAsia"/>
+          <w:lang w:eastAsia="ko-KR"/>
+        </w:rPr>
+        <w:t/>
+      </w:r>
+      <w:r>
+        <w:rPr>
+          <w:rFonts w:hint="eastAsia"/>
+          <w:lang w:eastAsia="ko-KR"/>
+        </w:rPr>
+        <w:t/>
+      </w:r>
+      <w:r>
+        <w:rPr>
+          <w:rFonts w:hint="eastAsia"/>
+          <w:lang w:eastAsia="ko-KR"/>
+        </w:rPr>
+        <w:t xml:space="preserve"> Lee, Y. J., </w:t>
       </w:r>
       <w:r>
         <w:rPr>
@@ -9730,7 +9730,7 @@
           <w:rFonts w:hint="eastAsia"/>
           <w:lang w:eastAsia="ko-KR"/>
         </w:rPr>
-        <w:t xml:space="preserve">[54] </w:t>
+        <w:t xml:space="preserve">[53] </w:t>
       </w:r>
       <w:r>
         <w:rPr>
@@ -10034,21 +10034,21 @@
           <w:rFonts w:hint="eastAsia"/>
           <w:lang w:eastAsia="ko-KR"/>
         </w:rPr>
-        <w:t>[5</w:t>
-      </w:r>
-      <w:r>
-        <w:rPr>
-          <w:rFonts w:hint="eastAsia"/>
-          <w:lang w:eastAsia="ko-KR"/>
-        </w:rPr>
-        <w:t>3</w:t>
-      </w:r>
-      <w:r>
-        <w:rPr>
-          <w:rFonts w:hint="eastAsia"/>
-          <w:lang w:eastAsia="ko-KR"/>
-        </w:rPr>
-        <w:t xml:space="preserve">] </w:t>
+        <w:t>[52]</w:t>
+      </w:r>
+      <w:r>
+        <w:rPr>
+          <w:rFonts w:hint="eastAsia"/>
+          <w:lang w:eastAsia="ko-KR"/>
+        </w:rPr>
+        <w:t/>
+      </w:r>
+      <w:r>
+        <w:rPr>
+          <w:rFonts w:hint="eastAsia"/>
+          <w:lang w:eastAsia="ko-KR"/>
+        </w:rPr>
+        <w:t xml:space="preserve"> </w:t>
       </w:r>
       <w:r>
         <w:t>*</w:t>
@@ -10326,7 +10326,7 @@
         <w:rPr>
           <w:lang w:eastAsia="ko-KR"/>
         </w:rPr>
-        <w:t xml:space="preserve">[52] </w:t>
+        <w:t xml:space="preserve">[51] </w:t>
       </w:r>
       <w:r>
         <w:t>*</w:t>
@@ -10519,20 +10519,20 @@
           <w:rFonts w:hint="eastAsia"/>
           <w:lang w:eastAsia="ko-KR"/>
         </w:rPr>
-        <w:t>[5</w:t>
-      </w:r>
-      <w:r>
-        <w:rPr>
-          <w:lang w:eastAsia="ko-KR"/>
-        </w:rPr>
-        <w:t>0</w:t>
-      </w:r>
-      <w:r>
-        <w:rPr>
-          <w:rFonts w:hint="eastAsia"/>
-          <w:lang w:eastAsia="ko-KR"/>
-        </w:rPr>
-        <w:t xml:space="preserve">] </w:t>
+        <w:t>[50]</w:t>
+      </w:r>
+      <w:r>
+        <w:rPr>
+          <w:lang w:eastAsia="ko-KR"/>
+        </w:rPr>
+        <w:t/>
+      </w:r>
+      <w:r>
+        <w:rPr>
+          <w:rFonts w:hint="eastAsia"/>
+          <w:lang w:eastAsia="ko-KR"/>
+        </w:rPr>
+        <w:t xml:space="preserve"> </w:t>
       </w:r>
       <w:r>
         <w:rPr>
@@ -10787,21 +10787,21 @@
         <w:rPr>
           <w:bCs/>
         </w:rPr>
-        <w:t>[</w:t>
-      </w:r>
-      <w:r>
-        <w:rPr>
-          <w:rFonts w:hint="eastAsia"/>
-          <w:bCs/>
-          <w:lang w:eastAsia="ko-KR"/>
-        </w:rPr>
-        <w:t>49</w:t>
-      </w:r>
-      <w:r>
-        <w:rPr>
-          <w:bCs/>
-        </w:rPr>
-        <w:t xml:space="preserve">] Hong, S., Eom, T., &amp; </w:t>
+        <w:t>[49]</w:t>
+      </w:r>
+      <w:r>
+        <w:rPr>
+          <w:rFonts w:hint="eastAsia"/>
+          <w:bCs/>
+          <w:lang w:eastAsia="ko-KR"/>
+        </w:rPr>
+        <w:t/>
+      </w:r>
+      <w:r>
+        <w:rPr>
+          <w:bCs/>
+        </w:rPr>
+        <w:t xml:space="preserve"> Hong, S., Eom, T., &amp; </w:t>
       </w:r>
       <w:r>
         <w:rPr>
@@ -11181,21 +11181,21 @@
           <w:rFonts w:hint="eastAsia"/>
           <w:lang w:eastAsia="ko-KR"/>
         </w:rPr>
-        <w:t>[</w:t>
-      </w:r>
-      <w:r>
-        <w:rPr>
-          <w:rFonts w:hint="eastAsia"/>
-          <w:lang w:eastAsia="ko-KR"/>
-        </w:rPr>
-        <w:t>48</w:t>
-      </w:r>
-      <w:r>
-        <w:rPr>
-          <w:rFonts w:hint="eastAsia"/>
-          <w:lang w:eastAsia="ko-KR"/>
-        </w:rPr>
-        <w:t>] Aldemir, T., Kilinc, S., Bicer, A., Moon, J., &amp; Kwok, M. (</w:t>
+        <w:t>[48]</w:t>
+      </w:r>
+      <w:r>
+        <w:rPr>
+          <w:rFonts w:hint="eastAsia"/>
+          <w:lang w:eastAsia="ko-KR"/>
+        </w:rPr>
+        <w:t/>
+      </w:r>
+      <w:r>
+        <w:rPr>
+          <w:rFonts w:hint="eastAsia"/>
+          <w:lang w:eastAsia="ko-KR"/>
+        </w:rPr>
+        <w:t> Aldemir, T., Kilinc, S., Bicer, A., Moon, J., &amp; Kwok, M. (</w:t>
       </w:r>
       <w:r>
         <w:rPr>
@@ -11531,23 +11531,23 @@
           <w:bCs/>
           <w:lang w:eastAsia="ko-KR"/>
         </w:rPr>
-        <w:t>[</w:t>
-      </w:r>
-      <w:r>
-        <w:rPr>
-          <w:rFonts w:hint="eastAsia"/>
-          <w:bCs/>
-          <w:lang w:eastAsia="ko-KR"/>
-        </w:rPr>
-        <w:t>47</w:t>
-      </w:r>
-      <w:r>
-        <w:rPr>
-          <w:rFonts w:hint="eastAsia"/>
-          <w:bCs/>
-          <w:lang w:eastAsia="ko-KR"/>
-        </w:rPr>
-        <w:t xml:space="preserve">] </w:t>
+        <w:t>[47]</w:t>
+      </w:r>
+      <w:r>
+        <w:rPr>
+          <w:rFonts w:hint="eastAsia"/>
+          <w:bCs/>
+          <w:lang w:eastAsia="ko-KR"/>
+        </w:rPr>
+        <w:t/>
+      </w:r>
+      <w:r>
+        <w:rPr>
+          <w:rFonts w:hint="eastAsia"/>
+          <w:bCs/>
+          <w:lang w:eastAsia="ko-KR"/>
+        </w:rPr>
+        <w:t xml:space="preserve"> </w:t>
       </w:r>
       <w:r>
         <w:t>*</w:t>
@@ -11960,21 +11960,21 @@
           <w:rFonts w:hint="eastAsia"/>
           <w:lang w:eastAsia="ko-KR"/>
         </w:rPr>
-        <w:t>[</w:t>
-      </w:r>
-      <w:r>
-        <w:rPr>
-          <w:rFonts w:hint="eastAsia"/>
-          <w:lang w:eastAsia="ko-KR"/>
-        </w:rPr>
-        <w:t>46</w:t>
-      </w:r>
-      <w:r>
-        <w:rPr>
-          <w:rFonts w:hint="eastAsia"/>
-          <w:lang w:eastAsia="ko-KR"/>
-        </w:rPr>
-        <w:t xml:space="preserve">] </w:t>
+        <w:t>[46]</w:t>
+      </w:r>
+      <w:r>
+        <w:rPr>
+          <w:rFonts w:hint="eastAsia"/>
+          <w:lang w:eastAsia="ko-KR"/>
+        </w:rPr>
+        <w:t/>
+      </w:r>
+      <w:r>
+        <w:rPr>
+          <w:rFonts w:hint="eastAsia"/>
+          <w:lang w:eastAsia="ko-KR"/>
+        </w:rPr>
+        <w:t xml:space="preserve"> </w:t>
       </w:r>
       <w:r>
         <w:t>*</w:t>
@@ -12249,23 +12249,23 @@
           <w:bCs/>
           <w:lang w:eastAsia="ko-KR"/>
         </w:rPr>
-        <w:t>[4</w:t>
-      </w:r>
-      <w:r>
-        <w:rPr>
-          <w:rFonts w:hint="eastAsia"/>
-          <w:bCs/>
-          <w:lang w:eastAsia="ko-KR"/>
-        </w:rPr>
-        <w:t>5</w:t>
-      </w:r>
-      <w:r>
-        <w:rPr>
-          <w:rFonts w:hint="eastAsia"/>
-          <w:bCs/>
-          <w:lang w:eastAsia="ko-KR"/>
-        </w:rPr>
-        <w:t xml:space="preserve">] </w:t>
+        <w:t>[45]</w:t>
+      </w:r>
+      <w:r>
+        <w:rPr>
+          <w:rFonts w:hint="eastAsia"/>
+          <w:bCs/>
+          <w:lang w:eastAsia="ko-KR"/>
+        </w:rPr>
+        <w:t/>
+      </w:r>
+      <w:r>
+        <w:rPr>
+          <w:rFonts w:hint="eastAsia"/>
+          <w:bCs/>
+          <w:lang w:eastAsia="ko-KR"/>
+        </w:rPr>
+        <w:t xml:space="preserve"> </w:t>
       </w:r>
       <w:r>
         <w:rPr>
@@ -13050,21 +13050,21 @@
         <w:rPr>
           <w:bCs/>
         </w:rPr>
-        <w:t>[</w:t>
-      </w:r>
-      <w:r>
-        <w:rPr>
-          <w:rFonts w:hint="eastAsia"/>
-          <w:bCs/>
-          <w:lang w:eastAsia="ko-KR"/>
-        </w:rPr>
-        <w:t>43</w:t>
-      </w:r>
-      <w:r>
-        <w:rPr>
-          <w:bCs/>
-        </w:rPr>
-        <w:t xml:space="preserve">] </w:t>
+        <w:t>[43]</w:t>
+      </w:r>
+      <w:r>
+        <w:rPr>
+          <w:rFonts w:hint="eastAsia"/>
+          <w:bCs/>
+          <w:lang w:eastAsia="ko-KR"/>
+        </w:rPr>
+        <w:t/>
+      </w:r>
+      <w:r>
+        <w:rPr>
+          <w:bCs/>
+        </w:rPr>
+        <w:t xml:space="preserve"> </w:t>
       </w:r>
       <w:r>
         <w:rPr>
@@ -13536,20 +13536,20 @@
         <w:rPr>
           <w:lang w:eastAsia="ko-KR"/>
         </w:rPr>
-        <w:t>[</w:t>
-      </w:r>
-      <w:r>
-        <w:rPr>
-          <w:rFonts w:hint="eastAsia"/>
-          <w:lang w:eastAsia="ko-KR"/>
-        </w:rPr>
-        <w:t>42</w:t>
-      </w:r>
-      <w:r>
-        <w:rPr>
-          <w:lang w:eastAsia="ko-KR"/>
-        </w:rPr>
-        <w:t>] Park, Y., </w:t>
+        <w:t>[42]</w:t>
+      </w:r>
+      <w:r>
+        <w:rPr>
+          <w:rFonts w:hint="eastAsia"/>
+          <w:lang w:eastAsia="ko-KR"/>
+        </w:rPr>
+        <w:t/>
+      </w:r>
+      <w:r>
+        <w:rPr>
+          <w:lang w:eastAsia="ko-KR"/>
+        </w:rPr>
+        <w:t> Park, Y., </w:t>
       </w:r>
       <w:r>
         <w:rPr>
@@ -13754,23 +13754,23 @@
           <w:bCs/>
           <w:lang w:eastAsia="ko-KR"/>
         </w:rPr>
-        <w:t>[4</w:t>
-      </w:r>
-      <w:r>
-        <w:rPr>
-          <w:rFonts w:hint="eastAsia"/>
-          <w:bCs/>
-          <w:lang w:eastAsia="ko-KR"/>
-        </w:rPr>
-        <w:t>1</w:t>
-      </w:r>
-      <w:r>
-        <w:rPr>
-          <w:rFonts w:hint="eastAsia"/>
-          <w:bCs/>
-          <w:lang w:eastAsia="ko-KR"/>
-        </w:rPr>
-        <w:t xml:space="preserve">] Marchiori, R., Song, S., &amp; </w:t>
+        <w:t>[41]</w:t>
+      </w:r>
+      <w:r>
+        <w:rPr>
+          <w:rFonts w:hint="eastAsia"/>
+          <w:bCs/>
+          <w:lang w:eastAsia="ko-KR"/>
+        </w:rPr>
+        <w:t/>
+      </w:r>
+      <w:r>
+        <w:rPr>
+          <w:rFonts w:hint="eastAsia"/>
+          <w:bCs/>
+          <w:lang w:eastAsia="ko-KR"/>
+        </w:rPr>
+        <w:t xml:space="preserve"> Marchiori, R., Song, S., &amp; </w:t>
       </w:r>
       <w:r>
         <w:rPr>
@@ -14197,24 +14197,24 @@
         </w:rPr>
       </w:pPr>
       <w:r>
-        <w:t>[</w:t>
-      </w:r>
-      <w:r>
-        <w:rPr>
-          <w:rFonts w:hint="eastAsia"/>
-          <w:lang w:eastAsia="ko-KR"/>
-        </w:rPr>
-        <w:t>4</w:t>
-      </w:r>
-      <w:r>
-        <w:rPr>
-          <w:rFonts w:hint="eastAsia"/>
-          <w:lang w:eastAsia="ko-KR"/>
-        </w:rPr>
-        <w:t>0</w:t>
-      </w:r>
-      <w:r>
-        <w:t xml:space="preserve">] </w:t>
+        <w:t>[40]</w:t>
+      </w:r>
+      <w:r>
+        <w:rPr>
+          <w:rFonts w:hint="eastAsia"/>
+          <w:lang w:eastAsia="ko-KR"/>
+        </w:rPr>
+        <w:t/>
+      </w:r>
+      <w:r>
+        <w:rPr>
+          <w:rFonts w:hint="eastAsia"/>
+          <w:lang w:eastAsia="ko-KR"/>
+        </w:rPr>
+        <w:t/>
+      </w:r>
+      <w:r>
+        <w:t xml:space="preserve"> </w:t>
       </w:r>
       <w:r>
         <w:rPr>
@@ -14455,21 +14455,21 @@
           <w:bCs/>
           <w:lang w:eastAsia="ko-KR"/>
         </w:rPr>
-        <w:t>[</w:t>
-      </w:r>
-      <w:r>
-        <w:rPr>
-          <w:rFonts w:hint="eastAsia"/>
-          <w:bCs/>
-          <w:lang w:eastAsia="ko-KR"/>
-        </w:rPr>
-        <w:t>39</w:t>
-      </w:r>
-      <w:r>
-        <w:rPr>
-          <w:bCs/>
-        </w:rPr>
-        <w:t xml:space="preserve">] Lee, U., Jung, Y., Koh, J., Lee, Y., Byun, G., Lee, H., Eun, S., </w:t>
+        <w:t>[39]</w:t>
+      </w:r>
+      <w:r>
+        <w:rPr>
+          <w:rFonts w:hint="eastAsia"/>
+          <w:bCs/>
+          <w:lang w:eastAsia="ko-KR"/>
+        </w:rPr>
+        <w:t/>
+      </w:r>
+      <w:r>
+        <w:rPr>
+          <w:bCs/>
+        </w:rPr>
+        <w:t xml:space="preserve"> Lee, U., Jung, Y., Koh, J., Lee, Y., Byun, G., Lee, H., Eun, S., </w:t>
       </w:r>
       <w:r>
         <w:rPr>
@@ -14577,21 +14577,21 @@
           <w:rFonts w:hint="eastAsia"/>
           <w:lang w:eastAsia="ko-KR"/>
         </w:rPr>
-        <w:t>[3</w:t>
-      </w:r>
-      <w:r>
-        <w:rPr>
-          <w:rFonts w:hint="eastAsia"/>
-          <w:lang w:eastAsia="ko-KR"/>
-        </w:rPr>
-        <w:t>8</w:t>
-      </w:r>
-      <w:r>
-        <w:rPr>
-          <w:rFonts w:hint="eastAsia"/>
-          <w:lang w:eastAsia="ko-KR"/>
-        </w:rPr>
-        <w:t xml:space="preserve">] </w:t>
+        <w:t>[38]</w:t>
+      </w:r>
+      <w:r>
+        <w:rPr>
+          <w:rFonts w:hint="eastAsia"/>
+          <w:lang w:eastAsia="ko-KR"/>
+        </w:rPr>
+        <w:t/>
+      </w:r>
+      <w:r>
+        <w:rPr>
+          <w:rFonts w:hint="eastAsia"/>
+          <w:lang w:eastAsia="ko-KR"/>
+        </w:rPr>
+        <w:t xml:space="preserve"> </w:t>
       </w:r>
       <w:r>
         <w:rPr>
@@ -14745,21 +14745,21 @@
           <w:rFonts w:hint="eastAsia"/>
           <w:lang w:eastAsia="ko-KR"/>
         </w:rPr>
-        <w:t>[3</w:t>
-      </w:r>
-      <w:r>
-        <w:rPr>
-          <w:rFonts w:hint="eastAsia"/>
-          <w:lang w:eastAsia="ko-KR"/>
-        </w:rPr>
-        <w:t>7</w:t>
-      </w:r>
-      <w:r>
-        <w:rPr>
-          <w:rFonts w:hint="eastAsia"/>
-          <w:lang w:eastAsia="ko-KR"/>
-        </w:rPr>
-        <w:t xml:space="preserve">] </w:t>
+        <w:t>[37]</w:t>
+      </w:r>
+      <w:r>
+        <w:rPr>
+          <w:rFonts w:hint="eastAsia"/>
+          <w:lang w:eastAsia="ko-KR"/>
+        </w:rPr>
+        <w:t/>
+      </w:r>
+      <w:r>
+        <w:rPr>
+          <w:rFonts w:hint="eastAsia"/>
+          <w:lang w:eastAsia="ko-KR"/>
+        </w:rPr>
+        <w:t xml:space="preserve"> </w:t>
       </w:r>
       <w:r>
         <w:rPr>
@@ -14950,21 +14950,21 @@
           <w:rFonts w:hint="eastAsia"/>
           <w:lang w:eastAsia="ko-KR"/>
         </w:rPr>
-        <w:t>[3</w:t>
-      </w:r>
-      <w:r>
-        <w:rPr>
-          <w:rFonts w:hint="eastAsia"/>
-          <w:lang w:eastAsia="ko-KR"/>
-        </w:rPr>
-        <w:t>6</w:t>
-      </w:r>
-      <w:r>
-        <w:rPr>
-          <w:rFonts w:hint="eastAsia"/>
-          <w:lang w:eastAsia="ko-KR"/>
-        </w:rPr>
-        <w:t xml:space="preserve">] </w:t>
+        <w:t>[36]</w:t>
+      </w:r>
+      <w:r>
+        <w:rPr>
+          <w:rFonts w:hint="eastAsia"/>
+          <w:lang w:eastAsia="ko-KR"/>
+        </w:rPr>
+        <w:t/>
+      </w:r>
+      <w:r>
+        <w:rPr>
+          <w:rFonts w:hint="eastAsia"/>
+          <w:lang w:eastAsia="ko-KR"/>
+        </w:rPr>
+        <w:t xml:space="preserve"> </w:t>
       </w:r>
       <w:r>
         <w:rPr>
@@ -15127,21 +15127,21 @@
           <w:rFonts w:hint="eastAsia"/>
           <w:lang w:eastAsia="ko-KR"/>
         </w:rPr>
-        <w:t>[3</w:t>
-      </w:r>
-      <w:r>
-        <w:rPr>
-          <w:rFonts w:hint="eastAsia"/>
-          <w:lang w:eastAsia="ko-KR"/>
-        </w:rPr>
-        <w:t>5</w:t>
-      </w:r>
-      <w:r>
-        <w:rPr>
-          <w:rFonts w:hint="eastAsia"/>
-          <w:lang w:eastAsia="ko-KR"/>
-        </w:rPr>
-        <w:t xml:space="preserve">] </w:t>
+        <w:t>[35]</w:t>
+      </w:r>
+      <w:r>
+        <w:rPr>
+          <w:rFonts w:hint="eastAsia"/>
+          <w:lang w:eastAsia="ko-KR"/>
+        </w:rPr>
+        <w:t/>
+      </w:r>
+      <w:r>
+        <w:rPr>
+          <w:rFonts w:hint="eastAsia"/>
+          <w:lang w:eastAsia="ko-KR"/>
+        </w:rPr>
+        <w:t xml:space="preserve"> </w:t>
       </w:r>
       <w:r>
         <w:rPr>
@@ -15392,27 +15392,27 @@
         <w:rPr>
           <w:bCs/>
         </w:rPr>
-        <w:t>​​​​[</w:t>
-      </w:r>
-      <w:r>
-        <w:rPr>
-          <w:bCs/>
-        </w:rPr>
-        <w:t>3</w:t>
-      </w:r>
-      <w:r>
-        <w:rPr>
-          <w:rFonts w:hint="eastAsia"/>
-          <w:bCs/>
-          <w:lang w:eastAsia="ko-KR"/>
-        </w:rPr>
-        <w:t>4</w:t>
-      </w:r>
-      <w:r>
-        <w:rPr>
-          <w:bCs/>
-        </w:rPr>
-        <w:t xml:space="preserve">] </w:t>
+        <w:t>​​​​[34]</w:t>
+      </w:r>
+      <w:r>
+        <w:rPr>
+          <w:bCs/>
+        </w:rPr>
+        <w:t/>
+      </w:r>
+      <w:r>
+        <w:rPr>
+          <w:rFonts w:hint="eastAsia"/>
+          <w:bCs/>
+          <w:lang w:eastAsia="ko-KR"/>
+        </w:rPr>
+        <w:t/>
+      </w:r>
+      <w:r>
+        <w:rPr>
+          <w:bCs/>
+        </w:rPr>
+        <w:t xml:space="preserve"> </w:t>
       </w:r>
       <w:r>
         <w:rPr>
@@ -15614,27 +15614,27 @@
         <w:rPr>
           <w:bCs/>
         </w:rPr>
-        <w:t>[</w:t>
-      </w:r>
-      <w:r>
-        <w:rPr>
-          <w:bCs/>
-        </w:rPr>
-        <w:t>3</w:t>
-      </w:r>
-      <w:r>
-        <w:rPr>
-          <w:rFonts w:hint="eastAsia"/>
-          <w:bCs/>
-          <w:lang w:eastAsia="ko-KR"/>
-        </w:rPr>
-        <w:t>3</w:t>
-      </w:r>
-      <w:r>
-        <w:rPr>
-          <w:bCs/>
-        </w:rPr>
-        <w:t xml:space="preserve">] </w:t>
+        <w:t>[33]</w:t>
+      </w:r>
+      <w:r>
+        <w:rPr>
+          <w:bCs/>
+        </w:rPr>
+        <w:t/>
+      </w:r>
+      <w:r>
+        <w:rPr>
+          <w:rFonts w:hint="eastAsia"/>
+          <w:bCs/>
+          <w:lang w:eastAsia="ko-KR"/>
+        </w:rPr>
+        <w:t/>
+      </w:r>
+      <w:r>
+        <w:rPr>
+          <w:bCs/>
+        </w:rPr>
+        <w:t xml:space="preserve"> </w:t>
       </w:r>
       <w:r>
         <w:rPr>
@@ -15807,20 +15807,20 @@
         <w:ind w:left="720" w:hanging="720"/>
       </w:pPr>
       <w:r>
-        <w:t>[</w:t>
-      </w:r>
-      <w:r>
-        <w:t>3</w:t>
-      </w:r>
-      <w:r>
-        <w:rPr>
-          <w:rFonts w:hint="eastAsia"/>
-          <w:lang w:eastAsia="ko-KR"/>
-        </w:rPr>
-        <w:t>2</w:t>
-      </w:r>
-      <w:r>
-        <w:t xml:space="preserve">] Choi, G. W., Lim, J., Kim, S., </w:t>
+        <w:t>[32]</w:t>
+      </w:r>
+      <w:r>
+        <w:t/>
+      </w:r>
+      <w:r>
+        <w:rPr>
+          <w:rFonts w:hint="eastAsia"/>
+          <w:lang w:eastAsia="ko-KR"/>
+        </w:rPr>
+        <w:t/>
+      </w:r>
+      <w:r>
+        <w:t xml:space="preserve"> Choi, G. W., Lim, J., Kim, S., </w:t>
       </w:r>
       <w:r>
         <w:rPr>
@@ -16173,25 +16173,25 @@
         <w:rPr>
           <w:bCs/>
         </w:rPr>
-        <w:t>[</w:t>
-      </w:r>
-      <w:r>
-        <w:rPr>
-          <w:bCs/>
-        </w:rPr>
-        <w:t>3</w:t>
-      </w:r>
-      <w:r>
-        <w:rPr>
-          <w:bCs/>
-        </w:rPr>
-        <w:t>0</w:t>
-      </w:r>
-      <w:r>
-        <w:rPr>
-          <w:bCs/>
-        </w:rPr>
-        <w:t xml:space="preserve">] Choi, G. W., Lee, D., Kim, S. H, &amp; </w:t>
+        <w:t>[30]</w:t>
+      </w:r>
+      <w:r>
+        <w:rPr>
+          <w:bCs/>
+        </w:rPr>
+        <w:t/>
+      </w:r>
+      <w:r>
+        <w:rPr>
+          <w:bCs/>
+        </w:rPr>
+        <w:t/>
+      </w:r>
+      <w:r>
+        <w:rPr>
+          <w:bCs/>
+        </w:rPr>
+        <w:t xml:space="preserve"> Choi, G. W., Lee, D., Kim, S. H, &amp; </w:t>
       </w:r>
       <w:r>
         <w:rPr>
@@ -16384,13 +16384,13 @@
         <w:ind w:left="720" w:hanging="720"/>
       </w:pPr>
       <w:r>
-        <w:t>[</w:t>
-      </w:r>
-      <w:r>
-        <w:t>29</w:t>
-      </w:r>
-      <w:r>
-        <w:t xml:space="preserve">] </w:t>
+        <w:t>[29]</w:t>
+      </w:r>
+      <w:r>
+        <w:t/>
+      </w:r>
+      <w:r>
+        <w:t xml:space="preserve"> </w:t>
       </w:r>
       <w:r>
         <w:rPr>
@@ -16539,13 +16539,13 @@
         </w:rPr>
       </w:pPr>
       <w:r>
-        <w:t>[2</w:t>
-      </w:r>
-      <w:r>
-        <w:t>8</w:t>
-      </w:r>
-      <w:r>
-        <w:t xml:space="preserve">] </w:t>
+        <w:t>[28]</w:t>
+      </w:r>
+      <w:r>
+        <w:t/>
+      </w:r>
+      <w:r>
+        <w:t xml:space="preserve"> </w:t>
       </w:r>
       <w:r>
         <w:rPr>
@@ -16651,13 +16651,13 @@
         </w:rPr>
       </w:pPr>
       <w:r>
-        <w:t>[2</w:t>
-      </w:r>
-      <w:r>
-        <w:t>7</w:t>
-      </w:r>
-      <w:r>
-        <w:t xml:space="preserve">] Banihashem, K., Kerman, N. T., Noroozi, O., </w:t>
+        <w:t>[27]</w:t>
+      </w:r>
+      <w:r>
+        <w:t/>
+      </w:r>
+      <w:r>
+        <w:t xml:space="preserve"> Banihashem, K., Kerman, N. T., Noroozi, O., </w:t>
       </w:r>
       <w:r>
         <w:rPr>
@@ -16846,13 +16846,13 @@
         </w:rPr>
       </w:pPr>
       <w:r>
-        <w:t>[2</w:t>
-      </w:r>
-      <w:r>
-        <w:t>6</w:t>
-      </w:r>
-      <w:r>
-        <w:t xml:space="preserve">] </w:t>
+        <w:t>[26]</w:t>
+      </w:r>
+      <w:r>
+        <w:t/>
+      </w:r>
+      <w:r>
+        <w:t xml:space="preserve"> </w:t>
       </w:r>
       <w:r>
         <w:t xml:space="preserve">* </w:t>
@@ -16955,13 +16955,13 @@
         </w:rPr>
       </w:pPr>
       <w:r>
-        <w:t>[2</w:t>
-      </w:r>
-      <w:r>
-        <w:t>5</w:t>
-      </w:r>
-      <w:r>
-        <w:t xml:space="preserve">] Dai, C., Ke, F., Pan, Y., </w:t>
+        <w:t>[25]</w:t>
+      </w:r>
+      <w:r>
+        <w:t/>
+      </w:r>
+      <w:r>
+        <w:t xml:space="preserve"> Dai, C., Ke, F., Pan, Y., </w:t>
       </w:r>
       <w:r>
         <w:rPr>
@@ -17091,13 +17091,13 @@
       </w:pPr>
       <w:r>
         <w:lastRenderedPageBreak/>
-        <w:t>[2</w:t>
-      </w:r>
-      <w:r>
-        <w:t>4</w:t>
-      </w:r>
-      <w:r>
-        <w:t xml:space="preserve">] </w:t>
+        <w:t>[24]</w:t>
+      </w:r>
+      <w:r>
+        <w:t/>
+      </w:r>
+      <w:r>
+        <w:t xml:space="preserve"> </w:t>
       </w:r>
       <w:r>
         <w:rPr>
@@ -17288,13 +17288,13 @@
         <w:ind w:left="720" w:hanging="720"/>
       </w:pPr>
       <w:r>
-        <w:t>[2</w:t>
-      </w:r>
-      <w:r>
-        <w:t>3</w:t>
-      </w:r>
-      <w:r>
-        <w:t xml:space="preserve">] Glaser, N., Schmidt, M., Thull, C., Tennant, A., </w:t>
+        <w:t>[23]</w:t>
+      </w:r>
+      <w:r>
+        <w:t/>
+      </w:r>
+      <w:r>
+        <w:t xml:space="preserve"> Glaser, N., Schmidt, M., Thull, C., Tennant, A., </w:t>
       </w:r>
       <w:r>
         <w:rPr>
@@ -17468,13 +17468,13 @@
         </w:rPr>
       </w:pPr>
       <w:r>
-        <w:t>[2</w:t>
-      </w:r>
-      <w:r>
-        <w:t>2</w:t>
-      </w:r>
-      <w:r>
-        <w:t xml:space="preserve">] </w:t>
+        <w:t>[22]</w:t>
+      </w:r>
+      <w:r>
+        <w:t/>
+      </w:r>
+      <w:r>
+        <w:t xml:space="preserve"> </w:t>
       </w:r>
       <w:r>
         <w:t xml:space="preserve">* </w:t>
@@ -17626,13 +17626,13 @@
         <w:ind w:left="720" w:hanging="720"/>
       </w:pPr>
       <w:r>
-        <w:t>​[2</w:t>
-      </w:r>
-      <w:r>
-        <w:t>1</w:t>
-      </w:r>
-      <w:r>
-        <w:t xml:space="preserve">] </w:t>
+        <w:t>​[21]</w:t>
+      </w:r>
+      <w:r>
+        <w:t/>
+      </w:r>
+      <w:r>
+        <w:t xml:space="preserve"> </w:t>
       </w:r>
       <w:r>
         <w:rPr>
@@ -17861,13 +17861,13 @@
         <w:ind w:left="720" w:hanging="720"/>
       </w:pPr>
       <w:r>
-        <w:t>[2</w:t>
-      </w:r>
-      <w:r>
-        <w:t>0</w:t>
-      </w:r>
-      <w:r>
-        <w:t xml:space="preserve">]  </w:t>
+        <w:t>[20]</w:t>
+      </w:r>
+      <w:r>
+        <w:t/>
+      </w:r>
+      <w:r>
+        <w:t xml:space="preserve">  </w:t>
       </w:r>
       <w:r>
         <w:rPr>
@@ -18257,13 +18257,13 @@
         <w:ind w:left="720" w:hanging="720"/>
       </w:pPr>
       <w:r>
-        <w:t>[1</w:t>
-      </w:r>
-      <w:r>
-        <w:t>8</w:t>
-      </w:r>
-      <w:r>
-        <w:t xml:space="preserve">] </w:t>
+        <w:t>[18]</w:t>
+      </w:r>
+      <w:r>
+        <w:t/>
+      </w:r>
+      <w:r>
+        <w:t xml:space="preserve"> </w:t>
       </w:r>
       <w:r>
         <w:rPr>

</xml_diff>